<commit_message>
docs: update USER_GUIDE.docx with Companyon branding and new sections
- Add Companyon logo to page header (every page)
- Add cover page attribution: Tom Lazay / Companyon Ventures / Claude CoWork
- Add amber "Claude Tip" callout boxes throughout for AI-assisted customization hints
- Add troubleshooting section: unsupported ATS platforms + Claude CoWork debug workflow
- Add plain-English explanation of MIT open source license
- Add contributing back to the project section

Co-Authored-By: Claude Sonnet 4.6 <noreply@anthropic.com>
</commit_message>
<xml_diff>
--- a/USER_GUIDE.docx
+++ b/USER_GUIDE.docx
@@ -4,7 +4,53 @@
   <w:body>
     <w:p>
       <w:pPr>
-        <w:spacing w:after="480" w:before="720"/>
+        <w:spacing w:after="240" w:before="480"/>
+        <w:jc w:val="center"/>
+      </w:pPr>
+      <w:r>
+        <w:drawing>
+          <wp:inline distT="0" distB="0" distL="0" distR="0">
+            <wp:extent cx="3048000" cy="723900"/>
+            <wp:effectExtent t="0" r="0" b="0" l="0"/>
+            <wp:docPr id="1" name="cover-logo" descr="Companyon Ventures" title="Companyon Ventures"/>
+            <wp:cNvGraphicFramePr>
+              <a:graphicFrameLocks xmlns:a="http://schemas.openxmlformats.org/drawingml/2006/main" noChangeAspect="1"/>
+            </wp:cNvGraphicFramePr>
+            <a:graphic xmlns:a="http://schemas.openxmlformats.org/drawingml/2006/main">
+              <a:graphicData uri="http://schemas.openxmlformats.org/drawingml/2006/picture">
+                <pic:pic xmlns:pic="http://schemas.openxmlformats.org/drawingml/2006/picture">
+                  <pic:nvPicPr>
+                    <pic:cNvPr id="0" name="" descr=""/>
+                    <pic:cNvPicPr>
+                      <a:picLocks noChangeAspect="1" noChangeArrowheads="1"/>
+                    </pic:cNvPicPr>
+                  </pic:nvPicPr>
+                  <pic:blipFill>
+                    <a:blip r:embed="rId9" cstate="none"/>
+                    <a:srcRect/>
+                    <a:stretch>
+                      <a:fillRect/>
+                    </a:stretch>
+                  </pic:blipFill>
+                  <pic:spPr bwMode="auto">
+                    <a:xfrm>
+                      <a:off x="0" y="0"/>
+                      <a:ext cx="3048000" cy="723900"/>
+                    </a:xfrm>
+                    <a:prstGeom prst="rect">
+                      <a:avLst/>
+                    </a:prstGeom>
+                  </pic:spPr>
+                </pic:pic>
+              </a:graphicData>
+            </a:graphic>
+          </wp:inline>
+        </w:drawing>
+      </w:r>
+    </w:p>
+    <w:p>
+      <w:pPr>
+        <w:spacing w:after="120" w:before="240"/>
         <w:jc w:val="center"/>
       </w:pPr>
       <w:r>
@@ -21,7 +67,7 @@
     </w:p>
     <w:p>
       <w:pPr>
-        <w:spacing w:after="240" w:before="0"/>
+        <w:spacing w:after="120" w:before="0"/>
         <w:jc w:val="center"/>
       </w:pPr>
       <w:r>
@@ -36,7 +82,7 @@
     </w:p>
     <w:p>
       <w:pPr>
-        <w:spacing w:after="720" w:before="0"/>
+        <w:spacing w:after="360" w:before="0"/>
         <w:jc w:val="center"/>
       </w:pPr>
       <w:r>
@@ -49,6 +95,48 @@
           <w:szCs w:val="22"/>
         </w:rPr>
         <w:t xml:space="preserve">From zero to live job board in about an hour</w:t>
+      </w:r>
+    </w:p>
+    <w:p>
+      <w:pPr>
+        <w:pBdr>
+          <w:bottom w:val="single" w:color="CCCCCC" w:sz="4" w:space="1"/>
+        </w:pBdr>
+        <w:spacing w:after="200" w:before="200"/>
+      </w:pPr>
+    </w:p>
+    <w:p>
+      <w:pPr>
+        <w:spacing w:after="80" w:before="280"/>
+        <w:jc w:val="center"/>
+      </w:pPr>
+      <w:r>
+        <w:rPr>
+          <w:rFonts w:ascii="Arial" w:cs="Arial" w:eastAsia="Arial" w:hAnsi="Arial"/>
+          <w:b/>
+          <w:bCs/>
+          <w:color w:val="1A3A6B"/>
+          <w:sz w:val="20"/>
+          <w:szCs w:val="20"/>
+        </w:rPr>
+        <w:t xml:space="preserve">Created by Tom Lazay, Co-Founder &amp; GP, Companyon Ventures</w:t>
+      </w:r>
+    </w:p>
+    <w:p>
+      <w:pPr>
+        <w:spacing w:after="280" w:before="0"/>
+        <w:jc w:val="center"/>
+      </w:pPr>
+      <w:r>
+        <w:rPr>
+          <w:rFonts w:ascii="Arial" w:cs="Arial" w:eastAsia="Arial" w:hAnsi="Arial"/>
+          <w:i/>
+          <w:iCs/>
+          <w:color w:val="4300EC"/>
+          <w:sz w:val="20"/>
+          <w:szCs w:val="20"/>
+        </w:rPr>
+        <w:t xml:space="preserve">Coded with Claude CoWork</w:t>
       </w:r>
     </w:p>
     <w:p>
@@ -334,7 +422,7 @@
           <w:sz w:val="22"/>
           <w:szCs w:val="22"/>
         </w:rPr>
-        <w:t xml:space="preserve">Claude (AI) helps you customize and evolve it over time</w:t>
+        <w:t xml:space="preserve">Claude CoWork helps you customize and evolve it over time — no developer required</w:t>
       </w:r>
     </w:p>
     <w:p>
@@ -716,7 +804,7 @@
                 <w:sz w:val="20"/>
                 <w:szCs w:val="20"/>
               </w:rPr>
-              <w:t xml:space="preserve">Claude (Cowork)</w:t>
+              <w:t xml:space="preserve">Claude CoWork</w:t>
             </w:r>
           </w:p>
         </w:tc>
@@ -923,26 +1011,7 @@
         </w:rPr>
         <w:t xml:space="preserve">Go to </w:t>
       </w:r>
-    </w:p>
-    <w:p>
-      <w:pPr>
-        <w:pStyle w:val="ListParagraph"/>
-        <w:numPr>
-          <w:ilvl w:val="0"/>
-          <w:numId w:val="3"/>
-        </w:numPr>
-        <w:spacing w:after="80" w:before="0"/>
-      </w:pPr>
-      <w:r>
-        <w:rPr>
-          <w:rFonts w:ascii="Arial" w:cs="Arial" w:eastAsia="Arial" w:hAnsi="Arial"/>
-          <w:color w:val="222222"/>
-          <w:sz w:val="22"/>
-          <w:szCs w:val="22"/>
-        </w:rPr>
-        <w:t xml:space="preserve">Go to </w:t>
-      </w:r>
-      <w:hyperlink w:history="1" r:id="rIdwqrvcbsrzsazxoivatwyy">
+      <w:hyperlink w:history="1" r:id="rIdoyhrjnnlru8oie9cyax-v">
         <w:r>
           <w:rPr>
             <w:rFonts w:ascii="Arial" w:cs="Arial" w:eastAsia="Arial" w:hAnsi="Arial"/>
@@ -1190,7 +1259,7 @@
     </w:p>
     <w:p>
       <w:pPr>
-        <w:spacing w:after="60" w:before="60"/>
+        <w:spacing w:after="40" w:before="40"/>
         <w:ind w:left="360"/>
       </w:pPr>
       <w:r>
@@ -1205,7 +1274,7 @@
     </w:p>
     <w:p>
       <w:pPr>
-        <w:spacing w:after="60" w:before="60"/>
+        <w:spacing w:after="40" w:before="40"/>
         <w:ind w:left="360"/>
       </w:pPr>
       <w:r>
@@ -1220,7 +1289,7 @@
     </w:p>
     <w:p>
       <w:pPr>
-        <w:spacing w:after="60" w:before="60"/>
+        <w:spacing w:after="40" w:before="40"/>
         <w:ind w:left="360"/>
       </w:pPr>
       <w:r>
@@ -1235,7 +1304,7 @@
     </w:p>
     <w:p>
       <w:pPr>
-        <w:spacing w:after="60" w:before="60"/>
+        <w:spacing w:after="40" w:before="40"/>
         <w:ind w:left="360"/>
       </w:pPr>
       <w:r>
@@ -1250,7 +1319,7 @@
     </w:p>
     <w:p>
       <w:pPr>
-        <w:spacing w:after="60" w:before="60"/>
+        <w:spacing w:after="40" w:before="40"/>
         <w:ind w:left="360"/>
       </w:pPr>
       <w:r>
@@ -1487,7 +1556,7 @@
         </w:rPr>
         <w:t xml:space="preserve">Download GitHub Desktop from </w:t>
       </w:r>
-      <w:hyperlink w:history="1" r:id="rIdil8dsutkclhcubt9htab4">
+      <w:hyperlink w:history="1" r:id="rId0khhhclzrjgy7xjlgll8o">
         <w:r>
           <w:rPr>
             <w:rFonts w:ascii="Arial" w:cs="Arial" w:eastAsia="Arial" w:hAnsi="Arial"/>
@@ -1585,7 +1654,7 @@
           <w:sz w:val="26"/>
           <w:szCs w:val="26"/>
         </w:rPr>
-        <w:t xml:space="preserve">Connecting GitHub Desktop with Claude Cowork</w:t>
+        <w:t xml:space="preserve">Connecting GitHub Desktop with Claude CoWork</w:t>
       </w:r>
     </w:p>
     <w:p>
@@ -1599,7 +1668,7 @@
           <w:sz w:val="22"/>
           <w:szCs w:val="22"/>
         </w:rPr>
-        <w:t xml:space="preserve">Claude Cowork works with files on your computer. When Claude makes changes to your code, those changes happen in the folder on your hard drive. GitHub Desktop then detects those changes and lets you save and publish them.</w:t>
+        <w:t xml:space="preserve">Claude CoWork works with files on your computer. When Claude makes changes to your code, those changes happen in the folder on your hard drive. GitHub Desktop then detects those changes and lets you save and publish them.</w:t>
       </w:r>
     </w:p>
     <w:p>
@@ -1921,7 +1990,7 @@
         </w:rPr>
         <w:t xml:space="preserve">Go to the repository page: </w:t>
       </w:r>
-      <w:hyperlink w:history="1" r:id="rIdal5-jaxkc2xmctm8n30r4">
+      <w:hyperlink w:history="1" r:id="rId83gojz3rgbzdo2obodcjq">
         <w:r>
           <w:rPr>
             <w:rFonts w:ascii="Arial" w:cs="Arial" w:eastAsia="Arial" w:hAnsi="Arial"/>
@@ -2365,7 +2434,7 @@
         </w:rPr>
         <w:t xml:space="preserve">Go to </w:t>
       </w:r>
-      <w:hyperlink w:history="1" r:id="rId8tf_q3z6nr-a6agtdj7bt">
+      <w:hyperlink w:history="1" r:id="rIdukc1tujoxoy6r7v6y4ard">
         <w:r>
           <w:rPr>
             <w:rFonts w:ascii="Arial" w:cs="Arial" w:eastAsia="Arial" w:hAnsi="Arial"/>
@@ -2824,571 +2893,6 @@
     </w:p>
     <w:p>
       <w:pPr>
-        <w:spacing w:after="120" w:before="0"/>
-      </w:pPr>
-      <w:r>
-        <w:rPr>
-          <w:rFonts w:ascii="Arial" w:cs="Arial" w:eastAsia="Arial" w:hAnsi="Arial"/>
-          <w:color w:val="222222"/>
-          <w:sz w:val="22"/>
-          <w:szCs w:val="22"/>
-        </w:rPr>
-        <w:t xml:space="preserve">Example rows:</w:t>
-      </w:r>
-    </w:p>
-    <w:p>
-      <w:pPr>
-        <w:spacing w:after="60" w:before="0"/>
-      </w:pPr>
-    </w:p>
-    <w:tbl>
-      <w:tblPr>
-        <w:tblW w:type="dxa" w:w="9360"/>
-        <w:tblBorders>
-          <w:top w:val="single" w:color="auto" w:sz="4"/>
-          <w:left w:val="single" w:color="auto" w:sz="4"/>
-          <w:bottom w:val="single" w:color="auto" w:sz="4"/>
-          <w:right w:val="single" w:color="auto" w:sz="4"/>
-          <w:insideH w:val="single" w:color="auto" w:sz="4"/>
-          <w:insideV w:val="single" w:color="auto" w:sz="4"/>
-        </w:tblBorders>
-      </w:tblPr>
-      <w:tblGrid>
-        <w:gridCol w:w="2000"/>
-        <w:gridCol w:w="3400"/>
-        <w:gridCol w:w="3960"/>
-      </w:tblGrid>
-      <w:tr>
-        <w:trPr>
-          <w:tblHeader/>
-        </w:trPr>
-        <w:tc>
-          <w:tcPr>
-            <w:tcW w:type="dxa" w:w="2000"/>
-            <w:tcBorders>
-              <w:top w:val="single" w:color="CCCCCC" w:sz="1"/>
-              <w:left w:val="single" w:color="CCCCCC" w:sz="1"/>
-              <w:bottom w:val="single" w:color="CCCCCC" w:sz="1"/>
-              <w:right w:val="single" w:color="CCCCCC" w:sz="1"/>
-            </w:tcBorders>
-            <w:shd w:fill="1A3A6B" w:val="clear"/>
-            <w:tcMar>
-              <w:top w:type="dxa" w:w="80"/>
-              <w:left w:type="dxa" w:w="120"/>
-              <w:bottom w:type="dxa" w:w="80"/>
-              <w:right w:type="dxa" w:w="120"/>
-            </w:tcMar>
-          </w:tcPr>
-          <w:p>
-            <w:pPr>
-              <w:spacing w:after="0" w:before="0"/>
-            </w:pPr>
-            <w:r>
-              <w:rPr>
-                <w:rFonts w:ascii="Arial" w:cs="Arial" w:eastAsia="Arial" w:hAnsi="Arial"/>
-                <w:b/>
-                <w:bCs/>
-                <w:color w:val="FFFFFF"/>
-                <w:sz w:val="20"/>
-                <w:szCs w:val="20"/>
-              </w:rPr>
-              <w:t xml:space="preserve">name</w:t>
-            </w:r>
-          </w:p>
-        </w:tc>
-        <w:tc>
-          <w:tcPr>
-            <w:tcW w:type="dxa" w:w="3400"/>
-            <w:tcBorders>
-              <w:top w:val="single" w:color="CCCCCC" w:sz="1"/>
-              <w:left w:val="single" w:color="CCCCCC" w:sz="1"/>
-              <w:bottom w:val="single" w:color="CCCCCC" w:sz="1"/>
-              <w:right w:val="single" w:color="CCCCCC" w:sz="1"/>
-            </w:tcBorders>
-            <w:shd w:fill="1A3A6B" w:val="clear"/>
-            <w:tcMar>
-              <w:top w:type="dxa" w:w="80"/>
-              <w:left w:type="dxa" w:w="120"/>
-              <w:bottom w:type="dxa" w:w="80"/>
-              <w:right w:type="dxa" w:w="120"/>
-            </w:tcMar>
-          </w:tcPr>
-          <w:p>
-            <w:pPr>
-              <w:spacing w:after="0" w:before="0"/>
-            </w:pPr>
-            <w:r>
-              <w:rPr>
-                <w:rFonts w:ascii="Arial" w:cs="Arial" w:eastAsia="Arial" w:hAnsi="Arial"/>
-                <w:b/>
-                <w:bCs/>
-                <w:color w:val="FFFFFF"/>
-                <w:sz w:val="20"/>
-                <w:szCs w:val="20"/>
-              </w:rPr>
-              <w:t xml:space="preserve">url</w:t>
-            </w:r>
-          </w:p>
-        </w:tc>
-        <w:tc>
-          <w:tcPr>
-            <w:tcW w:type="dxa" w:w="3960"/>
-            <w:tcBorders>
-              <w:top w:val="single" w:color="CCCCCC" w:sz="1"/>
-              <w:left w:val="single" w:color="CCCCCC" w:sz="1"/>
-              <w:bottom w:val="single" w:color="CCCCCC" w:sz="1"/>
-              <w:right w:val="single" w:color="CCCCCC" w:sz="1"/>
-            </w:tcBorders>
-            <w:shd w:fill="1A3A6B" w:val="clear"/>
-            <w:tcMar>
-              <w:top w:type="dxa" w:w="80"/>
-              <w:left w:type="dxa" w:w="120"/>
-              <w:bottom w:type="dxa" w:w="80"/>
-              <w:right w:type="dxa" w:w="120"/>
-            </w:tcMar>
-          </w:tcPr>
-          <w:p>
-            <w:pPr>
-              <w:spacing w:after="0" w:before="0"/>
-            </w:pPr>
-            <w:r>
-              <w:rPr>
-                <w:rFonts w:ascii="Arial" w:cs="Arial" w:eastAsia="Arial" w:hAnsi="Arial"/>
-                <w:b/>
-                <w:bCs/>
-                <w:color w:val="FFFFFF"/>
-                <w:sz w:val="20"/>
-                <w:szCs w:val="20"/>
-              </w:rPr>
-              <w:t xml:space="preserve">homepageUrl</w:t>
-            </w:r>
-          </w:p>
-        </w:tc>
-      </w:tr>
-      <w:tr>
-        <w:tc>
-          <w:tcPr>
-            <w:tcW w:type="dxa" w:w="2000"/>
-            <w:tcBorders>
-              <w:top w:val="single" w:color="CCCCCC" w:sz="1"/>
-              <w:left w:val="single" w:color="CCCCCC" w:sz="1"/>
-              <w:bottom w:val="single" w:color="CCCCCC" w:sz="1"/>
-              <w:right w:val="single" w:color="CCCCCC" w:sz="1"/>
-            </w:tcBorders>
-            <w:shd w:fill="FFFFFF" w:val="clear"/>
-            <w:tcMar>
-              <w:top w:type="dxa" w:w="80"/>
-              <w:left w:type="dxa" w:w="120"/>
-              <w:bottom w:type="dxa" w:w="80"/>
-              <w:right w:type="dxa" w:w="120"/>
-            </w:tcMar>
-          </w:tcPr>
-          <w:p>
-            <w:pPr>
-              <w:spacing w:after="0" w:before="0"/>
-            </w:pPr>
-            <w:r>
-              <w:rPr>
-                <w:rFonts w:ascii="Arial" w:cs="Arial" w:eastAsia="Arial" w:hAnsi="Arial"/>
-                <w:b w:val="false"/>
-                <w:bCs w:val="false"/>
-                <w:color w:val="222222"/>
-                <w:sz w:val="20"/>
-                <w:szCs w:val="20"/>
-              </w:rPr>
-              <w:t xml:space="preserve">name</w:t>
-            </w:r>
-          </w:p>
-        </w:tc>
-        <w:tc>
-          <w:tcPr>
-            <w:tcW w:type="dxa" w:w="3400"/>
-            <w:tcBorders>
-              <w:top w:val="single" w:color="CCCCCC" w:sz="1"/>
-              <w:left w:val="single" w:color="CCCCCC" w:sz="1"/>
-              <w:bottom w:val="single" w:color="CCCCCC" w:sz="1"/>
-              <w:right w:val="single" w:color="CCCCCC" w:sz="1"/>
-            </w:tcBorders>
-            <w:shd w:fill="FFFFFF" w:val="clear"/>
-            <w:tcMar>
-              <w:top w:type="dxa" w:w="80"/>
-              <w:left w:type="dxa" w:w="120"/>
-              <w:bottom w:type="dxa" w:w="80"/>
-              <w:right w:type="dxa" w:w="120"/>
-            </w:tcMar>
-          </w:tcPr>
-          <w:p>
-            <w:pPr>
-              <w:spacing w:after="0" w:before="0"/>
-            </w:pPr>
-            <w:r>
-              <w:rPr>
-                <w:rFonts w:ascii="Arial" w:cs="Arial" w:eastAsia="Arial" w:hAnsi="Arial"/>
-                <w:b w:val="false"/>
-                <w:bCs w:val="false"/>
-                <w:color w:val="222222"/>
-                <w:sz w:val="20"/>
-                <w:szCs w:val="20"/>
-              </w:rPr>
-              <w:t xml:space="preserve">url</w:t>
-            </w:r>
-          </w:p>
-        </w:tc>
-        <w:tc>
-          <w:tcPr>
-            <w:tcW w:type="dxa" w:w="3960"/>
-            <w:tcBorders>
-              <w:top w:val="single" w:color="CCCCCC" w:sz="1"/>
-              <w:left w:val="single" w:color="CCCCCC" w:sz="1"/>
-              <w:bottom w:val="single" w:color="CCCCCC" w:sz="1"/>
-              <w:right w:val="single" w:color="CCCCCC" w:sz="1"/>
-            </w:tcBorders>
-            <w:shd w:fill="FFFFFF" w:val="clear"/>
-            <w:tcMar>
-              <w:top w:type="dxa" w:w="80"/>
-              <w:left w:type="dxa" w:w="120"/>
-              <w:bottom w:type="dxa" w:w="80"/>
-              <w:right w:type="dxa" w:w="120"/>
-            </w:tcMar>
-          </w:tcPr>
-          <w:p>
-            <w:pPr>
-              <w:spacing w:after="0" w:before="0"/>
-            </w:pPr>
-            <w:r>
-              <w:rPr>
-                <w:rFonts w:ascii="Arial" w:cs="Arial" w:eastAsia="Arial" w:hAnsi="Arial"/>
-                <w:b w:val="false"/>
-                <w:bCs w:val="false"/>
-                <w:color w:val="222222"/>
-                <w:sz w:val="20"/>
-                <w:szCs w:val="20"/>
-              </w:rPr>
-              <w:t xml:space="preserve">homepageUrl</w:t>
-            </w:r>
-          </w:p>
-        </w:tc>
-      </w:tr>
-      <w:tr>
-        <w:tc>
-          <w:tcPr>
-            <w:tcW w:type="dxa" w:w="2000"/>
-            <w:tcBorders>
-              <w:top w:val="single" w:color="CCCCCC" w:sz="1"/>
-              <w:left w:val="single" w:color="CCCCCC" w:sz="1"/>
-              <w:bottom w:val="single" w:color="CCCCCC" w:sz="1"/>
-              <w:right w:val="single" w:color="CCCCCC" w:sz="1"/>
-            </w:tcBorders>
-            <w:shd w:fill="F5F5F5" w:val="clear"/>
-            <w:tcMar>
-              <w:top w:type="dxa" w:w="80"/>
-              <w:left w:type="dxa" w:w="120"/>
-              <w:bottom w:type="dxa" w:w="80"/>
-              <w:right w:type="dxa" w:w="120"/>
-            </w:tcMar>
-          </w:tcPr>
-          <w:p>
-            <w:pPr>
-              <w:spacing w:after="0" w:before="0"/>
-            </w:pPr>
-            <w:r>
-              <w:rPr>
-                <w:rFonts w:ascii="Arial" w:cs="Arial" w:eastAsia="Arial" w:hAnsi="Arial"/>
-                <w:b w:val="false"/>
-                <w:bCs w:val="false"/>
-                <w:color w:val="222222"/>
-                <w:sz w:val="20"/>
-                <w:szCs w:val="20"/>
-              </w:rPr>
-              <w:t xml:space="preserve">Acme Corp</w:t>
-            </w:r>
-          </w:p>
-        </w:tc>
-        <w:tc>
-          <w:tcPr>
-            <w:tcW w:type="dxa" w:w="3400"/>
-            <w:tcBorders>
-              <w:top w:val="single" w:color="CCCCCC" w:sz="1"/>
-              <w:left w:val="single" w:color="CCCCCC" w:sz="1"/>
-              <w:bottom w:val="single" w:color="CCCCCC" w:sz="1"/>
-              <w:right w:val="single" w:color="CCCCCC" w:sz="1"/>
-            </w:tcBorders>
-            <w:shd w:fill="F5F5F5" w:val="clear"/>
-            <w:tcMar>
-              <w:top w:type="dxa" w:w="80"/>
-              <w:left w:type="dxa" w:w="120"/>
-              <w:bottom w:type="dxa" w:w="80"/>
-              <w:right w:type="dxa" w:w="120"/>
-            </w:tcMar>
-          </w:tcPr>
-          <w:p>
-            <w:pPr>
-              <w:spacing w:after="0" w:before="0"/>
-            </w:pPr>
-            <w:r>
-              <w:rPr>
-                <w:rFonts w:ascii="Arial" w:cs="Arial" w:eastAsia="Arial" w:hAnsi="Arial"/>
-                <w:b w:val="false"/>
-                <w:bCs w:val="false"/>
-                <w:color w:val="222222"/>
-                <w:sz w:val="20"/>
-                <w:szCs w:val="20"/>
-              </w:rPr>
-              <w:t xml:space="preserve">https://jobs.ashbyhq.com/acme</w:t>
-            </w:r>
-          </w:p>
-        </w:tc>
-        <w:tc>
-          <w:tcPr>
-            <w:tcW w:type="dxa" w:w="3960"/>
-            <w:tcBorders>
-              <w:top w:val="single" w:color="CCCCCC" w:sz="1"/>
-              <w:left w:val="single" w:color="CCCCCC" w:sz="1"/>
-              <w:bottom w:val="single" w:color="CCCCCC" w:sz="1"/>
-              <w:right w:val="single" w:color="CCCCCC" w:sz="1"/>
-            </w:tcBorders>
-            <w:shd w:fill="F5F5F5" w:val="clear"/>
-            <w:tcMar>
-              <w:top w:type="dxa" w:w="80"/>
-              <w:left w:type="dxa" w:w="120"/>
-              <w:bottom w:type="dxa" w:w="80"/>
-              <w:right w:type="dxa" w:w="120"/>
-            </w:tcMar>
-          </w:tcPr>
-          <w:p>
-            <w:pPr>
-              <w:spacing w:after="0" w:before="0"/>
-            </w:pPr>
-            <w:r>
-              <w:rPr>
-                <w:rFonts w:ascii="Arial" w:cs="Arial" w:eastAsia="Arial" w:hAnsi="Arial"/>
-                <w:b w:val="false"/>
-                <w:bCs w:val="false"/>
-                <w:color w:val="222222"/>
-                <w:sz w:val="20"/>
-                <w:szCs w:val="20"/>
-              </w:rPr>
-              <w:t xml:space="preserve">https://acme.com</w:t>
-            </w:r>
-          </w:p>
-        </w:tc>
-      </w:tr>
-      <w:tr>
-        <w:tc>
-          <w:tcPr>
-            <w:tcW w:type="dxa" w:w="2000"/>
-            <w:tcBorders>
-              <w:top w:val="single" w:color="CCCCCC" w:sz="1"/>
-              <w:left w:val="single" w:color="CCCCCC" w:sz="1"/>
-              <w:bottom w:val="single" w:color="CCCCCC" w:sz="1"/>
-              <w:right w:val="single" w:color="CCCCCC" w:sz="1"/>
-            </w:tcBorders>
-            <w:shd w:fill="FFFFFF" w:val="clear"/>
-            <w:tcMar>
-              <w:top w:type="dxa" w:w="80"/>
-              <w:left w:type="dxa" w:w="120"/>
-              <w:bottom w:type="dxa" w:w="80"/>
-              <w:right w:type="dxa" w:w="120"/>
-            </w:tcMar>
-          </w:tcPr>
-          <w:p>
-            <w:pPr>
-              <w:spacing w:after="0" w:before="0"/>
-            </w:pPr>
-            <w:r>
-              <w:rPr>
-                <w:rFonts w:ascii="Arial" w:cs="Arial" w:eastAsia="Arial" w:hAnsi="Arial"/>
-                <w:b w:val="false"/>
-                <w:bCs w:val="false"/>
-                <w:color w:val="222222"/>
-                <w:sz w:val="20"/>
-                <w:szCs w:val="20"/>
-              </w:rPr>
-              <w:t xml:space="preserve">BetaTech</w:t>
-            </w:r>
-          </w:p>
-        </w:tc>
-        <w:tc>
-          <w:tcPr>
-            <w:tcW w:type="dxa" w:w="3400"/>
-            <w:tcBorders>
-              <w:top w:val="single" w:color="CCCCCC" w:sz="1"/>
-              <w:left w:val="single" w:color="CCCCCC" w:sz="1"/>
-              <w:bottom w:val="single" w:color="CCCCCC" w:sz="1"/>
-              <w:right w:val="single" w:color="CCCCCC" w:sz="1"/>
-            </w:tcBorders>
-            <w:shd w:fill="FFFFFF" w:val="clear"/>
-            <w:tcMar>
-              <w:top w:type="dxa" w:w="80"/>
-              <w:left w:type="dxa" w:w="120"/>
-              <w:bottom w:type="dxa" w:w="80"/>
-              <w:right w:type="dxa" w:w="120"/>
-            </w:tcMar>
-          </w:tcPr>
-          <w:p>
-            <w:pPr>
-              <w:spacing w:after="0" w:before="0"/>
-            </w:pPr>
-            <w:r>
-              <w:rPr>
-                <w:rFonts w:ascii="Arial" w:cs="Arial" w:eastAsia="Arial" w:hAnsi="Arial"/>
-                <w:b w:val="false"/>
-                <w:bCs w:val="false"/>
-                <w:color w:val="222222"/>
-                <w:sz w:val="20"/>
-                <w:szCs w:val="20"/>
-              </w:rPr>
-              <w:t xml:space="preserve">https://betacorp.bamboohr.com</w:t>
-            </w:r>
-          </w:p>
-        </w:tc>
-        <w:tc>
-          <w:tcPr>
-            <w:tcW w:type="dxa" w:w="3960"/>
-            <w:tcBorders>
-              <w:top w:val="single" w:color="CCCCCC" w:sz="1"/>
-              <w:left w:val="single" w:color="CCCCCC" w:sz="1"/>
-              <w:bottom w:val="single" w:color="CCCCCC" w:sz="1"/>
-              <w:right w:val="single" w:color="CCCCCC" w:sz="1"/>
-            </w:tcBorders>
-            <w:shd w:fill="FFFFFF" w:val="clear"/>
-            <w:tcMar>
-              <w:top w:type="dxa" w:w="80"/>
-              <w:left w:type="dxa" w:w="120"/>
-              <w:bottom w:type="dxa" w:w="80"/>
-              <w:right w:type="dxa" w:w="120"/>
-            </w:tcMar>
-          </w:tcPr>
-          <w:p>
-            <w:pPr>
-              <w:spacing w:after="0" w:before="0"/>
-            </w:pPr>
-            <w:r>
-              <w:rPr>
-                <w:rFonts w:ascii="Arial" w:cs="Arial" w:eastAsia="Arial" w:hAnsi="Arial"/>
-                <w:b w:val="false"/>
-                <w:bCs w:val="false"/>
-                <w:color w:val="222222"/>
-                <w:sz w:val="20"/>
-                <w:szCs w:val="20"/>
-              </w:rPr>
-              <w:t xml:space="preserve">https://betacorp.io</w:t>
-            </w:r>
-          </w:p>
-        </w:tc>
-      </w:tr>
-      <w:tr>
-        <w:tc>
-          <w:tcPr>
-            <w:tcW w:type="dxa" w:w="2000"/>
-            <w:tcBorders>
-              <w:top w:val="single" w:color="CCCCCC" w:sz="1"/>
-              <w:left w:val="single" w:color="CCCCCC" w:sz="1"/>
-              <w:bottom w:val="single" w:color="CCCCCC" w:sz="1"/>
-              <w:right w:val="single" w:color="CCCCCC" w:sz="1"/>
-            </w:tcBorders>
-            <w:shd w:fill="F5F5F5" w:val="clear"/>
-            <w:tcMar>
-              <w:top w:type="dxa" w:w="80"/>
-              <w:left w:type="dxa" w:w="120"/>
-              <w:bottom w:type="dxa" w:w="80"/>
-              <w:right w:type="dxa" w:w="120"/>
-            </w:tcMar>
-          </w:tcPr>
-          <w:p>
-            <w:pPr>
-              <w:spacing w:after="0" w:before="0"/>
-            </w:pPr>
-            <w:r>
-              <w:rPr>
-                <w:rFonts w:ascii="Arial" w:cs="Arial" w:eastAsia="Arial" w:hAnsi="Arial"/>
-                <w:b w:val="false"/>
-                <w:bCs w:val="false"/>
-                <w:color w:val="222222"/>
-                <w:sz w:val="20"/>
-                <w:szCs w:val="20"/>
-              </w:rPr>
-              <w:t xml:space="preserve">Gamma Inc</w:t>
-            </w:r>
-          </w:p>
-        </w:tc>
-        <w:tc>
-          <w:tcPr>
-            <w:tcW w:type="dxa" w:w="3400"/>
-            <w:tcBorders>
-              <w:top w:val="single" w:color="CCCCCC" w:sz="1"/>
-              <w:left w:val="single" w:color="CCCCCC" w:sz="1"/>
-              <w:bottom w:val="single" w:color="CCCCCC" w:sz="1"/>
-              <w:right w:val="single" w:color="CCCCCC" w:sz="1"/>
-            </w:tcBorders>
-            <w:shd w:fill="F5F5F5" w:val="clear"/>
-            <w:tcMar>
-              <w:top w:type="dxa" w:w="80"/>
-              <w:left w:type="dxa" w:w="120"/>
-              <w:bottom w:type="dxa" w:w="80"/>
-              <w:right w:type="dxa" w:w="120"/>
-            </w:tcMar>
-          </w:tcPr>
-          <w:p>
-            <w:pPr>
-              <w:spacing w:after="0" w:before="0"/>
-            </w:pPr>
-            <w:r>
-              <w:rPr>
-                <w:rFonts w:ascii="Arial" w:cs="Arial" w:eastAsia="Arial" w:hAnsi="Arial"/>
-                <w:b w:val="false"/>
-                <w:bCs w:val="false"/>
-                <w:color w:val="222222"/>
-                <w:sz w:val="20"/>
-                <w:szCs w:val="20"/>
-              </w:rPr>
-              <w:t xml:space="preserve">https://boards.greenhouse.io/gamma</w:t>
-            </w:r>
-          </w:p>
-        </w:tc>
-        <w:tc>
-          <w:tcPr>
-            <w:tcW w:type="dxa" w:w="3960"/>
-            <w:tcBorders>
-              <w:top w:val="single" w:color="CCCCCC" w:sz="1"/>
-              <w:left w:val="single" w:color="CCCCCC" w:sz="1"/>
-              <w:bottom w:val="single" w:color="CCCCCC" w:sz="1"/>
-              <w:right w:val="single" w:color="CCCCCC" w:sz="1"/>
-            </w:tcBorders>
-            <w:shd w:fill="F5F5F5" w:val="clear"/>
-            <w:tcMar>
-              <w:top w:type="dxa" w:w="80"/>
-              <w:left w:type="dxa" w:w="120"/>
-              <w:bottom w:type="dxa" w:w="80"/>
-              <w:right w:type="dxa" w:w="120"/>
-            </w:tcMar>
-          </w:tcPr>
-          <w:p>
-            <w:pPr>
-              <w:spacing w:after="0" w:before="0"/>
-            </w:pPr>
-            <w:r>
-              <w:rPr>
-                <w:rFonts w:ascii="Arial" w:cs="Arial" w:eastAsia="Arial" w:hAnsi="Arial"/>
-                <w:b w:val="false"/>
-                <w:bCs w:val="false"/>
-                <w:color w:val="222222"/>
-                <w:sz w:val="20"/>
-                <w:szCs w:val="20"/>
-              </w:rPr>
-              <w:t xml:space="preserve">https://gamma.com</w:t>
-            </w:r>
-          </w:p>
-        </w:tc>
-      </w:tr>
-    </w:tbl>
-    <w:p>
-      <w:pPr>
-        <w:spacing w:after="120" w:before="0"/>
-      </w:pPr>
-    </w:p>
-    <w:p>
-      <w:pPr>
         <w:pStyle w:val="Heading3"/>
         <w:spacing w:after="80" w:before="200"/>
       </w:pPr>
@@ -4702,25 +4206,6 @@
     </w:tbl>
     <w:p>
       <w:pPr>
-        <w:spacing w:after="80" w:before="0"/>
-      </w:pPr>
-    </w:p>
-    <w:p>
-      <w:pPr>
-        <w:spacing w:after="120" w:before="0"/>
-      </w:pPr>
-      <w:r>
-        <w:rPr>
-          <w:rFonts w:ascii="Arial" w:cs="Arial" w:eastAsia="Arial" w:hAnsi="Arial"/>
-          <w:color w:val="222222"/>
-          <w:sz w:val="22"/>
-          <w:szCs w:val="22"/>
-        </w:rPr>
-        <w:t xml:space="preserve">Edit the values in the right column to match your firm's branding. The job board will automatically use these values instead of the defaults.</w:t>
-      </w:r>
-    </w:p>
-    <w:p>
-      <w:pPr>
         <w:spacing w:after="120" w:before="0"/>
       </w:pPr>
     </w:p>
@@ -4952,7 +4437,7 @@
           <w:sz w:val="22"/>
           <w:szCs w:val="22"/>
         </w:rPr>
-        <w:t xml:space="preserve">If you added a Config tab: repeat the publish process, but this time select Sheet2 (or whatever you named the second tab) in the first dropdown. You don't need to save this second URL — the job board finds it automatically.</w:t>
+        <w:t xml:space="preserve">If you added a Config tab: repeat the publish process, but this time select Sheet2 in the first dropdown. You don't need to save this second URL — the job board finds it automatically.</w:t>
       </w:r>
     </w:p>
     <w:p>
@@ -5105,7 +4590,7 @@
         </w:rPr>
         <w:t xml:space="preserve">Go to </w:t>
       </w:r>
-      <w:hyperlink w:history="1" r:id="rIdm_i3hupm8pqxoopvldrm2">
+      <w:hyperlink w:history="1" r:id="rId5mzkzn2gfq--himlrmqca">
         <w:r>
           <w:rPr>
             <w:rFonts w:ascii="Arial" w:cs="Arial" w:eastAsia="Arial" w:hAnsi="Arial"/>
@@ -5181,7 +4666,7 @@
           <w:sz w:val="22"/>
           <w:szCs w:val="22"/>
         </w:rPr>
-        <w:t xml:space="preserve">When asked what you're working on, select Personal (or your firm name if you prefer). Hobby is fine for the plan type.</w:t>
+        <w:t xml:space="preserve">When asked what you're working on, select Personal. Hobby is fine for the plan type.</w:t>
       </w:r>
     </w:p>
     <w:p>
@@ -5408,7 +4893,7 @@
         </w:rPr>
         <w:t xml:space="preserve">In Vercel, click Add New → Project, or go to </w:t>
       </w:r>
-      <w:hyperlink w:history="1" r:id="rIdwbpxvtbd5oy5gtxhye-vq">
+      <w:hyperlink w:history="1" r:id="rIdk03otagzw_elzp7hpbhs1">
         <w:r>
           <w:rPr>
             <w:rFonts w:ascii="Arial" w:cs="Arial" w:eastAsia="Arial" w:hAnsi="Arial"/>
@@ -5631,7 +5116,7 @@
                 <w:sz w:val="20"/>
                 <w:szCs w:val="20"/>
               </w:rPr>
-              <w:t xml:space="preserve">If you skip this step, the job board will show an error message instead of jobs. You can always add it later in the Vercel project settings.</w:t>
+              <w:t xml:space="preserve">If you skip this step, the job board will show an error message instead of jobs. You can always add it later in the Vercel project settings under Settings → Environment Variables, then redeploy.</w:t>
             </w:r>
           </w:p>
         </w:tc>
@@ -5806,7 +5291,7 @@
           <w:sz w:val="22"/>
           <w:szCs w:val="22"/>
         </w:rPr>
-        <w:t xml:space="preserve">Vercel will give you DNS records to add to your domain registrar (the company where you bought the domain, e.g. GoDaddy, Namecheap, Cloudflare).</w:t>
+        <w:t xml:space="preserve">Vercel will give you DNS records to add to your domain registrar (GoDaddy, Namecheap, Cloudflare, etc.).</w:t>
       </w:r>
     </w:p>
     <w:p>
@@ -5861,7 +5346,7 @@
           <w:sz w:val="22"/>
           <w:szCs w:val="22"/>
         </w:rPr>
-        <w:t xml:space="preserve">Once deployed, every time you push changes from GitHub Desktop, Vercel automatically rebuilds and redeploys the live site. The process is:</w:t>
+        <w:t xml:space="preserve">Once deployed, every time you push changes from GitHub Desktop, Vercel automatically rebuilds and redeploys the live site:</w:t>
       </w:r>
     </w:p>
     <w:p>
@@ -6083,7 +5568,7 @@
           <w:sz w:val="22"/>
           <w:szCs w:val="22"/>
         </w:rPr>
-        <w:t xml:space="preserve">The job board comes with placeholder branding. This step walks through everything you'll want to personalize.</w:t>
+        <w:t xml:space="preserve">The job board comes with placeholder branding. This step walks through everything you'll want to personalize. Almost all of it can be done by describing what you want to Claude CoWork — no manual code editing required.</w:t>
       </w:r>
     </w:p>
     <w:p>
@@ -6157,7 +5642,7 @@
           <w:sz w:val="22"/>
           <w:szCs w:val="22"/>
         </w:rPr>
-        <w:t xml:space="preserve">Rename your logo file to logo.svg (or keep your filename and update the code — see below).</w:t>
+        <w:t xml:space="preserve">Rename your logo file to logo.svg (or keep your filename and update the code — see the Claude tip below).</w:t>
       </w:r>
     </w:p>
     <w:p>
@@ -6195,31 +5680,12 @@
           <w:sz w:val="22"/>
           <w:szCs w:val="22"/>
         </w:rPr>
-        <w:t xml:space="preserve">If you renamed the file differently, open index.html in a text editor and find the line that says src="logo.svg" and update it to match your filename.</w:t>
-      </w:r>
-    </w:p>
-    <w:p>
-      <w:pPr>
-        <w:pStyle w:val="ListParagraph"/>
-        <w:numPr>
-          <w:ilvl w:val="0"/>
-          <w:numId w:val="3"/>
-        </w:numPr>
-        <w:spacing w:after="80" w:before="0"/>
-      </w:pPr>
-      <w:r>
-        <w:rPr>
-          <w:rFonts w:ascii="Arial" w:cs="Arial" w:eastAsia="Arial" w:hAnsi="Arial"/>
-          <w:color w:val="222222"/>
-          <w:sz w:val="22"/>
-          <w:szCs w:val="22"/>
-        </w:rPr>
-        <w:t xml:space="preserve">Also update the og:image and twitter:image meta tags in index.html to use your logo's URL on your deployed domain.</w:t>
-      </w:r>
-    </w:p>
-    <w:p>
-      <w:pPr>
-        <w:spacing w:after="120" w:before="0"/>
+        <w:t xml:space="preserve">The code and all meta tags referencing the logo need to be updated to match — see the Claude tip below for the easiest way to do this.</w:t>
+      </w:r>
+    </w:p>
+    <w:p>
+      <w:pPr>
+        <w:spacing w:after="100" w:before="0"/>
       </w:pPr>
     </w:p>
     <w:tbl>
@@ -6243,11 +5709,11 @@
             <w:tcW w:type="dxa" w:w="9360"/>
             <w:tcBorders>
               <w:top w:val="none" w:color="FFFFFF" w:sz="0"/>
-              <w:left w:val="single" w:color="4300EC" w:sz="12"/>
+              <w:left w:val="single" w:color="D97706" w:sz="12"/>
               <w:bottom w:val="none" w:color="FFFFFF" w:sz="0"/>
               <w:right w:val="none" w:color="FFFFFF" w:sz="0"/>
             </w:tcBorders>
-            <w:shd w:fill="E8F0FE" w:val="clear"/>
+            <w:shd w:fill="FFF8E7" w:val="clear"/>
             <w:tcMar>
               <w:top w:type="dxa" w:w="80"/>
               <w:left w:type="dxa" w:w="200"/>
@@ -6257,18 +5723,34 @@
           </w:tcPr>
           <w:p>
             <w:pPr>
-              <w:spacing w:after="0" w:before="0"/>
-            </w:pPr>
-            <w:r>
-              <w:rPr>
-                <w:rFonts w:ascii="Arial" w:cs="Arial" w:eastAsia="Arial" w:hAnsi="Arial"/>
-                <w:i/>
-                <w:iCs/>
+              <w:spacing w:after="40" w:before="0"/>
+            </w:pPr>
+            <w:r>
+              <w:rPr>
+                <w:rFonts w:ascii="Arial" w:cs="Arial" w:eastAsia="Arial" w:hAnsi="Arial"/>
+                <w:b/>
+                <w:bCs/>
+                <w:color w:val="D97706"/>
+                <w:sz w:val="20"/>
+                <w:szCs w:val="20"/>
+              </w:rPr>
+              <w:t xml:space="preserve">✦ Claude Tip</w:t>
+            </w:r>
+          </w:p>
+          <w:p>
+            <w:pPr>
+              <w:spacing w:after="0" w:before="0"/>
+            </w:pPr>
+            <w:r>
+              <w:rPr>
+                <w:rFonts w:ascii="Arial" w:cs="Arial" w:eastAsia="Arial" w:hAnsi="Arial"/>
                 <w:color w:val="1a1a1a"/>
                 <w:sz w:val="20"/>
                 <w:szCs w:val="20"/>
               </w:rPr>
-              <w:t xml:space="preserve">If you're using Claude to help with this, just say: "Replace the logo with my firm's logo" and attach your logo file. Claude will handle the file replacement and any code updates.</w:t>
+              <w:t xml:space="preserve">Open Claude CoWork with your portfolio-jobs folder selected and say:
+"Replace the logo with the attached file. Update all references to the old logo in index.html, including the og:image and twitter:image meta tags. Use https://jobs.yourfirm.com/logo.svg for the absolute URL meta tags."
+Then attach your logo file. Claude will handle the file copy and every code reference automatically.</w:t>
             </w:r>
           </w:p>
         </w:tc>
@@ -6307,7 +5789,7 @@
           <w:sz w:val="22"/>
           <w:szCs w:val="22"/>
         </w:rPr>
-        <w:t xml:space="preserve">Open css/styles.css in a text editor. Near the top of the file you'll see a section that starts with :root {. Edit these six values to match your firm's colors:</w:t>
+        <w:t xml:space="preserve">Open css/styles.css in a text editor. Near the top you'll see a :root { section with six color variables. Edit them to match your firm's palette.</w:t>
       </w:r>
     </w:p>
     <w:p>
@@ -6469,7 +5951,7 @@
                 <w:sz w:val="20"/>
                 <w:szCs w:val="20"/>
               </w:rPr>
-              <w:t xml:space="preserve">Main accent color — buttons, highlights, tags</w:t>
+              <w:t xml:space="preserve">Main accent — buttons, highlights, tags</w:t>
             </w:r>
           </w:p>
         </w:tc>
@@ -6539,7 +6021,7 @@
                 <w:sz w:val="20"/>
                 <w:szCs w:val="20"/>
               </w:rPr>
-              <w:t xml:space="preserve">Secondary accent color</w:t>
+              <w:t xml:space="preserve">Secondary accent</w:t>
             </w:r>
           </w:p>
         </w:tc>
@@ -6819,7 +6301,7 @@
                 <w:sz w:val="20"/>
                 <w:szCs w:val="20"/>
               </w:rPr>
-              <w:t xml:space="preserve">Page background color</w:t>
+              <w:t xml:space="preserve">Page background</w:t>
             </w:r>
           </w:p>
         </w:tc>
@@ -6827,7 +6309,7 @@
     </w:tbl>
     <w:p>
       <w:pPr>
-        <w:spacing w:after="80" w:before="0"/>
+        <w:spacing w:after="100" w:before="0"/>
       </w:pPr>
     </w:p>
     <w:tbl>
@@ -6851,11 +6333,11 @@
             <w:tcW w:type="dxa" w:w="9360"/>
             <w:tcBorders>
               <w:top w:val="none" w:color="FFFFFF" w:sz="0"/>
-              <w:left w:val="single" w:color="4300EC" w:sz="12"/>
+              <w:left w:val="single" w:color="D97706" w:sz="12"/>
               <w:bottom w:val="none" w:color="FFFFFF" w:sz="0"/>
               <w:right w:val="none" w:color="FFFFFF" w:sz="0"/>
             </w:tcBorders>
-            <w:shd w:fill="E8F0FE" w:val="clear"/>
+            <w:shd w:fill="FFF8E7" w:val="clear"/>
             <w:tcMar>
               <w:top w:type="dxa" w:w="80"/>
               <w:left w:type="dxa" w:w="200"/>
@@ -6865,18 +6347,34 @@
           </w:tcPr>
           <w:p>
             <w:pPr>
-              <w:spacing w:after="0" w:before="0"/>
-            </w:pPr>
-            <w:r>
-              <w:rPr>
-                <w:rFonts w:ascii="Arial" w:cs="Arial" w:eastAsia="Arial" w:hAnsi="Arial"/>
-                <w:i/>
-                <w:iCs/>
+              <w:spacing w:after="40" w:before="0"/>
+            </w:pPr>
+            <w:r>
+              <w:rPr>
+                <w:rFonts w:ascii="Arial" w:cs="Arial" w:eastAsia="Arial" w:hAnsi="Arial"/>
+                <w:b/>
+                <w:bCs/>
+                <w:color w:val="D97706"/>
+                <w:sz w:val="20"/>
+                <w:szCs w:val="20"/>
+              </w:rPr>
+              <w:t xml:space="preserve">✦ Claude Tip</w:t>
+            </w:r>
+          </w:p>
+          <w:p>
+            <w:pPr>
+              <w:spacing w:after="0" w:before="0"/>
+            </w:pPr>
+            <w:r>
+              <w:rPr>
+                <w:rFonts w:ascii="Arial" w:cs="Arial" w:eastAsia="Arial" w:hAnsi="Arial"/>
                 <w:color w:val="1a1a1a"/>
                 <w:sz w:val="20"/>
                 <w:szCs w:val="20"/>
               </w:rPr>
-              <w:t xml:space="preserve">Colors are specified as hex codes (e.g. #4300EC). If you're not sure what hex codes to use, paste your firm's logo into Claude and ask: "What are the hex color codes from this logo?" Claude can extract them for you.</w:t>
+              <w:t xml:space="preserve">You don't need to find hex codes yourself. Open Claude CoWork and say:
+"Update the brand colors in css/styles.css to match our brand. Our primary color is [describe or paste hex], secondary is [describe], and our hero background should be a dark [color] gradient."
+Or simply attach your logo and say: "Extract our brand colors from this logo and apply them to the CSS variables in styles.css."</w:t>
             </w:r>
           </w:p>
         </w:tc>
@@ -6915,7 +6413,7 @@
           <w:sz w:val="22"/>
           <w:szCs w:val="22"/>
         </w:rPr>
-        <w:t xml:space="preserve">The easiest way to change the hero headline, subtext, and footer is via the Google Sheet Config tab you set up in Step 4. Just update the values there — no code editing needed.</w:t>
+        <w:t xml:space="preserve">The easiest way to change the hero headline, subtext, and footer is via the Google Sheet Config tab (no code needed). Just update the values there.</w:t>
       </w:r>
     </w:p>
     <w:p>
@@ -6934,7 +6432,7 @@
           <w:sz w:val="22"/>
           <w:szCs w:val="22"/>
         </w:rPr>
-        <w:t xml:space="preserve">Alternatively, open index.html in a text editor and look for the FORK: comments — they mark every line you might want to change:</w:t>
+        <w:t xml:space="preserve">Alternatively, open index.html and look for the &lt;!-- FORK: --&gt; comments — they mark every line you might want to change:</w:t>
       </w:r>
     </w:p>
     <w:p>
@@ -6996,138 +6494,7 @@
     </w:p>
     <w:p>
       <w:pPr>
-        <w:spacing w:after="120" w:before="0"/>
-      </w:pPr>
-    </w:p>
-    <w:p>
-      <w:pPr>
-        <w:pStyle w:val="Heading2"/>
-        <w:spacing w:after="120" w:before="280"/>
-      </w:pPr>
-      <w:r>
-        <w:rPr>
-          <w:rFonts w:ascii="Arial" w:cs="Arial" w:eastAsia="Arial" w:hAnsi="Arial"/>
-          <w:b/>
-          <w:bCs/>
-          <w:color w:val="4300EC"/>
-          <w:sz w:val="26"/>
-          <w:szCs w:val="26"/>
-        </w:rPr>
-        <w:t xml:space="preserve">SEO and social sharing metadata</w:t>
-      </w:r>
-    </w:p>
-    <w:p>
-      <w:pPr>
-        <w:spacing w:after="120" w:before="0"/>
-      </w:pPr>
-      <w:r>
-        <w:rPr>
-          <w:rFonts w:ascii="Arial" w:cs="Arial" w:eastAsia="Arial" w:hAnsi="Arial"/>
-          <w:color w:val="222222"/>
-          <w:sz w:val="22"/>
-          <w:szCs w:val="22"/>
-        </w:rPr>
-        <w:t xml:space="preserve">Open index.html and update the meta tags near the top of the file. Look for the lines marked &lt;!-- FORK: --&gt;:</w:t>
-      </w:r>
-    </w:p>
-    <w:p>
-      <w:pPr>
-        <w:pStyle w:val="ListParagraph"/>
-        <w:numPr>
-          <w:ilvl w:val="0"/>
-          <w:numId w:val="2"/>
-        </w:numPr>
-        <w:spacing w:after="80" w:before="0"/>
-      </w:pPr>
-      <w:r>
-        <w:rPr>
-          <w:rFonts w:ascii="Arial" w:cs="Arial" w:eastAsia="Arial" w:hAnsi="Arial"/>
-          <w:color w:val="222222"/>
-          <w:sz w:val="22"/>
-          <w:szCs w:val="22"/>
-        </w:rPr>
-        <w:t xml:space="preserve">&lt;title&gt; — the text that appears in browser tabs and Google search results</w:t>
-      </w:r>
-    </w:p>
-    <w:p>
-      <w:pPr>
-        <w:pStyle w:val="ListParagraph"/>
-        <w:numPr>
-          <w:ilvl w:val="0"/>
-          <w:numId w:val="2"/>
-        </w:numPr>
-        <w:spacing w:after="80" w:before="0"/>
-      </w:pPr>
-      <w:r>
-        <w:rPr>
-          <w:rFonts w:ascii="Arial" w:cs="Arial" w:eastAsia="Arial" w:hAnsi="Arial"/>
-          <w:color w:val="222222"/>
-          <w:sz w:val="22"/>
-          <w:szCs w:val="22"/>
-        </w:rPr>
-        <w:t xml:space="preserve">&lt;meta name="description"&gt; — the description shown in Google search snippets</w:t>
-      </w:r>
-    </w:p>
-    <w:p>
-      <w:pPr>
-        <w:pStyle w:val="ListParagraph"/>
-        <w:numPr>
-          <w:ilvl w:val="0"/>
-          <w:numId w:val="2"/>
-        </w:numPr>
-        <w:spacing w:after="80" w:before="0"/>
-      </w:pPr>
-      <w:r>
-        <w:rPr>
-          <w:rFonts w:ascii="Arial" w:cs="Arial" w:eastAsia="Arial" w:hAnsi="Arial"/>
-          <w:color w:val="222222"/>
-          <w:sz w:val="22"/>
-          <w:szCs w:val="22"/>
-        </w:rPr>
-        <w:t xml:space="preserve">&lt;link rel="canonical"&gt; — your deployed domain URL</w:t>
-      </w:r>
-    </w:p>
-    <w:p>
-      <w:pPr>
-        <w:pStyle w:val="ListParagraph"/>
-        <w:numPr>
-          <w:ilvl w:val="0"/>
-          <w:numId w:val="2"/>
-        </w:numPr>
-        <w:spacing w:after="80" w:before="0"/>
-      </w:pPr>
-      <w:r>
-        <w:rPr>
-          <w:rFonts w:ascii="Arial" w:cs="Arial" w:eastAsia="Arial" w:hAnsi="Arial"/>
-          <w:color w:val="222222"/>
-          <w:sz w:val="22"/>
-          <w:szCs w:val="22"/>
-        </w:rPr>
-        <w:t xml:space="preserve">og:url, og:title, og:description, og:image — what appears when the URL is shared on LinkedIn, Slack, iMessage</w:t>
-      </w:r>
-    </w:p>
-    <w:p>
-      <w:pPr>
-        <w:pStyle w:val="ListParagraph"/>
-        <w:numPr>
-          <w:ilvl w:val="0"/>
-          <w:numId w:val="2"/>
-        </w:numPr>
-        <w:spacing w:after="80" w:before="0"/>
-      </w:pPr>
-      <w:r>
-        <w:rPr>
-          <w:rFonts w:ascii="Arial" w:cs="Arial" w:eastAsia="Arial" w:hAnsi="Arial"/>
-          <w:color w:val="222222"/>
-          <w:sz w:val="22"/>
-          <w:szCs w:val="22"/>
-        </w:rPr>
-        <w:t xml:space="preserve">twitter:site — your firm's Twitter/X handle (e.g. @yourfirm), or remove this tag if you don't use Twitter</w:t>
-      </w:r>
-    </w:p>
-    <w:p>
-      <w:pPr>
-        <w:spacing w:after="80" w:before="0"/>
+        <w:spacing w:after="100" w:before="0"/>
       </w:pPr>
     </w:p>
     <w:tbl>
@@ -7151,11 +6518,11 @@
             <w:tcW w:type="dxa" w:w="9360"/>
             <w:tcBorders>
               <w:top w:val="none" w:color="FFFFFF" w:sz="0"/>
-              <w:left w:val="single" w:color="4300EC" w:sz="12"/>
+              <w:left w:val="single" w:color="D97706" w:sz="12"/>
               <w:bottom w:val="none" w:color="FFFFFF" w:sz="0"/>
               <w:right w:val="none" w:color="FFFFFF" w:sz="0"/>
             </w:tcBorders>
-            <w:shd w:fill="E8F0FE" w:val="clear"/>
+            <w:shd w:fill="FFF8E7" w:val="clear"/>
             <w:tcMar>
               <w:top w:type="dxa" w:w="80"/>
               <w:left w:type="dxa" w:w="200"/>
@@ -7165,18 +6532,33 @@
           </w:tcPr>
           <w:p>
             <w:pPr>
-              <w:spacing w:after="0" w:before="0"/>
-            </w:pPr>
-            <w:r>
-              <w:rPr>
-                <w:rFonts w:ascii="Arial" w:cs="Arial" w:eastAsia="Arial" w:hAnsi="Arial"/>
-                <w:i/>
-                <w:iCs/>
+              <w:spacing w:after="40" w:before="0"/>
+            </w:pPr>
+            <w:r>
+              <w:rPr>
+                <w:rFonts w:ascii="Arial" w:cs="Arial" w:eastAsia="Arial" w:hAnsi="Arial"/>
+                <w:b/>
+                <w:bCs/>
+                <w:color w:val="D97706"/>
+                <w:sz w:val="20"/>
+                <w:szCs w:val="20"/>
+              </w:rPr>
+              <w:t xml:space="preserve">✦ Claude Tip</w:t>
+            </w:r>
+          </w:p>
+          <w:p>
+            <w:pPr>
+              <w:spacing w:after="0" w:before="0"/>
+            </w:pPr>
+            <w:r>
+              <w:rPr>
+                <w:rFonts w:ascii="Arial" w:cs="Arial" w:eastAsia="Arial" w:hAnsi="Arial"/>
                 <w:color w:val="1a1a1a"/>
                 <w:sz w:val="20"/>
                 <w:szCs w:val="20"/>
               </w:rPr>
-              <w:t xml:space="preserve">If you're using Claude, just say: "Update all the SEO metadata in index.html with our firm name, domain, and Twitter handle" and Claude will find and update every instance.</w:t>
+              <w:t xml:space="preserve">Tell Claude: "Update the hero headline to '[your headline]', the subtext to '[your subtext]', and the footer to '© 2026 [Your Firm].'"
+Claude will find and update all three spots in index.html and/or the Google Sheet config tab, whichever you prefer.</w:t>
             </w:r>
           </w:p>
         </w:tc>
@@ -7201,6 +6583,208 @@
           <w:sz w:val="26"/>
           <w:szCs w:val="26"/>
         </w:rPr>
+        <w:t xml:space="preserve">SEO and social sharing metadata</w:t>
+      </w:r>
+    </w:p>
+    <w:p>
+      <w:pPr>
+        <w:spacing w:after="120" w:before="0"/>
+      </w:pPr>
+      <w:r>
+        <w:rPr>
+          <w:rFonts w:ascii="Arial" w:cs="Arial" w:eastAsia="Arial" w:hAnsi="Arial"/>
+          <w:color w:val="222222"/>
+          <w:sz w:val="22"/>
+          <w:szCs w:val="22"/>
+        </w:rPr>
+        <w:t xml:space="preserve">Open index.html and update the meta tags near the top. Look for the lines marked &lt;!-- FORK: --&gt;:</w:t>
+      </w:r>
+    </w:p>
+    <w:p>
+      <w:pPr>
+        <w:pStyle w:val="ListParagraph"/>
+        <w:numPr>
+          <w:ilvl w:val="0"/>
+          <w:numId w:val="2"/>
+        </w:numPr>
+        <w:spacing w:after="80" w:before="0"/>
+      </w:pPr>
+      <w:r>
+        <w:rPr>
+          <w:rFonts w:ascii="Arial" w:cs="Arial" w:eastAsia="Arial" w:hAnsi="Arial"/>
+          <w:color w:val="222222"/>
+          <w:sz w:val="22"/>
+          <w:szCs w:val="22"/>
+        </w:rPr>
+        <w:t xml:space="preserve">&lt;title&gt; — browser tab title and Google search result heading</w:t>
+      </w:r>
+    </w:p>
+    <w:p>
+      <w:pPr>
+        <w:pStyle w:val="ListParagraph"/>
+        <w:numPr>
+          <w:ilvl w:val="0"/>
+          <w:numId w:val="2"/>
+        </w:numPr>
+        <w:spacing w:after="80" w:before="0"/>
+      </w:pPr>
+      <w:r>
+        <w:rPr>
+          <w:rFonts w:ascii="Arial" w:cs="Arial" w:eastAsia="Arial" w:hAnsi="Arial"/>
+          <w:color w:val="222222"/>
+          <w:sz w:val="22"/>
+          <w:szCs w:val="22"/>
+        </w:rPr>
+        <w:t xml:space="preserve">&lt;meta name="description"&gt; — snippet shown in Google results</w:t>
+      </w:r>
+    </w:p>
+    <w:p>
+      <w:pPr>
+        <w:pStyle w:val="ListParagraph"/>
+        <w:numPr>
+          <w:ilvl w:val="0"/>
+          <w:numId w:val="2"/>
+        </w:numPr>
+        <w:spacing w:after="80" w:before="0"/>
+      </w:pPr>
+      <w:r>
+        <w:rPr>
+          <w:rFonts w:ascii="Arial" w:cs="Arial" w:eastAsia="Arial" w:hAnsi="Arial"/>
+          <w:color w:val="222222"/>
+          <w:sz w:val="22"/>
+          <w:szCs w:val="22"/>
+        </w:rPr>
+        <w:t xml:space="preserve">&lt;link rel="canonical"&gt; — your deployed domain URL</w:t>
+      </w:r>
+    </w:p>
+    <w:p>
+      <w:pPr>
+        <w:pStyle w:val="ListParagraph"/>
+        <w:numPr>
+          <w:ilvl w:val="0"/>
+          <w:numId w:val="2"/>
+        </w:numPr>
+        <w:spacing w:after="80" w:before="0"/>
+      </w:pPr>
+      <w:r>
+        <w:rPr>
+          <w:rFonts w:ascii="Arial" w:cs="Arial" w:eastAsia="Arial" w:hAnsi="Arial"/>
+          <w:color w:val="222222"/>
+          <w:sz w:val="22"/>
+          <w:szCs w:val="22"/>
+        </w:rPr>
+        <w:t xml:space="preserve">og:url, og:title, og:description, og:image — what appears when shared on LinkedIn, Slack, iMessage</w:t>
+      </w:r>
+    </w:p>
+    <w:p>
+      <w:pPr>
+        <w:pStyle w:val="ListParagraph"/>
+        <w:numPr>
+          <w:ilvl w:val="0"/>
+          <w:numId w:val="2"/>
+        </w:numPr>
+        <w:spacing w:after="80" w:before="0"/>
+      </w:pPr>
+      <w:r>
+        <w:rPr>
+          <w:rFonts w:ascii="Arial" w:cs="Arial" w:eastAsia="Arial" w:hAnsi="Arial"/>
+          <w:color w:val="222222"/>
+          <w:sz w:val="22"/>
+          <w:szCs w:val="22"/>
+        </w:rPr>
+        <w:t xml:space="preserve">twitter:site — your firm's Twitter/X handle, or remove the tag if you don't use Twitter</w:t>
+      </w:r>
+    </w:p>
+    <w:p>
+      <w:pPr>
+        <w:spacing w:after="100" w:before="0"/>
+      </w:pPr>
+    </w:p>
+    <w:tbl>
+      <w:tblPr>
+        <w:tblW w:type="dxa" w:w="9360"/>
+        <w:tblBorders>
+          <w:top w:val="none" w:color="FFFFFF" w:sz="0"/>
+          <w:left w:val="none" w:color="FFFFFF" w:sz="0"/>
+          <w:bottom w:val="none" w:color="FFFFFF" w:sz="0"/>
+          <w:right w:val="none" w:color="FFFFFF" w:sz="0"/>
+          <w:insideH w:val="single" w:color="auto" w:sz="4"/>
+          <w:insideV w:val="single" w:color="auto" w:sz="4"/>
+        </w:tblBorders>
+      </w:tblPr>
+      <w:tblGrid>
+        <w:gridCol w:w="9360"/>
+      </w:tblGrid>
+      <w:tr>
+        <w:tc>
+          <w:tcPr>
+            <w:tcW w:type="dxa" w:w="9360"/>
+            <w:tcBorders>
+              <w:top w:val="none" w:color="FFFFFF" w:sz="0"/>
+              <w:left w:val="single" w:color="D97706" w:sz="12"/>
+              <w:bottom w:val="none" w:color="FFFFFF" w:sz="0"/>
+              <w:right w:val="none" w:color="FFFFFF" w:sz="0"/>
+            </w:tcBorders>
+            <w:shd w:fill="FFF8E7" w:val="clear"/>
+            <w:tcMar>
+              <w:top w:type="dxa" w:w="80"/>
+              <w:left w:type="dxa" w:w="200"/>
+              <w:bottom w:type="dxa" w:w="80"/>
+              <w:right w:type="dxa" w:w="120"/>
+            </w:tcMar>
+          </w:tcPr>
+          <w:p>
+            <w:pPr>
+              <w:spacing w:after="40" w:before="0"/>
+            </w:pPr>
+            <w:r>
+              <w:rPr>
+                <w:rFonts w:ascii="Arial" w:cs="Arial" w:eastAsia="Arial" w:hAnsi="Arial"/>
+                <w:b/>
+                <w:bCs/>
+                <w:color w:val="D97706"/>
+                <w:sz w:val="20"/>
+                <w:szCs w:val="20"/>
+              </w:rPr>
+              <w:t xml:space="preserve">✦ Claude Tip</w:t>
+            </w:r>
+          </w:p>
+          <w:p>
+            <w:pPr>
+              <w:spacing w:after="0" w:before="0"/>
+            </w:pPr>
+            <w:r>
+              <w:rPr>
+                <w:rFonts w:ascii="Arial" w:cs="Arial" w:eastAsia="Arial" w:hAnsi="Arial"/>
+                <w:color w:val="1a1a1a"/>
+                <w:sz w:val="20"/>
+                <w:szCs w:val="20"/>
+              </w:rPr>
+              <w:t xml:space="preserve">Say: "Update all the SEO and social sharing metadata in index.html. Our firm name is [Name], our domain is [URL], our Twitter handle is @[handle], and our tagline is '[tagline]'." Claude will find and update every instance in the file at once.</w:t>
+            </w:r>
+          </w:p>
+        </w:tc>
+      </w:tr>
+    </w:tbl>
+    <w:p>
+      <w:pPr>
+        <w:spacing w:after="120" w:before="0"/>
+      </w:pPr>
+    </w:p>
+    <w:p>
+      <w:pPr>
+        <w:pStyle w:val="Heading2"/>
+        <w:spacing w:after="120" w:before="280"/>
+      </w:pPr>
+      <w:r>
+        <w:rPr>
+          <w:rFonts w:ascii="Arial" w:cs="Arial" w:eastAsia="Arial" w:hAnsi="Arial"/>
+          <w:b/>
+          <w:bCs/>
+          <w:color w:val="4300EC"/>
+          <w:sz w:val="26"/>
+          <w:szCs w:val="26"/>
+        </w:rPr>
         <w:t xml:space="preserve">Favicon</w:t>
       </w:r>
     </w:p>
@@ -7215,9 +6799,80 @@
           <w:sz w:val="22"/>
           <w:szCs w:val="22"/>
         </w:rPr>
-        <w:t xml:space="preserve">Replace favicon.ico and favicon.png with your own icons. These appear in browser tabs and bookmarks. Free tools like favicon.io can convert any logo image into the right formats.</w:t>
-      </w:r>
-    </w:p>
+        <w:t xml:space="preserve">Replace favicon.ico and favicon.png in the repo root with your own icons. These appear in browser tabs and bookmarks.</w:t>
+      </w:r>
+    </w:p>
+    <w:p>
+      <w:pPr>
+        <w:spacing w:after="80" w:before="0"/>
+      </w:pPr>
+    </w:p>
+    <w:tbl>
+      <w:tblPr>
+        <w:tblW w:type="dxa" w:w="9360"/>
+        <w:tblBorders>
+          <w:top w:val="none" w:color="FFFFFF" w:sz="0"/>
+          <w:left w:val="none" w:color="FFFFFF" w:sz="0"/>
+          <w:bottom w:val="none" w:color="FFFFFF" w:sz="0"/>
+          <w:right w:val="none" w:color="FFFFFF" w:sz="0"/>
+          <w:insideH w:val="single" w:color="auto" w:sz="4"/>
+          <w:insideV w:val="single" w:color="auto" w:sz="4"/>
+        </w:tblBorders>
+      </w:tblPr>
+      <w:tblGrid>
+        <w:gridCol w:w="9360"/>
+      </w:tblGrid>
+      <w:tr>
+        <w:tc>
+          <w:tcPr>
+            <w:tcW w:type="dxa" w:w="9360"/>
+            <w:tcBorders>
+              <w:top w:val="none" w:color="FFFFFF" w:sz="0"/>
+              <w:left w:val="single" w:color="D97706" w:sz="12"/>
+              <w:bottom w:val="none" w:color="FFFFFF" w:sz="0"/>
+              <w:right w:val="none" w:color="FFFFFF" w:sz="0"/>
+            </w:tcBorders>
+            <w:shd w:fill="FFF8E7" w:val="clear"/>
+            <w:tcMar>
+              <w:top w:type="dxa" w:w="80"/>
+              <w:left w:type="dxa" w:w="200"/>
+              <w:bottom w:type="dxa" w:w="80"/>
+              <w:right w:type="dxa" w:w="120"/>
+            </w:tcMar>
+          </w:tcPr>
+          <w:p>
+            <w:pPr>
+              <w:spacing w:after="40" w:before="0"/>
+            </w:pPr>
+            <w:r>
+              <w:rPr>
+                <w:rFonts w:ascii="Arial" w:cs="Arial" w:eastAsia="Arial" w:hAnsi="Arial"/>
+                <w:b/>
+                <w:bCs/>
+                <w:color w:val="D97706"/>
+                <w:sz w:val="20"/>
+                <w:szCs w:val="20"/>
+              </w:rPr>
+              <w:t xml:space="preserve">✦ Claude Tip</w:t>
+            </w:r>
+          </w:p>
+          <w:p>
+            <w:pPr>
+              <w:spacing w:after="0" w:before="0"/>
+            </w:pPr>
+            <w:r>
+              <w:rPr>
+                <w:rFonts w:ascii="Arial" w:cs="Arial" w:eastAsia="Arial" w:hAnsi="Arial"/>
+                <w:color w:val="1a1a1a"/>
+                <w:sz w:val="20"/>
+                <w:szCs w:val="20"/>
+              </w:rPr>
+              <w:t xml:space="preserve">You can generate favicon files for free at favicon.io — just upload your logo. Then tell Claude CoWork: "Replace favicon.ico and favicon.png with the attached files." Claude will swap them in.</w:t>
+            </w:r>
+          </w:p>
+        </w:tc>
+      </w:tr>
+    </w:tbl>
     <w:p>
       <w:pPr>
         <w:spacing w:after="200" w:before="0"/>
@@ -7493,7 +7148,7 @@
           <w:sz w:val="22"/>
           <w:szCs w:val="22"/>
         </w:rPr>
-        <w:t xml:space="preserve">The most common cause is a wrong job board URL. Check these things:</w:t>
+        <w:t xml:space="preserve">The most common cause is a wrong job board URL. Check:</w:t>
       </w:r>
     </w:p>
     <w:p>
@@ -7512,7 +7167,7 @@
           <w:sz w:val="22"/>
           <w:szCs w:val="22"/>
         </w:rPr>
-        <w:t xml:space="preserve">Is the URL the direct ATS board URL, not a redirect? (e.g. for Greenhouse, use boards.greenhouse.io/companyname, not companyname.com/careers)</w:t>
+        <w:t xml:space="preserve">Is the URL the direct ATS board URL, not a redirect? (For Greenhouse, use boards.greenhouse.io/companyname, not companyname.com/careers)</w:t>
       </w:r>
     </w:p>
     <w:p>
@@ -7610,6 +7265,439 @@
         </w:tc>
       </w:tr>
     </w:tbl>
+    <w:p>
+      <w:pPr>
+        <w:spacing w:after="200" w:before="0"/>
+      </w:pPr>
+    </w:p>
+    <w:p>
+      <w:pPr>
+        <w:pBdr>
+          <w:bottom w:val="single" w:color="CCCCCC" w:sz="4" w:space="1"/>
+        </w:pBdr>
+        <w:spacing w:after="200" w:before="200"/>
+      </w:pPr>
+    </w:p>
+    <w:p>
+      <w:r>
+        <w:br w:type="page"/>
+      </w:r>
+    </w:p>
+    <w:p>
+      <w:pPr>
+        <w:pStyle w:val="Heading1"/>
+        <w:spacing w:after="160" w:before="360"/>
+      </w:pPr>
+      <w:r>
+        <w:rPr>
+          <w:rFonts w:ascii="Arial" w:cs="Arial" w:eastAsia="Arial" w:hAnsi="Arial"/>
+          <w:b/>
+          <w:bCs/>
+          <w:color w:val="1A3A6B"/>
+          <w:sz w:val="32"/>
+          <w:szCs w:val="32"/>
+        </w:rPr>
+        <w:t xml:space="preserve">Troubleshooting: Company Not Appearing or Showing Errors</w:t>
+      </w:r>
+    </w:p>
+    <w:p>
+      <w:pPr>
+        <w:spacing w:after="120" w:before="0"/>
+      </w:pPr>
+    </w:p>
+    <w:p>
+      <w:pPr>
+        <w:pStyle w:val="Heading2"/>
+        <w:spacing w:after="120" w:before="280"/>
+      </w:pPr>
+      <w:r>
+        <w:rPr>
+          <w:rFonts w:ascii="Arial" w:cs="Arial" w:eastAsia="Arial" w:hAnsi="Arial"/>
+          <w:b/>
+          <w:bCs/>
+          <w:color w:val="4300EC"/>
+          <w:sz w:val="26"/>
+          <w:szCs w:val="26"/>
+        </w:rPr>
+        <w:t xml:space="preserve">Why a company might not show up</w:t>
+      </w:r>
+    </w:p>
+    <w:p>
+      <w:pPr>
+        <w:spacing w:after="120" w:before="0"/>
+      </w:pPr>
+      <w:r>
+        <w:rPr>
+          <w:rFonts w:ascii="Arial" w:cs="Arial" w:eastAsia="Arial" w:hAnsi="Arial"/>
+          <w:color w:val="222222"/>
+          <w:sz w:val="22"/>
+          <w:szCs w:val="22"/>
+        </w:rPr>
+        <w:t xml:space="preserve">If you add a company to your Google Sheet and their jobs don't appear on the board — or you see an error — the most common cause is that the company uses a hiring platform the job board doesn't yet recognize.</w:t>
+      </w:r>
+    </w:p>
+    <w:p>
+      <w:pPr>
+        <w:spacing w:after="80" w:before="0"/>
+      </w:pPr>
+    </w:p>
+    <w:p>
+      <w:pPr>
+        <w:spacing w:after="120" w:before="0"/>
+      </w:pPr>
+      <w:r>
+        <w:rPr>
+          <w:rFonts w:ascii="Arial" w:cs="Arial" w:eastAsia="Arial" w:hAnsi="Arial"/>
+          <w:color w:val="222222"/>
+          <w:sz w:val="22"/>
+          <w:szCs w:val="22"/>
+        </w:rPr>
+        <w:t xml:space="preserve">The job board automatically detects which hiring platform a company uses based on the URL you provide. It has built-in support for about 17 platforms. But the hiring software landscape is large, and new platforms emerge regularly. When the board sees a URL it doesn't recognize, it tries a generic approach — and sometimes that generic approach returns nothing, or fails silently.</w:t>
+      </w:r>
+    </w:p>
+    <w:p>
+      <w:pPr>
+        <w:spacing w:after="120" w:before="0"/>
+      </w:pPr>
+    </w:p>
+    <w:p>
+      <w:pPr>
+        <w:pStyle w:val="Heading2"/>
+        <w:spacing w:after="120" w:before="280"/>
+      </w:pPr>
+      <w:r>
+        <w:rPr>
+          <w:rFonts w:ascii="Arial" w:cs="Arial" w:eastAsia="Arial" w:hAnsi="Arial"/>
+          <w:b/>
+          <w:bCs/>
+          <w:color w:val="4300EC"/>
+          <w:sz w:val="26"/>
+          <w:szCs w:val="26"/>
+        </w:rPr>
+        <w:t xml:space="preserve">How to diagnose the problem</w:t>
+      </w:r>
+    </w:p>
+    <w:p>
+      <w:pPr>
+        <w:pStyle w:val="ListParagraph"/>
+        <w:numPr>
+          <w:ilvl w:val="0"/>
+          <w:numId w:val="3"/>
+        </w:numPr>
+        <w:spacing w:after="80" w:before="0"/>
+      </w:pPr>
+      <w:r>
+        <w:rPr>
+          <w:rFonts w:ascii="Arial" w:cs="Arial" w:eastAsia="Arial" w:hAnsi="Arial"/>
+          <w:color w:val="222222"/>
+          <w:sz w:val="22"/>
+          <w:szCs w:val="22"/>
+        </w:rPr>
+        <w:t xml:space="preserve">Visit the company's job page URL in your browser and confirm it loads correctly with actual job listings.</w:t>
+      </w:r>
+    </w:p>
+    <w:p>
+      <w:pPr>
+        <w:pStyle w:val="ListParagraph"/>
+        <w:numPr>
+          <w:ilvl w:val="0"/>
+          <w:numId w:val="3"/>
+        </w:numPr>
+        <w:spacing w:after="80" w:before="0"/>
+      </w:pPr>
+      <w:r>
+        <w:rPr>
+          <w:rFonts w:ascii="Arial" w:cs="Arial" w:eastAsia="Arial" w:hAnsi="Arial"/>
+          <w:color w:val="222222"/>
+          <w:sz w:val="22"/>
+          <w:szCs w:val="22"/>
+        </w:rPr>
+        <w:t xml:space="preserve">Visit your live job board URL and add /api/jobs to the end (e.g. https://jobs.yourfirm.com/api/jobs). This shows the raw data the job board is working with as a JSON file.</w:t>
+      </w:r>
+    </w:p>
+    <w:p>
+      <w:pPr>
+        <w:pStyle w:val="ListParagraph"/>
+        <w:numPr>
+          <w:ilvl w:val="0"/>
+          <w:numId w:val="3"/>
+        </w:numPr>
+        <w:spacing w:after="80" w:before="0"/>
+      </w:pPr>
+      <w:r>
+        <w:rPr>
+          <w:rFonts w:ascii="Arial" w:cs="Arial" w:eastAsia="Arial" w:hAnsi="Arial"/>
+          <w:color w:val="222222"/>
+          <w:sz w:val="22"/>
+          <w:szCs w:val="22"/>
+        </w:rPr>
+        <w:t xml:space="preserve">In your browser, press Cmd+F (Mac) or Ctrl+F (Windows) and search for the company name. If it's in the "errors" section near the bottom of that JSON, something went wrong fetching their jobs. If it's in the "jobs" section with zero entries, the scraper ran but found nothing.</w:t>
+      </w:r>
+    </w:p>
+    <w:p>
+      <w:pPr>
+        <w:spacing w:after="120" w:before="0"/>
+      </w:pPr>
+    </w:p>
+    <w:p>
+      <w:pPr>
+        <w:pStyle w:val="Heading2"/>
+        <w:spacing w:after="120" w:before="280"/>
+      </w:pPr>
+      <w:r>
+        <w:rPr>
+          <w:rFonts w:ascii="Arial" w:cs="Arial" w:eastAsia="Arial" w:hAnsi="Arial"/>
+          <w:b/>
+          <w:bCs/>
+          <w:color w:val="4300EC"/>
+          <w:sz w:val="26"/>
+          <w:szCs w:val="26"/>
+        </w:rPr>
+        <w:t xml:space="preserve">Using Claude CoWork to add support for a new platform</w:t>
+      </w:r>
+    </w:p>
+    <w:p>
+      <w:pPr>
+        <w:spacing w:after="120" w:before="0"/>
+      </w:pPr>
+      <w:r>
+        <w:rPr>
+          <w:rFonts w:ascii="Arial" w:cs="Arial" w:eastAsia="Arial" w:hAnsi="Arial"/>
+          <w:color w:val="222222"/>
+          <w:sz w:val="22"/>
+          <w:szCs w:val="22"/>
+        </w:rPr>
+        <w:t xml:space="preserve">If a company is using a hiring platform that the job board doesn't support yet, Claude CoWork can write a new scraper for it — even with no coding experience on your part. Here's the exact conversation to have:</w:t>
+      </w:r>
+    </w:p>
+    <w:p>
+      <w:pPr>
+        <w:spacing w:after="100" w:before="0"/>
+      </w:pPr>
+    </w:p>
+    <w:tbl>
+      <w:tblPr>
+        <w:tblW w:type="dxa" w:w="9360"/>
+        <w:tblBorders>
+          <w:top w:val="none" w:color="FFFFFF" w:sz="0"/>
+          <w:left w:val="none" w:color="FFFFFF" w:sz="0"/>
+          <w:bottom w:val="none" w:color="FFFFFF" w:sz="0"/>
+          <w:right w:val="none" w:color="FFFFFF" w:sz="0"/>
+          <w:insideH w:val="single" w:color="auto" w:sz="4"/>
+          <w:insideV w:val="single" w:color="auto" w:sz="4"/>
+        </w:tblBorders>
+      </w:tblPr>
+      <w:tblGrid>
+        <w:gridCol w:w="9360"/>
+      </w:tblGrid>
+      <w:tr>
+        <w:tc>
+          <w:tcPr>
+            <w:tcW w:type="dxa" w:w="9360"/>
+            <w:tcBorders>
+              <w:top w:val="none" w:color="FFFFFF" w:sz="0"/>
+              <w:left w:val="single" w:color="D97706" w:sz="12"/>
+              <w:bottom w:val="none" w:color="FFFFFF" w:sz="0"/>
+              <w:right w:val="none" w:color="FFFFFF" w:sz="0"/>
+            </w:tcBorders>
+            <w:shd w:fill="FFF8E7" w:val="clear"/>
+            <w:tcMar>
+              <w:top w:type="dxa" w:w="80"/>
+              <w:left w:type="dxa" w:w="200"/>
+              <w:bottom w:type="dxa" w:w="80"/>
+              <w:right w:type="dxa" w:w="120"/>
+            </w:tcMar>
+          </w:tcPr>
+          <w:p>
+            <w:pPr>
+              <w:spacing w:after="40" w:before="0"/>
+            </w:pPr>
+            <w:r>
+              <w:rPr>
+                <w:rFonts w:ascii="Arial" w:cs="Arial" w:eastAsia="Arial" w:hAnsi="Arial"/>
+                <w:b/>
+                <w:bCs/>
+                <w:color w:val="D97706"/>
+                <w:sz w:val="20"/>
+                <w:szCs w:val="20"/>
+              </w:rPr>
+              <w:t xml:space="preserve">✦ Claude Tip</w:t>
+            </w:r>
+          </w:p>
+          <w:p>
+            <w:pPr>
+              <w:spacing w:after="0" w:before="0"/>
+            </w:pPr>
+            <w:r>
+              <w:rPr>
+                <w:rFonts w:ascii="Arial" w:cs="Arial" w:eastAsia="Arial" w:hAnsi="Arial"/>
+                <w:color w:val="1a1a1a"/>
+                <w:sz w:val="20"/>
+                <w:szCs w:val="20"/>
+              </w:rPr>
+              <w:t xml:space="preserve">Start a new Claude CoWork session with your portfolio-jobs folder selected. Then say:
+"I've added [Company Name] to my Google Sheet but they're not showing up on the job board. Their job listings are at [URL]. Can you check api/jobs.js to see if this platform is supported, and if not, write a scraper for it?"
+Claude will:
+  1. Read api/jobs.js to understand the existing platform detectors
+  2. Inspect the URL pattern and identify the hiring platform
+  3. Look up or reverse-engineer the platform's API
+  4. Write a new fetch function following the same pattern as the existing scrapers
+  5. Add the URL pattern to the platform detector
+  6. Walk you through testing and deploying it
+This typically takes 10–20 minutes and requires no coding from you.</w:t>
+            </w:r>
+          </w:p>
+        </w:tc>
+      </w:tr>
+    </w:tbl>
+    <w:p>
+      <w:pPr>
+        <w:spacing w:after="120" w:before="0"/>
+      </w:pPr>
+    </w:p>
+    <w:p>
+      <w:pPr>
+        <w:pStyle w:val="Heading2"/>
+        <w:spacing w:after="120" w:before="280"/>
+      </w:pPr>
+      <w:r>
+        <w:rPr>
+          <w:rFonts w:ascii="Arial" w:cs="Arial" w:eastAsia="Arial" w:hAnsi="Arial"/>
+          <w:b/>
+          <w:bCs/>
+          <w:color w:val="4300EC"/>
+          <w:sz w:val="26"/>
+          <w:szCs w:val="26"/>
+        </w:rPr>
+        <w:t xml:space="preserve">What Claude needs to do this well</w:t>
+      </w:r>
+    </w:p>
+    <w:p>
+      <w:pPr>
+        <w:spacing w:after="120" w:before="0"/>
+      </w:pPr>
+      <w:r>
+        <w:rPr>
+          <w:rFonts w:ascii="Arial" w:cs="Arial" w:eastAsia="Arial" w:hAnsi="Arial"/>
+          <w:color w:val="222222"/>
+          <w:sz w:val="22"/>
+          <w:szCs w:val="22"/>
+        </w:rPr>
+        <w:t xml:space="preserve">To help Claude write a scraper as accurately as possible, provide:</w:t>
+      </w:r>
+    </w:p>
+    <w:p>
+      <w:pPr>
+        <w:pStyle w:val="ListParagraph"/>
+        <w:numPr>
+          <w:ilvl w:val="0"/>
+          <w:numId w:val="2"/>
+        </w:numPr>
+        <w:spacing w:after="80" w:before="0"/>
+      </w:pPr>
+      <w:r>
+        <w:rPr>
+          <w:rFonts w:ascii="Arial" w:cs="Arial" w:eastAsia="Arial" w:hAnsi="Arial"/>
+          <w:color w:val="222222"/>
+          <w:sz w:val="22"/>
+          <w:szCs w:val="22"/>
+        </w:rPr>
+        <w:t xml:space="preserve">The company's job board URL (e.g. https://acme.hire.trakstar.com/jobs)</w:t>
+      </w:r>
+    </w:p>
+    <w:p>
+      <w:pPr>
+        <w:pStyle w:val="ListParagraph"/>
+        <w:numPr>
+          <w:ilvl w:val="0"/>
+          <w:numId w:val="2"/>
+        </w:numPr>
+        <w:spacing w:after="80" w:before="0"/>
+      </w:pPr>
+      <w:r>
+        <w:rPr>
+          <w:rFonts w:ascii="Arial" w:cs="Arial" w:eastAsia="Arial" w:hAnsi="Arial"/>
+          <w:color w:val="222222"/>
+          <w:sz w:val="22"/>
+          <w:szCs w:val="22"/>
+        </w:rPr>
+        <w:t xml:space="preserve">The name of the hiring platform, if you know it (often visible in the URL or page footer)</w:t>
+      </w:r>
+    </w:p>
+    <w:p>
+      <w:pPr>
+        <w:pStyle w:val="ListParagraph"/>
+        <w:numPr>
+          <w:ilvl w:val="0"/>
+          <w:numId w:val="2"/>
+        </w:numPr>
+        <w:spacing w:after="80" w:before="0"/>
+      </w:pPr>
+      <w:r>
+        <w:rPr>
+          <w:rFonts w:ascii="Arial" w:cs="Arial" w:eastAsia="Arial" w:hAnsi="Arial"/>
+          <w:color w:val="222222"/>
+          <w:sz w:val="22"/>
+          <w:szCs w:val="22"/>
+        </w:rPr>
+        <w:t xml:space="preserve">A few example job posting URLs from that company, if you can find them</w:t>
+      </w:r>
+    </w:p>
+    <w:p>
+      <w:pPr>
+        <w:spacing w:after="80" w:before="0"/>
+      </w:pPr>
+    </w:p>
+    <w:p>
+      <w:pPr>
+        <w:spacing w:after="120" w:before="0"/>
+      </w:pPr>
+      <w:r>
+        <w:rPr>
+          <w:rFonts w:ascii="Arial" w:cs="Arial" w:eastAsia="Arial" w:hAnsi="Arial"/>
+          <w:color w:val="222222"/>
+          <w:sz w:val="22"/>
+          <w:szCs w:val="22"/>
+        </w:rPr>
+        <w:t xml:space="preserve">With just the URL, Claude can usually figure out the rest by inspecting how the page loads and what API calls it makes.</w:t>
+      </w:r>
+    </w:p>
+    <w:p>
+      <w:pPr>
+        <w:spacing w:after="120" w:before="0"/>
+      </w:pPr>
+    </w:p>
+    <w:p>
+      <w:pPr>
+        <w:pStyle w:val="Heading2"/>
+        <w:spacing w:after="120" w:before="280"/>
+      </w:pPr>
+      <w:r>
+        <w:rPr>
+          <w:rFonts w:ascii="Arial" w:cs="Arial" w:eastAsia="Arial" w:hAnsi="Arial"/>
+          <w:b/>
+          <w:bCs/>
+          <w:color w:val="4300EC"/>
+          <w:sz w:val="26"/>
+          <w:szCs w:val="26"/>
+        </w:rPr>
+        <w:t xml:space="preserve">Contributing the scraper back</w:t>
+      </w:r>
+    </w:p>
+    <w:p>
+      <w:pPr>
+        <w:spacing w:after="120" w:before="0"/>
+      </w:pPr>
+      <w:r>
+        <w:rPr>
+          <w:rFonts w:ascii="Arial" w:cs="Arial" w:eastAsia="Arial" w:hAnsi="Arial"/>
+          <w:color w:val="222222"/>
+          <w:sz w:val="22"/>
+          <w:szCs w:val="22"/>
+        </w:rPr>
+        <w:t xml:space="preserve">If Claude writes a scraper for a new platform and it works, consider contributing it to the open-source project so other firms benefit too. See the Contributing section at the end of this guide — or ask Claude: "How do I submit this as a pull request to the original repo?"</w:t>
+      </w:r>
+    </w:p>
     <w:p>
       <w:pPr>
         <w:spacing w:after="200" w:before="0"/>
@@ -7734,7 +7822,7 @@
           <w:sz w:val="22"/>
           <w:szCs w:val="22"/>
         </w:rPr>
-        <w:t xml:space="preserve">Claude Cowork is your partner for extending and customizing the job board over time. The codebase is well-documented specifically so Claude can understand it and make accurate changes. Here are starting prompts for common tasks — open a new Cowork session with your portfolio-jobs folder selected, and paste these as your first message.</w:t>
+        <w:t xml:space="preserve">Claude CoWork is your partner for extending and customizing the job board over time. The codebase is well-documented specifically so Claude can understand it and make accurate changes. Here are starting prompts for common tasks.</w:t>
       </w:r>
     </w:p>
     <w:p>
@@ -7756,21 +7844,7 @@
           <w:sz w:val="26"/>
           <w:szCs w:val="26"/>
         </w:rPr>
-        <w:t xml:space="preserve">Onboarding prompt (use at the start of every new session)</w:t>
-      </w:r>
-    </w:p>
-    <w:p>
-      <w:pPr>
-        <w:spacing w:after="120" w:before="0"/>
-      </w:pPr>
-      <w:r>
-        <w:rPr>
-          <w:rFonts w:ascii="Arial" w:cs="Arial" w:eastAsia="Arial" w:hAnsi="Arial"/>
-          <w:color w:val="222222"/>
-          <w:sz w:val="22"/>
-          <w:szCs w:val="22"/>
-        </w:rPr>
-        <w:t xml:space="preserve">Start every Claude session with this so Claude understands the project:</w:t>
+        <w:t xml:space="preserve">Onboarding prompt (start every new session with this)</w:t>
       </w:r>
     </w:p>
     <w:p>
@@ -7799,11 +7873,11 @@
             <w:tcW w:type="dxa" w:w="9360"/>
             <w:tcBorders>
               <w:top w:val="none" w:color="FFFFFF" w:sz="0"/>
-              <w:left w:val="single" w:color="4300EC" w:sz="12"/>
+              <w:left w:val="single" w:color="D97706" w:sz="12"/>
               <w:bottom w:val="none" w:color="FFFFFF" w:sz="0"/>
               <w:right w:val="none" w:color="FFFFFF" w:sz="0"/>
             </w:tcBorders>
-            <w:shd w:fill="E8F0FE" w:val="clear"/>
+            <w:shd w:fill="FFF8E7" w:val="clear"/>
             <w:tcMar>
               <w:top w:type="dxa" w:w="80"/>
               <w:left w:type="dxa" w:w="200"/>
@@ -7813,18 +7887,32 @@
           </w:tcPr>
           <w:p>
             <w:pPr>
-              <w:spacing w:after="0" w:before="0"/>
-            </w:pPr>
-            <w:r>
-              <w:rPr>
-                <w:rFonts w:ascii="Arial" w:cs="Arial" w:eastAsia="Arial" w:hAnsi="Arial"/>
-                <w:i/>
-                <w:iCs/>
+              <w:spacing w:after="40" w:before="0"/>
+            </w:pPr>
+            <w:r>
+              <w:rPr>
+                <w:rFonts w:ascii="Arial" w:cs="Arial" w:eastAsia="Arial" w:hAnsi="Arial"/>
+                <w:b/>
+                <w:bCs/>
+                <w:color w:val="D97706"/>
+                <w:sz w:val="20"/>
+                <w:szCs w:val="20"/>
+              </w:rPr>
+              <w:t xml:space="preserve">✦ Claude Tip</w:t>
+            </w:r>
+          </w:p>
+          <w:p>
+            <w:pPr>
+              <w:spacing w:after="0" w:before="0"/>
+            </w:pPr>
+            <w:r>
+              <w:rPr>
+                <w:rFonts w:ascii="Arial" w:cs="Arial" w:eastAsia="Arial" w:hAnsi="Arial"/>
                 <w:color w:val="1a1a1a"/>
                 <w:sz w:val="20"/>
                 <w:szCs w:val="20"/>
               </w:rPr>
-              <w:t xml:space="preserve">I'm working on a portfolio job board project in the portfolio-jobs folder. Please read README.md and SETUP.md to understand the architecture before making any changes. The main files are: api/jobs.js (Vercel Edge Function that fetches jobs), js/app.js (frontend filter and render logic), css/styles.css (all styling), and index.html (page structure). Ask me any questions before making changes.</w:t>
+              <w:t xml:space="preserve">"I'm working on a portfolio job board project in the portfolio-jobs folder. Please read README.md and SETUP.md to understand the architecture before making any changes. The main files are: api/jobs.js (the server function that fetches jobs), js/app.js (frontend filter and render logic), css/styles.css (all styling), and index.html (page structure). Ask me any questions before making changes."</w:t>
             </w:r>
           </w:p>
         </w:tc>
@@ -7868,7 +7956,7 @@
           <w:sz w:val="22"/>
           <w:szCs w:val="22"/>
         </w:rPr>
-        <w:t xml:space="preserve">Update the brand colors to match our new palette: primary is #2B4EFF, secondary is #00C2B2, hero background should be a dark navy gradient from #0D1B40 to #0A0F2E.</w:t>
+        <w:t xml:space="preserve">"Update the brand colors to match our new palette: primary is #2B4EFF, secondary is #00C2B2, hero background should be a dark navy gradient from #0D1B40 to #0A0F2E."</w:t>
       </w:r>
     </w:p>
     <w:p>
@@ -7887,7 +7975,7 @@
           <w:sz w:val="22"/>
           <w:szCs w:val="22"/>
         </w:rPr>
-        <w:t xml:space="preserve">Replace the logo with the attached file and update all references to it in index.html. Also update the og:image tag to use https://jobs.myfirm.com/logo.svg.</w:t>
+        <w:t xml:space="preserve">"Replace the logo with the attached file and update all references to it in index.html. Also update the og:image tag to use https://jobs.myfirm.com/logo.svg."</w:t>
       </w:r>
     </w:p>
     <w:p>
@@ -7906,7 +7994,26 @@
           <w:sz w:val="22"/>
           <w:szCs w:val="22"/>
         </w:rPr>
-        <w:t xml:space="preserve">Update all SEO meta tags in index.html: our firm name is "Acme Ventures", our domain is jobs.acme.vc, our Twitter handle is @acmevc, and our tagline is "The best jobs in B2B SaaS."</w:t>
+        <w:t xml:space="preserve">"Update all SEO meta tags in index.html: our firm name is Acme Ventures, our domain is jobs.acme.vc, our Twitter handle is @acmevc, and our tagline is 'The best jobs in B2B SaaS.'"</w:t>
+      </w:r>
+    </w:p>
+    <w:p>
+      <w:pPr>
+        <w:pStyle w:val="ListParagraph"/>
+        <w:numPr>
+          <w:ilvl w:val="0"/>
+          <w:numId w:val="2"/>
+        </w:numPr>
+        <w:spacing w:after="80" w:before="0"/>
+      </w:pPr>
+      <w:r>
+        <w:rPr>
+          <w:rFonts w:ascii="Arial" w:cs="Arial" w:eastAsia="Arial" w:hAnsi="Arial"/>
+          <w:color w:val="222222"/>
+          <w:sz w:val="22"/>
+          <w:szCs w:val="22"/>
+        </w:rPr>
+        <w:t xml:space="preserve">"Change the font from Arial to Inter throughout the site. Import it from Google Fonts."</w:t>
       </w:r>
     </w:p>
     <w:p>
@@ -7947,7 +8054,7 @@
           <w:sz w:val="22"/>
           <w:szCs w:val="22"/>
         </w:rPr>
-        <w:t xml:space="preserve">Add a "Featured Companies" section above the main job list that highlights 3–4 companies we specify. The featured companies should be configurable via the Google Sheet Config tab using a new "featuredCompanies" key.</w:t>
+        <w:t xml:space="preserve">"Add a 'Featured Companies' section above the main job list that highlights 3–4 companies we specify. Make it configurable via the Google Sheet Config tab."</w:t>
       </w:r>
     </w:p>
     <w:p>
@@ -7966,7 +8073,7 @@
           <w:sz w:val="22"/>
           <w:szCs w:val="22"/>
         </w:rPr>
-        <w:t xml:space="preserve">Add a way for job seekers to sign up for email alerts when new jobs are posted. They should be able to filter by company and department. Use a simple mailto: link for now.</w:t>
+        <w:t xml:space="preserve">"Add a way for job seekers to sign up for email alerts when new jobs are posted."</w:t>
       </w:r>
     </w:p>
     <w:p>
@@ -7985,7 +8092,7 @@
           <w:sz w:val="22"/>
           <w:szCs w:val="22"/>
         </w:rPr>
-        <w:t xml:space="preserve">Add an "Apply with LinkedIn" button to each job card that pre-fills the job URL.</w:t>
+        <w:t xml:space="preserve">"Show a 'New' badge on jobs posted in the last 7 days."</w:t>
       </w:r>
     </w:p>
     <w:p>
@@ -8004,7 +8111,7 @@
           <w:sz w:val="22"/>
           <w:szCs w:val="22"/>
         </w:rPr>
-        <w:t xml:space="preserve">Add a dark mode toggle that remembers the user's preference.</w:t>
+        <w:t xml:space="preserve">"Add a dark mode toggle that remembers the user's preference."</w:t>
       </w:r>
     </w:p>
     <w:p>
@@ -8023,7 +8130,7 @@
           <w:sz w:val="22"/>
           <w:szCs w:val="22"/>
         </w:rPr>
-        <w:t xml:space="preserve">Show a "New" badge on jobs posted in the last 7 days.</w:t>
+        <w:t xml:space="preserve">"Add an 'Apply with LinkedIn' button to each job card."</w:t>
       </w:r>
     </w:p>
     <w:p>
@@ -8064,7 +8171,7 @@
           <w:sz w:val="22"/>
           <w:szCs w:val="22"/>
         </w:rPr>
-        <w:t xml:space="preserve">Company X isn't showing any jobs. Their job board URL is [URL]. Can you help figure out why? Check api/jobs.js to see how the URL is being handled.</w:t>
+        <w:t xml:space="preserve">"Company X isn't showing any jobs. Their job board URL is [URL]. Can you check api/jobs.js to see if this platform is supported and fix it?"</w:t>
       </w:r>
     </w:p>
     <w:p>
@@ -8083,7 +8190,7 @@
           <w:sz w:val="22"/>
           <w:szCs w:val="22"/>
         </w:rPr>
-        <w:t xml:space="preserve">The location filter is showing duplicates — "New York City" and "New York, NY" are both appearing as separate options. Please add an alias so they consolidate.</w:t>
+        <w:t xml:space="preserve">"The location filter is showing duplicates — 'New York City' and 'New York, NY' are both appearing. Please add an alias so they consolidate."</w:t>
       </w:r>
     </w:p>
     <w:p>
@@ -8102,26 +8209,7 @@
           <w:sz w:val="22"/>
           <w:szCs w:val="22"/>
         </w:rPr>
-        <w:t xml:space="preserve">The department filter has too many categories. Please consolidate "Business Development", "Partnerships", and "Alliances" into a single "Business Development" entry.</w:t>
-      </w:r>
-    </w:p>
-    <w:p>
-      <w:pPr>
-        <w:pStyle w:val="ListParagraph"/>
-        <w:numPr>
-          <w:ilvl w:val="0"/>
-          <w:numId w:val="2"/>
-        </w:numPr>
-        <w:spacing w:after="80" w:before="0"/>
-      </w:pPr>
-      <w:r>
-        <w:rPr>
-          <w:rFonts w:ascii="Arial" w:cs="Arial" w:eastAsia="Arial" w:hAnsi="Arial"/>
-          <w:color w:val="222222"/>
-          <w:sz w:val="22"/>
-          <w:szCs w:val="22"/>
-        </w:rPr>
-        <w:t xml:space="preserve">The job board is loading slowly on mobile. Review the code for any performance improvements — especially in app.js.</w:t>
+        <w:t xml:space="preserve">"The department filter has too many categories. Please consolidate 'Business Development', 'Partnerships', and 'Alliances' into a single 'Business Development' entry."</w:t>
       </w:r>
     </w:p>
     <w:p>
@@ -8162,26 +8250,7 @@
           <w:sz w:val="22"/>
           <w:szCs w:val="22"/>
         </w:rPr>
-        <w:t xml:space="preserve">We have a portfolio company using Jobvite for their recruiting. Their job board is at [URL]. Please add a Jobvite scraper to api/jobs.js following the same pattern as the existing scrapers.</w:t>
-      </w:r>
-    </w:p>
-    <w:p>
-      <w:pPr>
-        <w:pStyle w:val="ListParagraph"/>
-        <w:numPr>
-          <w:ilvl w:val="0"/>
-          <w:numId w:val="2"/>
-        </w:numPr>
-        <w:spacing w:after="80" w:before="0"/>
-      </w:pPr>
-      <w:r>
-        <w:rPr>
-          <w:rFonts w:ascii="Arial" w:cs="Arial" w:eastAsia="Arial" w:hAnsi="Arial"/>
-          <w:color w:val="222222"/>
-          <w:sz w:val="22"/>
-          <w:szCs w:val="22"/>
-        </w:rPr>
-        <w:t xml:space="preserve">One of our companies uses Workday, but their URL format is slightly different: [URL]. Can you update the Workday regex in fetchOneCompany to handle this format?</w:t>
+        <w:t xml:space="preserve">"We have a portfolio company using Jobvite for their recruiting. Their job board is at [URL]. Please add a Jobvite scraper to api/jobs.js following the same pattern as the existing scrapers."</w:t>
       </w:r>
     </w:p>
     <w:p>
@@ -8222,7 +8291,83 @@
           <w:sz w:val="22"/>
           <w:szCs w:val="22"/>
         </w:rPr>
-        <w:t xml:space="preserve">Add a simple analytics endpoint that returns the total number of jobs per company as JSON. This should be a separate file at api/stats.js.</w:t>
+        <w:t xml:space="preserve">"Create a monthly snapshot feature that logs the job count per company to a second Google Sheet tab so we can track hiring trends over time."</w:t>
+      </w:r>
+    </w:p>
+    <w:p>
+      <w:pPr>
+        <w:spacing w:after="200" w:before="0"/>
+      </w:pPr>
+    </w:p>
+    <w:p>
+      <w:pPr>
+        <w:pBdr>
+          <w:bottom w:val="single" w:color="CCCCCC" w:sz="4" w:space="1"/>
+        </w:pBdr>
+        <w:spacing w:after="200" w:before="200"/>
+      </w:pPr>
+    </w:p>
+    <w:p>
+      <w:r>
+        <w:br w:type="page"/>
+      </w:r>
+    </w:p>
+    <w:p>
+      <w:pPr>
+        <w:pStyle w:val="Heading1"/>
+        <w:spacing w:after="160" w:before="360"/>
+      </w:pPr>
+      <w:r>
+        <w:rPr>
+          <w:rFonts w:ascii="Arial" w:cs="Arial" w:eastAsia="Arial" w:hAnsi="Arial"/>
+          <w:b/>
+          <w:bCs/>
+          <w:color w:val="1A3A6B"/>
+          <w:sz w:val="32"/>
+          <w:szCs w:val="32"/>
+        </w:rPr>
+        <w:t xml:space="preserve">Open Source License — Plain English</w:t>
+      </w:r>
+    </w:p>
+    <w:p>
+      <w:pPr>
+        <w:spacing w:after="120" w:before="0"/>
+      </w:pPr>
+    </w:p>
+    <w:p>
+      <w:pPr>
+        <w:spacing w:after="120" w:before="0"/>
+      </w:pPr>
+      <w:r>
+        <w:rPr>
+          <w:rFonts w:ascii="Arial" w:cs="Arial" w:eastAsia="Arial" w:hAnsi="Arial"/>
+          <w:color w:val="222222"/>
+          <w:sz w:val="22"/>
+          <w:szCs w:val="22"/>
+        </w:rPr>
+        <w:t xml:space="preserve">This project is released under the MIT License, one of the most widely used and permissive open source licenses in the world. Here's what it means in plain English.</w:t>
+      </w:r>
+    </w:p>
+    <w:p>
+      <w:pPr>
+        <w:spacing w:after="120" w:before="0"/>
+      </w:pPr>
+    </w:p>
+    <w:p>
+      <w:pPr>
+        <w:pStyle w:val="Heading2"/>
+        <w:spacing w:after="120" w:before="280"/>
+      </w:pPr>
+      <w:r>
+        <w:rPr>
+          <w:rFonts w:ascii="Arial" w:cs="Arial" w:eastAsia="Arial" w:hAnsi="Arial"/>
+          <w:b/>
+          <w:bCs/>
+          <w:color w:val="4300EC"/>
+          <w:sz w:val="26"/>
+          <w:szCs w:val="26"/>
+        </w:rPr>
+        <w:t xml:space="preserve">What you can do with this code</w:t>
       </w:r>
     </w:p>
     <w:p>
@@ -8237,16 +8382,149 @@
       <w:r>
         <w:rPr>
           <w:rFonts w:ascii="Arial" w:cs="Arial" w:eastAsia="Arial" w:hAnsi="Arial"/>
-          <w:color w:val="222222"/>
-          <w:sz w:val="22"/>
-          <w:szCs w:val="22"/>
-        </w:rPr>
-        <w:t xml:space="preserve">Create a monthly snapshot feature that logs the job count to a second Google Sheet tab, so we can track hiring trends over time.</w:t>
+          <w:b/>
+          <w:bCs/>
+          <w:color w:val="222222"/>
+          <w:sz w:val="22"/>
+          <w:szCs w:val="22"/>
+        </w:rPr>
+        <w:t xml:space="preserve">Use it for free, for any purpose — commercial or personal.</w:t>
+      </w:r>
+    </w:p>
+    <w:p>
+      <w:pPr>
+        <w:pStyle w:val="ListParagraph"/>
+        <w:numPr>
+          <w:ilvl w:val="0"/>
+          <w:numId w:val="2"/>
+        </w:numPr>
+        <w:spacing w:after="80" w:before="0"/>
+      </w:pPr>
+      <w:r>
+        <w:rPr>
+          <w:rFonts w:ascii="Arial" w:cs="Arial" w:eastAsia="Arial" w:hAnsi="Arial"/>
+          <w:color w:val="222222"/>
+          <w:sz w:val="22"/>
+          <w:szCs w:val="22"/>
+        </w:rPr>
+        <w:t xml:space="preserve">Fork it (make your own copy) and customize it however you want.</w:t>
+      </w:r>
+    </w:p>
+    <w:p>
+      <w:pPr>
+        <w:pStyle w:val="ListParagraph"/>
+        <w:numPr>
+          <w:ilvl w:val="0"/>
+          <w:numId w:val="2"/>
+        </w:numPr>
+        <w:spacing w:after="80" w:before="0"/>
+      </w:pPr>
+      <w:r>
+        <w:rPr>
+          <w:rFonts w:ascii="Arial" w:cs="Arial" w:eastAsia="Arial" w:hAnsi="Arial"/>
+          <w:color w:val="222222"/>
+          <w:sz w:val="22"/>
+          <w:szCs w:val="22"/>
+        </w:rPr>
+        <w:t xml:space="preserve">Deploy it at your own firm without paying anyone.</w:t>
+      </w:r>
+    </w:p>
+    <w:p>
+      <w:pPr>
+        <w:pStyle w:val="ListParagraph"/>
+        <w:numPr>
+          <w:ilvl w:val="0"/>
+          <w:numId w:val="2"/>
+        </w:numPr>
+        <w:spacing w:after="80" w:before="0"/>
+      </w:pPr>
+      <w:r>
+        <w:rPr>
+          <w:rFonts w:ascii="Arial" w:cs="Arial" w:eastAsia="Arial" w:hAnsi="Arial"/>
+          <w:color w:val="222222"/>
+          <w:sz w:val="22"/>
+          <w:szCs w:val="22"/>
+        </w:rPr>
+        <w:t xml:space="preserve">Modify it — add features, change the design, connect new hiring platforms.</w:t>
+      </w:r>
+    </w:p>
+    <w:p>
+      <w:pPr>
+        <w:pStyle w:val="ListParagraph"/>
+        <w:numPr>
+          <w:ilvl w:val="0"/>
+          <w:numId w:val="2"/>
+        </w:numPr>
+        <w:spacing w:after="80" w:before="0"/>
+      </w:pPr>
+      <w:r>
+        <w:rPr>
+          <w:rFonts w:ascii="Arial" w:cs="Arial" w:eastAsia="Arial" w:hAnsi="Arial"/>
+          <w:color w:val="222222"/>
+          <w:sz w:val="22"/>
+          <w:szCs w:val="22"/>
+        </w:rPr>
+        <w:t xml:space="preserve">Share your modified version with others.</w:t>
+      </w:r>
+    </w:p>
+    <w:p>
+      <w:pPr>
+        <w:pStyle w:val="ListParagraph"/>
+        <w:numPr>
+          <w:ilvl w:val="0"/>
+          <w:numId w:val="2"/>
+        </w:numPr>
+        <w:spacing w:after="80" w:before="0"/>
+      </w:pPr>
+      <w:r>
+        <w:rPr>
+          <w:rFonts w:ascii="Arial" w:cs="Arial" w:eastAsia="Arial" w:hAnsi="Arial"/>
+          <w:color w:val="222222"/>
+          <w:sz w:val="22"/>
+          <w:szCs w:val="22"/>
+        </w:rPr>
+        <w:t xml:space="preserve">Include it as part of a paid product or service.</w:t>
       </w:r>
     </w:p>
     <w:p>
       <w:pPr>
         <w:spacing w:after="120" w:before="0"/>
+      </w:pPr>
+    </w:p>
+    <w:p>
+      <w:pPr>
+        <w:pStyle w:val="Heading2"/>
+        <w:spacing w:after="120" w:before="280"/>
+      </w:pPr>
+      <w:r>
+        <w:rPr>
+          <w:rFonts w:ascii="Arial" w:cs="Arial" w:eastAsia="Arial" w:hAnsi="Arial"/>
+          <w:b/>
+          <w:bCs/>
+          <w:color w:val="4300EC"/>
+          <w:sz w:val="26"/>
+          <w:szCs w:val="26"/>
+        </w:rPr>
+        <w:t xml:space="preserve">What you must do</w:t>
+      </w:r>
+    </w:p>
+    <w:p>
+      <w:pPr>
+        <w:spacing w:after="120" w:before="0"/>
+      </w:pPr>
+      <w:r>
+        <w:rPr>
+          <w:rFonts w:ascii="Arial" w:cs="Arial" w:eastAsia="Arial" w:hAnsi="Arial"/>
+          <w:color w:val="222222"/>
+          <w:sz w:val="22"/>
+          <w:szCs w:val="22"/>
+        </w:rPr>
+        <w:t xml:space="preserve">There is only one requirement: if you distribute the code (i.e., share it with others or publish it publicly), the original MIT License text and copyright notice must remain included somewhere in the project.</w:t>
+      </w:r>
+    </w:p>
+    <w:p>
+      <w:pPr>
+        <w:spacing w:after="80" w:before="0"/>
       </w:pPr>
     </w:p>
     <w:tbl>
@@ -8295,12 +8573,798 @@
                 <w:sz w:val="20"/>
                 <w:szCs w:val="20"/>
               </w:rPr>
-              <w:t xml:space="preserve">Tip: When asking Claude to make changes, always describe the desired outcome, not the implementation. For example, say "I want the hero to have a dark blue to purple gradient" rather than trying to specify CSS values yourself. Claude will translate your intent into code.</w:t>
+              <w:t xml:space="preserve">In practice, this means: keep the LICENSE file in the repository. That's it. The file contains the copyright notice "Copyright (c) 2026 Companyon Ventures" and the license terms. As long as that file stays in the repo, you're fully compliant.</w:t>
             </w:r>
           </w:p>
         </w:tc>
       </w:tr>
     </w:tbl>
+    <w:p>
+      <w:pPr>
+        <w:spacing w:after="120" w:before="0"/>
+      </w:pPr>
+    </w:p>
+    <w:p>
+      <w:pPr>
+        <w:pStyle w:val="Heading2"/>
+        <w:spacing w:after="120" w:before="280"/>
+      </w:pPr>
+      <w:r>
+        <w:rPr>
+          <w:rFonts w:ascii="Arial" w:cs="Arial" w:eastAsia="Arial" w:hAnsi="Arial"/>
+          <w:b/>
+          <w:bCs/>
+          <w:color w:val="4300EC"/>
+          <w:sz w:val="26"/>
+          <w:szCs w:val="26"/>
+        </w:rPr>
+        <w:t xml:space="preserve">What you don't have to do</w:t>
+      </w:r>
+    </w:p>
+    <w:p>
+      <w:pPr>
+        <w:pStyle w:val="ListParagraph"/>
+        <w:numPr>
+          <w:ilvl w:val="0"/>
+          <w:numId w:val="2"/>
+        </w:numPr>
+        <w:spacing w:after="80" w:before="0"/>
+      </w:pPr>
+      <w:r>
+        <w:rPr>
+          <w:rFonts w:ascii="Arial" w:cs="Arial" w:eastAsia="Arial" w:hAnsi="Arial"/>
+          <w:color w:val="222222"/>
+          <w:sz w:val="22"/>
+          <w:szCs w:val="22"/>
+        </w:rPr>
+        <w:t xml:space="preserve">You don't have to pay anything.</w:t>
+      </w:r>
+    </w:p>
+    <w:p>
+      <w:pPr>
+        <w:pStyle w:val="ListParagraph"/>
+        <w:numPr>
+          <w:ilvl w:val="0"/>
+          <w:numId w:val="2"/>
+        </w:numPr>
+        <w:spacing w:after="80" w:before="0"/>
+      </w:pPr>
+      <w:r>
+        <w:rPr>
+          <w:rFonts w:ascii="Arial" w:cs="Arial" w:eastAsia="Arial" w:hAnsi="Arial"/>
+          <w:color w:val="222222"/>
+          <w:sz w:val="22"/>
+          <w:szCs w:val="22"/>
+        </w:rPr>
+        <w:t xml:space="preserve">You don't have to ask for permission before using or forking it.</w:t>
+      </w:r>
+    </w:p>
+    <w:p>
+      <w:pPr>
+        <w:pStyle w:val="ListParagraph"/>
+        <w:numPr>
+          <w:ilvl w:val="0"/>
+          <w:numId w:val="2"/>
+        </w:numPr>
+        <w:spacing w:after="80" w:before="0"/>
+      </w:pPr>
+      <w:r>
+        <w:rPr>
+          <w:rFonts w:ascii="Arial" w:cs="Arial" w:eastAsia="Arial" w:hAnsi="Arial"/>
+          <w:color w:val="222222"/>
+          <w:sz w:val="22"/>
+          <w:szCs w:val="22"/>
+        </w:rPr>
+        <w:t xml:space="preserve">You don't have to share your changes back (though we'd love it if you did — see Contributing below).</w:t>
+      </w:r>
+    </w:p>
+    <w:p>
+      <w:pPr>
+        <w:pStyle w:val="ListParagraph"/>
+        <w:numPr>
+          <w:ilvl w:val="0"/>
+          <w:numId w:val="2"/>
+        </w:numPr>
+        <w:spacing w:after="80" w:before="0"/>
+      </w:pPr>
+      <w:r>
+        <w:rPr>
+          <w:rFonts w:ascii="Arial" w:cs="Arial" w:eastAsia="Arial" w:hAnsi="Arial"/>
+          <w:color w:val="222222"/>
+          <w:sz w:val="22"/>
+          <w:szCs w:val="22"/>
+        </w:rPr>
+        <w:t xml:space="preserve">You don't have to credit Companyon Ventures in your UI, documentation, or marketing (though the LICENSE file must stay in the repo as noted above).</w:t>
+      </w:r>
+    </w:p>
+    <w:p>
+      <w:pPr>
+        <w:spacing w:after="120" w:before="0"/>
+      </w:pPr>
+    </w:p>
+    <w:p>
+      <w:pPr>
+        <w:pStyle w:val="Heading2"/>
+        <w:spacing w:after="120" w:before="280"/>
+      </w:pPr>
+      <w:r>
+        <w:rPr>
+          <w:rFonts w:ascii="Arial" w:cs="Arial" w:eastAsia="Arial" w:hAnsi="Arial"/>
+          <w:b/>
+          <w:bCs/>
+          <w:color w:val="4300EC"/>
+          <w:sz w:val="26"/>
+          <w:szCs w:val="26"/>
+        </w:rPr>
+        <w:t xml:space="preserve">What Companyon Ventures gets</w:t>
+      </w:r>
+    </w:p>
+    <w:p>
+      <w:pPr>
+        <w:spacing w:after="120" w:before="0"/>
+      </w:pPr>
+      <w:r>
+        <w:rPr>
+          <w:rFonts w:ascii="Arial" w:cs="Arial" w:eastAsia="Arial" w:hAnsi="Arial"/>
+          <w:color w:val="222222"/>
+          <w:sz w:val="22"/>
+          <w:szCs w:val="22"/>
+        </w:rPr>
+        <w:t xml:space="preserve">By open-sourcing this, Companyon Ventures gets visibility and community around a useful tool. The MIT license ensures their name stays attached to the origin of the project permanently — every fork carries "Copyright (c) 2026 Companyon Ventures" in the LICENSE file — while giving the community maximum freedom to use and build on it.</w:t>
+      </w:r>
+    </w:p>
+    <w:p>
+      <w:pPr>
+        <w:spacing w:after="80" w:before="0"/>
+      </w:pPr>
+    </w:p>
+    <w:p>
+      <w:pPr>
+        <w:spacing w:after="120" w:before="0"/>
+      </w:pPr>
+      <w:r>
+        <w:rPr>
+          <w:rFonts w:ascii="Arial" w:cs="Arial" w:eastAsia="Arial" w:hAnsi="Arial"/>
+          <w:color w:val="222222"/>
+          <w:sz w:val="22"/>
+          <w:szCs w:val="22"/>
+        </w:rPr>
+        <w:t xml:space="preserve">This is intentional: the goal is broad adoption and contribution, not control.</w:t>
+      </w:r>
+    </w:p>
+    <w:p>
+      <w:pPr>
+        <w:spacing w:after="120" w:before="0"/>
+      </w:pPr>
+    </w:p>
+    <w:p>
+      <w:pPr>
+        <w:pStyle w:val="Heading2"/>
+        <w:spacing w:after="120" w:before="280"/>
+      </w:pPr>
+      <w:r>
+        <w:rPr>
+          <w:rFonts w:ascii="Arial" w:cs="Arial" w:eastAsia="Arial" w:hAnsi="Arial"/>
+          <w:b/>
+          <w:bCs/>
+          <w:color w:val="4300EC"/>
+          <w:sz w:val="26"/>
+          <w:szCs w:val="26"/>
+        </w:rPr>
+        <w:t xml:space="preserve">The full legal text</w:t>
+      </w:r>
+    </w:p>
+    <w:p>
+      <w:pPr>
+        <w:spacing w:after="120" w:before="0"/>
+      </w:pPr>
+      <w:r>
+        <w:rPr>
+          <w:rFonts w:ascii="Arial" w:cs="Arial" w:eastAsia="Arial" w:hAnsi="Arial"/>
+          <w:color w:val="222222"/>
+          <w:sz w:val="22"/>
+          <w:szCs w:val="22"/>
+        </w:rPr>
+        <w:t xml:space="preserve">For reference, the complete MIT License text (stored in the LICENSE file in the repository):</w:t>
+      </w:r>
+    </w:p>
+    <w:p>
+      <w:pPr>
+        <w:spacing w:after="80" w:before="0"/>
+      </w:pPr>
+    </w:p>
+    <w:p>
+      <w:pPr>
+        <w:spacing w:after="40" w:before="40"/>
+        <w:ind w:left="360"/>
+      </w:pPr>
+      <w:r>
+        <w:rPr>
+          <w:rFonts w:ascii="Courier New" w:cs="Courier New" w:eastAsia="Courier New" w:hAnsi="Courier New"/>
+          <w:color w:val="1a1a1a"/>
+          <w:sz w:val="18"/>
+          <w:szCs w:val="18"/>
+        </w:rPr>
+        <w:t xml:space="preserve">MIT License</w:t>
+      </w:r>
+    </w:p>
+    <w:p>
+      <w:pPr>
+        <w:spacing w:after="40" w:before="40"/>
+        <w:ind w:left="360"/>
+      </w:pPr>
+      <w:r>
+        <w:rPr>
+          <w:rFonts w:ascii="Courier New" w:cs="Courier New" w:eastAsia="Courier New" w:hAnsi="Courier New"/>
+          <w:color w:val="1a1a1a"/>
+          <w:sz w:val="18"/>
+          <w:szCs w:val="18"/>
+        </w:rPr>
+        <w:t xml:space="preserve"/>
+      </w:r>
+    </w:p>
+    <w:p>
+      <w:pPr>
+        <w:spacing w:after="40" w:before="40"/>
+        <w:ind w:left="360"/>
+      </w:pPr>
+      <w:r>
+        <w:rPr>
+          <w:rFonts w:ascii="Courier New" w:cs="Courier New" w:eastAsia="Courier New" w:hAnsi="Courier New"/>
+          <w:color w:val="1a1a1a"/>
+          <w:sz w:val="18"/>
+          <w:szCs w:val="18"/>
+        </w:rPr>
+        <w:t xml:space="preserve">Copyright (c) 2026 Companyon Ventures</w:t>
+      </w:r>
+    </w:p>
+    <w:p>
+      <w:pPr>
+        <w:spacing w:after="40" w:before="40"/>
+        <w:ind w:left="360"/>
+      </w:pPr>
+      <w:r>
+        <w:rPr>
+          <w:rFonts w:ascii="Courier New" w:cs="Courier New" w:eastAsia="Courier New" w:hAnsi="Courier New"/>
+          <w:color w:val="1a1a1a"/>
+          <w:sz w:val="18"/>
+          <w:szCs w:val="18"/>
+        </w:rPr>
+        <w:t xml:space="preserve"/>
+      </w:r>
+    </w:p>
+    <w:p>
+      <w:pPr>
+        <w:spacing w:after="40" w:before="40"/>
+        <w:ind w:left="360"/>
+      </w:pPr>
+      <w:r>
+        <w:rPr>
+          <w:rFonts w:ascii="Courier New" w:cs="Courier New" w:eastAsia="Courier New" w:hAnsi="Courier New"/>
+          <w:color w:val="1a1a1a"/>
+          <w:sz w:val="18"/>
+          <w:szCs w:val="18"/>
+        </w:rPr>
+        <w:t xml:space="preserve">Permission is hereby granted, free of charge, to any person obtaining</w:t>
+      </w:r>
+    </w:p>
+    <w:p>
+      <w:pPr>
+        <w:spacing w:after="40" w:before="40"/>
+        <w:ind w:left="360"/>
+      </w:pPr>
+      <w:r>
+        <w:rPr>
+          <w:rFonts w:ascii="Courier New" w:cs="Courier New" w:eastAsia="Courier New" w:hAnsi="Courier New"/>
+          <w:color w:val="1a1a1a"/>
+          <w:sz w:val="18"/>
+          <w:szCs w:val="18"/>
+        </w:rPr>
+        <w:t xml:space="preserve">a copy of this software and associated documentation files (the</w:t>
+      </w:r>
+    </w:p>
+    <w:p>
+      <w:pPr>
+        <w:spacing w:after="40" w:before="40"/>
+        <w:ind w:left="360"/>
+      </w:pPr>
+      <w:r>
+        <w:rPr>
+          <w:rFonts w:ascii="Courier New" w:cs="Courier New" w:eastAsia="Courier New" w:hAnsi="Courier New"/>
+          <w:color w:val="1a1a1a"/>
+          <w:sz w:val="18"/>
+          <w:szCs w:val="18"/>
+        </w:rPr>
+        <w:t xml:space="preserve">"Software"), to deal in the Software without restriction, including</w:t>
+      </w:r>
+    </w:p>
+    <w:p>
+      <w:pPr>
+        <w:spacing w:after="40" w:before="40"/>
+        <w:ind w:left="360"/>
+      </w:pPr>
+      <w:r>
+        <w:rPr>
+          <w:rFonts w:ascii="Courier New" w:cs="Courier New" w:eastAsia="Courier New" w:hAnsi="Courier New"/>
+          <w:color w:val="1a1a1a"/>
+          <w:sz w:val="18"/>
+          <w:szCs w:val="18"/>
+        </w:rPr>
+        <w:t xml:space="preserve">without limitation the rights to use, copy, modify, merge, publish,</w:t>
+      </w:r>
+    </w:p>
+    <w:p>
+      <w:pPr>
+        <w:spacing w:after="40" w:before="40"/>
+        <w:ind w:left="360"/>
+      </w:pPr>
+      <w:r>
+        <w:rPr>
+          <w:rFonts w:ascii="Courier New" w:cs="Courier New" w:eastAsia="Courier New" w:hAnsi="Courier New"/>
+          <w:color w:val="1a1a1a"/>
+          <w:sz w:val="18"/>
+          <w:szCs w:val="18"/>
+        </w:rPr>
+        <w:t xml:space="preserve">distribute, sublicense, and/or sell copies of the Software, and to</w:t>
+      </w:r>
+    </w:p>
+    <w:p>
+      <w:pPr>
+        <w:spacing w:after="40" w:before="40"/>
+        <w:ind w:left="360"/>
+      </w:pPr>
+      <w:r>
+        <w:rPr>
+          <w:rFonts w:ascii="Courier New" w:cs="Courier New" w:eastAsia="Courier New" w:hAnsi="Courier New"/>
+          <w:color w:val="1a1a1a"/>
+          <w:sz w:val="18"/>
+          <w:szCs w:val="18"/>
+        </w:rPr>
+        <w:t xml:space="preserve">permit persons to whom the Software is furnished to do so, subject to</w:t>
+      </w:r>
+    </w:p>
+    <w:p>
+      <w:pPr>
+        <w:spacing w:after="40" w:before="40"/>
+        <w:ind w:left="360"/>
+      </w:pPr>
+      <w:r>
+        <w:rPr>
+          <w:rFonts w:ascii="Courier New" w:cs="Courier New" w:eastAsia="Courier New" w:hAnsi="Courier New"/>
+          <w:color w:val="1a1a1a"/>
+          <w:sz w:val="18"/>
+          <w:szCs w:val="18"/>
+        </w:rPr>
+        <w:t xml:space="preserve">the following conditions:</w:t>
+      </w:r>
+    </w:p>
+    <w:p>
+      <w:pPr>
+        <w:spacing w:after="40" w:before="40"/>
+        <w:ind w:left="360"/>
+      </w:pPr>
+      <w:r>
+        <w:rPr>
+          <w:rFonts w:ascii="Courier New" w:cs="Courier New" w:eastAsia="Courier New" w:hAnsi="Courier New"/>
+          <w:color w:val="1a1a1a"/>
+          <w:sz w:val="18"/>
+          <w:szCs w:val="18"/>
+        </w:rPr>
+        <w:t xml:space="preserve"/>
+      </w:r>
+    </w:p>
+    <w:p>
+      <w:pPr>
+        <w:spacing w:after="40" w:before="40"/>
+        <w:ind w:left="360"/>
+      </w:pPr>
+      <w:r>
+        <w:rPr>
+          <w:rFonts w:ascii="Courier New" w:cs="Courier New" w:eastAsia="Courier New" w:hAnsi="Courier New"/>
+          <w:color w:val="1a1a1a"/>
+          <w:sz w:val="18"/>
+          <w:szCs w:val="18"/>
+        </w:rPr>
+        <w:t xml:space="preserve">The above copyright notice and this permission notice shall be included</w:t>
+      </w:r>
+    </w:p>
+    <w:p>
+      <w:pPr>
+        <w:spacing w:after="40" w:before="40"/>
+        <w:ind w:left="360"/>
+      </w:pPr>
+      <w:r>
+        <w:rPr>
+          <w:rFonts w:ascii="Courier New" w:cs="Courier New" w:eastAsia="Courier New" w:hAnsi="Courier New"/>
+          <w:color w:val="1a1a1a"/>
+          <w:sz w:val="18"/>
+          <w:szCs w:val="18"/>
+        </w:rPr>
+        <w:t xml:space="preserve">in all copies or substantial portions of the Software.</w:t>
+      </w:r>
+    </w:p>
+    <w:p>
+      <w:pPr>
+        <w:spacing w:after="40" w:before="40"/>
+        <w:ind w:left="360"/>
+      </w:pPr>
+      <w:r>
+        <w:rPr>
+          <w:rFonts w:ascii="Courier New" w:cs="Courier New" w:eastAsia="Courier New" w:hAnsi="Courier New"/>
+          <w:color w:val="1a1a1a"/>
+          <w:sz w:val="18"/>
+          <w:szCs w:val="18"/>
+        </w:rPr>
+        <w:t xml:space="preserve"/>
+      </w:r>
+    </w:p>
+    <w:p>
+      <w:pPr>
+        <w:spacing w:after="40" w:before="40"/>
+        <w:ind w:left="360"/>
+      </w:pPr>
+      <w:r>
+        <w:rPr>
+          <w:rFonts w:ascii="Courier New" w:cs="Courier New" w:eastAsia="Courier New" w:hAnsi="Courier New"/>
+          <w:color w:val="1a1a1a"/>
+          <w:sz w:val="18"/>
+          <w:szCs w:val="18"/>
+        </w:rPr>
+        <w:t xml:space="preserve">THE SOFTWARE IS PROVIDED "AS IS", WITHOUT WARRANTY OF ANY KIND,</w:t>
+      </w:r>
+    </w:p>
+    <w:p>
+      <w:pPr>
+        <w:spacing w:after="40" w:before="40"/>
+        <w:ind w:left="360"/>
+      </w:pPr>
+      <w:r>
+        <w:rPr>
+          <w:rFonts w:ascii="Courier New" w:cs="Courier New" w:eastAsia="Courier New" w:hAnsi="Courier New"/>
+          <w:color w:val="1a1a1a"/>
+          <w:sz w:val="18"/>
+          <w:szCs w:val="18"/>
+        </w:rPr>
+        <w:t xml:space="preserve">EXPRESS OR IMPLIED, INCLUDING BUT NOT LIMITED TO THE WARRANTIES OF</w:t>
+      </w:r>
+    </w:p>
+    <w:p>
+      <w:pPr>
+        <w:spacing w:after="40" w:before="40"/>
+        <w:ind w:left="360"/>
+      </w:pPr>
+      <w:r>
+        <w:rPr>
+          <w:rFonts w:ascii="Courier New" w:cs="Courier New" w:eastAsia="Courier New" w:hAnsi="Courier New"/>
+          <w:color w:val="1a1a1a"/>
+          <w:sz w:val="18"/>
+          <w:szCs w:val="18"/>
+        </w:rPr>
+        <w:t xml:space="preserve">MERCHANTABILITY, FITNESS FOR A PARTICULAR PURPOSE AND NONINFRINGEMENT.</w:t>
+      </w:r>
+    </w:p>
+    <w:p>
+      <w:pPr>
+        <w:spacing w:after="40" w:before="40"/>
+        <w:ind w:left="360"/>
+      </w:pPr>
+      <w:r>
+        <w:rPr>
+          <w:rFonts w:ascii="Courier New" w:cs="Courier New" w:eastAsia="Courier New" w:hAnsi="Courier New"/>
+          <w:color w:val="1a1a1a"/>
+          <w:sz w:val="18"/>
+          <w:szCs w:val="18"/>
+        </w:rPr>
+        <w:t xml:space="preserve">IN NO EVENT SHALL THE AUTHORS OR COPYRIGHT HOLDERS BE LIABLE FOR ANY</w:t>
+      </w:r>
+    </w:p>
+    <w:p>
+      <w:pPr>
+        <w:spacing w:after="40" w:before="40"/>
+        <w:ind w:left="360"/>
+      </w:pPr>
+      <w:r>
+        <w:rPr>
+          <w:rFonts w:ascii="Courier New" w:cs="Courier New" w:eastAsia="Courier New" w:hAnsi="Courier New"/>
+          <w:color w:val="1a1a1a"/>
+          <w:sz w:val="18"/>
+          <w:szCs w:val="18"/>
+        </w:rPr>
+        <w:t xml:space="preserve">CLAIM, DAMAGES OR OTHER LIABILITY, WHETHER IN AN ACTION OF CONTRACT,</w:t>
+      </w:r>
+    </w:p>
+    <w:p>
+      <w:pPr>
+        <w:spacing w:after="40" w:before="40"/>
+        <w:ind w:left="360"/>
+      </w:pPr>
+      <w:r>
+        <w:rPr>
+          <w:rFonts w:ascii="Courier New" w:cs="Courier New" w:eastAsia="Courier New" w:hAnsi="Courier New"/>
+          <w:color w:val="1a1a1a"/>
+          <w:sz w:val="18"/>
+          <w:szCs w:val="18"/>
+        </w:rPr>
+        <w:t xml:space="preserve">TORT OR OTHERWISE, ARISING FROM, OUT OF OR IN CONNECTION WITH THE</w:t>
+      </w:r>
+    </w:p>
+    <w:p>
+      <w:pPr>
+        <w:spacing w:after="40" w:before="40"/>
+        <w:ind w:left="360"/>
+      </w:pPr>
+      <w:r>
+        <w:rPr>
+          <w:rFonts w:ascii="Courier New" w:cs="Courier New" w:eastAsia="Courier New" w:hAnsi="Courier New"/>
+          <w:color w:val="1a1a1a"/>
+          <w:sz w:val="18"/>
+          <w:szCs w:val="18"/>
+        </w:rPr>
+        <w:t xml:space="preserve">SOFTWARE OR THE USE OR OTHER DEALINGS IN THE SOFTWARE.</w:t>
+      </w:r>
+    </w:p>
+    <w:p>
+      <w:pPr>
+        <w:spacing w:after="80" w:before="0"/>
+      </w:pPr>
+    </w:p>
+    <w:p>
+      <w:pPr>
+        <w:spacing w:after="120" w:before="0"/>
+      </w:pPr>
+      <w:r>
+        <w:rPr>
+          <w:rFonts w:ascii="Arial" w:cs="Arial" w:eastAsia="Arial" w:hAnsi="Arial"/>
+          <w:i/>
+          <w:iCs/>
+          <w:color w:val="555555"/>
+          <w:sz w:val="22"/>
+          <w:szCs w:val="22"/>
+        </w:rPr>
+        <w:t xml:space="preserve">In everyday terms: "Do what you want with this. Just keep this notice. We're not responsible if something goes wrong."</w:t>
+      </w:r>
+    </w:p>
+    <w:p>
+      <w:pPr>
+        <w:spacing w:after="200" w:before="0"/>
+      </w:pPr>
+    </w:p>
+    <w:p>
+      <w:pPr>
+        <w:pBdr>
+          <w:bottom w:val="single" w:color="CCCCCC" w:sz="4" w:space="1"/>
+        </w:pBdr>
+        <w:spacing w:after="200" w:before="200"/>
+      </w:pPr>
+    </w:p>
+    <w:p>
+      <w:r>
+        <w:br w:type="page"/>
+      </w:r>
+    </w:p>
+    <w:p>
+      <w:pPr>
+        <w:pStyle w:val="Heading1"/>
+        <w:spacing w:after="160" w:before="360"/>
+      </w:pPr>
+      <w:r>
+        <w:rPr>
+          <w:rFonts w:ascii="Arial" w:cs="Arial" w:eastAsia="Arial" w:hAnsi="Arial"/>
+          <w:b/>
+          <w:bCs/>
+          <w:color w:val="1A3A6B"/>
+          <w:sz w:val="32"/>
+          <w:szCs w:val="32"/>
+        </w:rPr>
+        <w:t xml:space="preserve">Contributing Back to the Project</w:t>
+      </w:r>
+    </w:p>
+    <w:p>
+      <w:pPr>
+        <w:spacing w:after="120" w:before="0"/>
+      </w:pPr>
+    </w:p>
+    <w:p>
+      <w:pPr>
+        <w:spacing w:after="120" w:before="0"/>
+      </w:pPr>
+      <w:r>
+        <w:rPr>
+          <w:rFonts w:ascii="Arial" w:cs="Arial" w:eastAsia="Arial" w:hAnsi="Arial"/>
+          <w:color w:val="222222"/>
+          <w:sz w:val="22"/>
+          <w:szCs w:val="22"/>
+        </w:rPr>
+        <w:t xml:space="preserve">You're not required to contribute back, but if you add a scraper for a new hiring platform or fix a bug, sharing it benefits every other firm using this codebase — and raises the profile of your fork.</w:t>
+      </w:r>
+    </w:p>
+    <w:p>
+      <w:pPr>
+        <w:spacing w:after="120" w:before="0"/>
+      </w:pPr>
+    </w:p>
+    <w:p>
+      <w:pPr>
+        <w:pStyle w:val="Heading2"/>
+        <w:spacing w:after="120" w:before="280"/>
+      </w:pPr>
+      <w:r>
+        <w:rPr>
+          <w:rFonts w:ascii="Arial" w:cs="Arial" w:eastAsia="Arial" w:hAnsi="Arial"/>
+          <w:b/>
+          <w:bCs/>
+          <w:color w:val="4300EC"/>
+          <w:sz w:val="26"/>
+          <w:szCs w:val="26"/>
+        </w:rPr>
+        <w:t xml:space="preserve">The most impactful contribution: a new ATS scraper</w:t>
+      </w:r>
+    </w:p>
+    <w:p>
+      <w:pPr>
+        <w:spacing w:after="120" w:before="0"/>
+      </w:pPr>
+      <w:r>
+        <w:rPr>
+          <w:rFonts w:ascii="Arial" w:cs="Arial" w:eastAsia="Arial" w:hAnsi="Arial"/>
+          <w:color w:val="222222"/>
+          <w:sz w:val="22"/>
+          <w:szCs w:val="22"/>
+        </w:rPr>
+        <w:t xml:space="preserve">Every new hiring platform scraper immediately makes the job board useful to firms whose portfolio companies use that platform. If Claude writes one for you (see the Troubleshooting section), contributing it takes just a few minutes.</w:t>
+      </w:r>
+    </w:p>
+    <w:p>
+      <w:pPr>
+        <w:spacing w:after="100" w:before="0"/>
+      </w:pPr>
+    </w:p>
+    <w:tbl>
+      <w:tblPr>
+        <w:tblW w:type="dxa" w:w="9360"/>
+        <w:tblBorders>
+          <w:top w:val="none" w:color="FFFFFF" w:sz="0"/>
+          <w:left w:val="none" w:color="FFFFFF" w:sz="0"/>
+          <w:bottom w:val="none" w:color="FFFFFF" w:sz="0"/>
+          <w:right w:val="none" w:color="FFFFFF" w:sz="0"/>
+          <w:insideH w:val="single" w:color="auto" w:sz="4"/>
+          <w:insideV w:val="single" w:color="auto" w:sz="4"/>
+        </w:tblBorders>
+      </w:tblPr>
+      <w:tblGrid>
+        <w:gridCol w:w="9360"/>
+      </w:tblGrid>
+      <w:tr>
+        <w:tc>
+          <w:tcPr>
+            <w:tcW w:type="dxa" w:w="9360"/>
+            <w:tcBorders>
+              <w:top w:val="none" w:color="FFFFFF" w:sz="0"/>
+              <w:left w:val="single" w:color="D97706" w:sz="12"/>
+              <w:bottom w:val="none" w:color="FFFFFF" w:sz="0"/>
+              <w:right w:val="none" w:color="FFFFFF" w:sz="0"/>
+            </w:tcBorders>
+            <w:shd w:fill="FFF8E7" w:val="clear"/>
+            <w:tcMar>
+              <w:top w:type="dxa" w:w="80"/>
+              <w:left w:type="dxa" w:w="200"/>
+              <w:bottom w:type="dxa" w:w="80"/>
+              <w:right w:type="dxa" w:w="120"/>
+            </w:tcMar>
+          </w:tcPr>
+          <w:p>
+            <w:pPr>
+              <w:spacing w:after="40" w:before="0"/>
+            </w:pPr>
+            <w:r>
+              <w:rPr>
+                <w:rFonts w:ascii="Arial" w:cs="Arial" w:eastAsia="Arial" w:hAnsi="Arial"/>
+                <w:b/>
+                <w:bCs/>
+                <w:color w:val="D97706"/>
+                <w:sz w:val="20"/>
+                <w:szCs w:val="20"/>
+              </w:rPr>
+              <w:t xml:space="preserve">✦ Claude Tip</w:t>
+            </w:r>
+          </w:p>
+          <w:p>
+            <w:pPr>
+              <w:spacing w:after="0" w:before="0"/>
+            </w:pPr>
+            <w:r>
+              <w:rPr>
+                <w:rFonts w:ascii="Arial" w:cs="Arial" w:eastAsia="Arial" w:hAnsi="Arial"/>
+                <w:color w:val="1a1a1a"/>
+                <w:sz w:val="20"/>
+                <w:szCs w:val="20"/>
+              </w:rPr>
+              <w:t xml:space="preserve">"I just added a scraper for [Platform Name] and it's working. How do I submit it as a pull request to the original portfolio-jobs repository on GitHub?"
+Claude will walk you through creating a branch, opening a pull request from GitHub Desktop, and writing a clear PR description. No command line required.</w:t>
+            </w:r>
+          </w:p>
+        </w:tc>
+      </w:tr>
+    </w:tbl>
+    <w:p>
+      <w:pPr>
+        <w:spacing w:after="120" w:before="0"/>
+      </w:pPr>
+    </w:p>
+    <w:p>
+      <w:pPr>
+        <w:pStyle w:val="Heading2"/>
+        <w:spacing w:after="120" w:before="280"/>
+      </w:pPr>
+      <w:r>
+        <w:rPr>
+          <w:rFonts w:ascii="Arial" w:cs="Arial" w:eastAsia="Arial" w:hAnsi="Arial"/>
+          <w:b/>
+          <w:bCs/>
+          <w:color w:val="4300EC"/>
+          <w:sz w:val="26"/>
+          <w:szCs w:val="26"/>
+        </w:rPr>
+        <w:t xml:space="preserve">Other ways to contribute</w:t>
+      </w:r>
+    </w:p>
+    <w:p>
+      <w:pPr>
+        <w:pStyle w:val="ListParagraph"/>
+        <w:numPr>
+          <w:ilvl w:val="0"/>
+          <w:numId w:val="2"/>
+        </w:numPr>
+        <w:spacing w:after="80" w:before="0"/>
+      </w:pPr>
+      <w:r>
+        <w:rPr>
+          <w:rFonts w:ascii="Arial" w:cs="Arial" w:eastAsia="Arial" w:hAnsi="Arial"/>
+          <w:color w:val="222222"/>
+          <w:sz w:val="22"/>
+          <w:szCs w:val="22"/>
+        </w:rPr>
+        <w:t xml:space="preserve">Location and department aliases — if the filter dropdowns show duplicate or noisy values, a one-line alias fix is an easy PR.</w:t>
+      </w:r>
+    </w:p>
+    <w:p>
+      <w:pPr>
+        <w:pStyle w:val="ListParagraph"/>
+        <w:numPr>
+          <w:ilvl w:val="0"/>
+          <w:numId w:val="2"/>
+        </w:numPr>
+        <w:spacing w:after="80" w:before="0"/>
+      </w:pPr>
+      <w:r>
+        <w:rPr>
+          <w:rFonts w:ascii="Arial" w:cs="Arial" w:eastAsia="Arial" w:hAnsi="Arial"/>
+          <w:color w:val="222222"/>
+          <w:sz w:val="22"/>
+          <w:szCs w:val="22"/>
+        </w:rPr>
+        <w:t xml:space="preserve">Bug reports — if something breaks, open an issue on GitHub describing what you were doing and what happened.</w:t>
+      </w:r>
+    </w:p>
+    <w:p>
+      <w:pPr>
+        <w:pStyle w:val="ListParagraph"/>
+        <w:numPr>
+          <w:ilvl w:val="0"/>
+          <w:numId w:val="2"/>
+        </w:numPr>
+        <w:spacing w:after="80" w:before="0"/>
+      </w:pPr>
+      <w:r>
+        <w:rPr>
+          <w:rFonts w:ascii="Arial" w:cs="Arial" w:eastAsia="Arial" w:hAnsi="Arial"/>
+          <w:color w:val="222222"/>
+          <w:sz w:val="22"/>
+          <w:szCs w:val="22"/>
+        </w:rPr>
+        <w:t xml:space="preserve">Documentation — corrections and additions to the README or SETUP guide are always welcome.</w:t>
+      </w:r>
+    </w:p>
     <w:p>
       <w:pPr>
         <w:spacing w:after="200" w:before="0"/>
@@ -8512,7 +9576,7 @@
                 <w:sz w:val="20"/>
                 <w:szCs w:val="20"/>
               </w:rPr>
-              <w:t xml:space="preserve">Page structure and SEO meta tags. Edit this for branding changes.</w:t>
+              <w:t xml:space="preserve">Page structure and SEO meta tags. Edit FORK: comments for branding.</w:t>
             </w:r>
           </w:p>
         </w:tc>
@@ -8722,7 +9786,7 @@
                 <w:sz w:val="20"/>
                 <w:szCs w:val="20"/>
               </w:rPr>
-              <w:t xml:space="preserve">The server-side function that fetches jobs from all ATS platforms.</w:t>
+              <w:t xml:space="preserve">Server-side function that fetches jobs from all ATS platforms.</w:t>
             </w:r>
           </w:p>
         </w:tc>
@@ -8863,6 +9927,146 @@
                 <w:szCs w:val="20"/>
               </w:rPr>
               <w:t xml:space="preserve">Detailed technical setup guide.</w:t>
+            </w:r>
+          </w:p>
+        </w:tc>
+      </w:tr>
+      <w:tr>
+        <w:tc>
+          <w:tcPr>
+            <w:tcW w:type="dxa" w:w="2400"/>
+            <w:tcBorders>
+              <w:top w:val="single" w:color="CCCCCC" w:sz="1"/>
+              <w:left w:val="single" w:color="CCCCCC" w:sz="1"/>
+              <w:bottom w:val="single" w:color="CCCCCC" w:sz="1"/>
+              <w:right w:val="single" w:color="CCCCCC" w:sz="1"/>
+            </w:tcBorders>
+            <w:shd w:fill="FFFFFF" w:val="clear"/>
+            <w:tcMar>
+              <w:top w:type="dxa" w:w="80"/>
+              <w:left w:type="dxa" w:w="120"/>
+              <w:bottom w:type="dxa" w:w="80"/>
+              <w:right w:type="dxa" w:w="120"/>
+            </w:tcMar>
+          </w:tcPr>
+          <w:p>
+            <w:pPr>
+              <w:spacing w:after="0" w:before="0"/>
+            </w:pPr>
+            <w:r>
+              <w:rPr>
+                <w:rFonts w:ascii="Arial" w:cs="Arial" w:eastAsia="Arial" w:hAnsi="Arial"/>
+                <w:b w:val="false"/>
+                <w:bCs w:val="false"/>
+                <w:color w:val="222222"/>
+                <w:sz w:val="20"/>
+                <w:szCs w:val="20"/>
+              </w:rPr>
+              <w:t xml:space="preserve">CONTRIBUTING.md</w:t>
+            </w:r>
+          </w:p>
+        </w:tc>
+        <w:tc>
+          <w:tcPr>
+            <w:tcW w:type="dxa" w:w="6960"/>
+            <w:tcBorders>
+              <w:top w:val="single" w:color="CCCCCC" w:sz="1"/>
+              <w:left w:val="single" w:color="CCCCCC" w:sz="1"/>
+              <w:bottom w:val="single" w:color="CCCCCC" w:sz="1"/>
+              <w:right w:val="single" w:color="CCCCCC" w:sz="1"/>
+            </w:tcBorders>
+            <w:shd w:fill="FFFFFF" w:val="clear"/>
+            <w:tcMar>
+              <w:top w:type="dxa" w:w="80"/>
+              <w:left w:type="dxa" w:w="120"/>
+              <w:bottom w:type="dxa" w:w="80"/>
+              <w:right w:type="dxa" w:w="120"/>
+            </w:tcMar>
+          </w:tcPr>
+          <w:p>
+            <w:pPr>
+              <w:spacing w:after="0" w:before="0"/>
+            </w:pPr>
+            <w:r>
+              <w:rPr>
+                <w:rFonts w:ascii="Arial" w:cs="Arial" w:eastAsia="Arial" w:hAnsi="Arial"/>
+                <w:b w:val="false"/>
+                <w:bCs w:val="false"/>
+                <w:color w:val="222222"/>
+                <w:sz w:val="20"/>
+                <w:szCs w:val="20"/>
+              </w:rPr>
+              <w:t xml:space="preserve">Guide for contributing scrapers and fixes back to the project.</w:t>
+            </w:r>
+          </w:p>
+        </w:tc>
+      </w:tr>
+      <w:tr>
+        <w:tc>
+          <w:tcPr>
+            <w:tcW w:type="dxa" w:w="2400"/>
+            <w:tcBorders>
+              <w:top w:val="single" w:color="CCCCCC" w:sz="1"/>
+              <w:left w:val="single" w:color="CCCCCC" w:sz="1"/>
+              <w:bottom w:val="single" w:color="CCCCCC" w:sz="1"/>
+              <w:right w:val="single" w:color="CCCCCC" w:sz="1"/>
+            </w:tcBorders>
+            <w:shd w:fill="F5F5F5" w:val="clear"/>
+            <w:tcMar>
+              <w:top w:type="dxa" w:w="80"/>
+              <w:left w:type="dxa" w:w="120"/>
+              <w:bottom w:type="dxa" w:w="80"/>
+              <w:right w:type="dxa" w:w="120"/>
+            </w:tcMar>
+          </w:tcPr>
+          <w:p>
+            <w:pPr>
+              <w:spacing w:after="0" w:before="0"/>
+            </w:pPr>
+            <w:r>
+              <w:rPr>
+                <w:rFonts w:ascii="Arial" w:cs="Arial" w:eastAsia="Arial" w:hAnsi="Arial"/>
+                <w:b w:val="false"/>
+                <w:bCs w:val="false"/>
+                <w:color w:val="222222"/>
+                <w:sz w:val="20"/>
+                <w:szCs w:val="20"/>
+              </w:rPr>
+              <w:t xml:space="preserve">LICENSE</w:t>
+            </w:r>
+          </w:p>
+        </w:tc>
+        <w:tc>
+          <w:tcPr>
+            <w:tcW w:type="dxa" w:w="6960"/>
+            <w:tcBorders>
+              <w:top w:val="single" w:color="CCCCCC" w:sz="1"/>
+              <w:left w:val="single" w:color="CCCCCC" w:sz="1"/>
+              <w:bottom w:val="single" w:color="CCCCCC" w:sz="1"/>
+              <w:right w:val="single" w:color="CCCCCC" w:sz="1"/>
+            </w:tcBorders>
+            <w:shd w:fill="F5F5F5" w:val="clear"/>
+            <w:tcMar>
+              <w:top w:type="dxa" w:w="80"/>
+              <w:left w:type="dxa" w:w="120"/>
+              <w:bottom w:type="dxa" w:w="80"/>
+              <w:right w:type="dxa" w:w="120"/>
+            </w:tcMar>
+          </w:tcPr>
+          <w:p>
+            <w:pPr>
+              <w:spacing w:after="0" w:before="0"/>
+            </w:pPr>
+            <w:r>
+              <w:rPr>
+                <w:rFonts w:ascii="Arial" w:cs="Arial" w:eastAsia="Arial" w:hAnsi="Arial"/>
+                <w:b w:val="false"/>
+                <w:bCs w:val="false"/>
+                <w:color w:val="222222"/>
+                <w:sz w:val="20"/>
+                <w:szCs w:val="20"/>
+              </w:rPr>
+              <w:t xml:space="preserve">MIT License text — must remain in all forks.</w:t>
             </w:r>
           </w:p>
         </w:tc>
@@ -9478,7 +10682,7 @@
         </w:rPr>
         <w:t xml:space="preserve">Source repository: </w:t>
       </w:r>
-      <w:hyperlink w:history="1" r:id="rIdfknz1w3rqw54rswcuiz2g">
+      <w:hyperlink w:history="1" r:id="rIdapcnijvrw5ecuvk6vwxzp">
         <w:r>
           <w:rPr>
             <w:rFonts w:ascii="Arial" w:cs="Arial" w:eastAsia="Arial" w:hAnsi="Arial"/>
@@ -9505,7 +10709,7 @@
         </w:rPr>
         <w:t xml:space="preserve">GitHub Desktop: </w:t>
       </w:r>
-      <w:hyperlink w:history="1" r:id="rId80za6nf9fdrjwf7x6pimj">
+      <w:hyperlink w:history="1" r:id="rIdqord1ok9vauthk9fztrmu">
         <w:r>
           <w:rPr>
             <w:rFonts w:ascii="Arial" w:cs="Arial" w:eastAsia="Arial" w:hAnsi="Arial"/>
@@ -9532,7 +10736,7 @@
         </w:rPr>
         <w:t xml:space="preserve">Vercel: </w:t>
       </w:r>
-      <w:hyperlink w:history="1" r:id="rIdidspel2x02aekdbxqhysl">
+      <w:hyperlink w:history="1" r:id="rIdgubvaawthg53nn_gkbyx8">
         <w:r>
           <w:rPr>
             <w:rFonts w:ascii="Arial" w:cs="Arial" w:eastAsia="Arial" w:hAnsi="Arial"/>
@@ -9559,7 +10763,7 @@
         </w:rPr>
         <w:t xml:space="preserve">Google Sheets: </w:t>
       </w:r>
-      <w:hyperlink w:history="1" r:id="rIdpwrtzh0plqzrnavi4llqd">
+      <w:hyperlink w:history="1" r:id="rIdvwxwc1yeq2rmb8bwn5kwl">
         <w:r>
           <w:rPr>
             <w:rFonts w:ascii="Arial" w:cs="Arial" w:eastAsia="Arial" w:hAnsi="Arial"/>
@@ -9586,7 +10790,7 @@
         </w:rPr>
         <w:t xml:space="preserve">Favicon generator: </w:t>
       </w:r>
-      <w:hyperlink w:history="1" r:id="rIdgt7jdxwpwxpjki9hhmadc">
+      <w:hyperlink w:history="1" r:id="rIdclsxkcba8l4njhltrc_dm">
         <w:r>
           <w:rPr>
             <w:rFonts w:ascii="Arial" w:cs="Arial" w:eastAsia="Arial" w:hAnsi="Arial"/>
@@ -9601,7 +10805,7 @@
     </w:p>
     <w:p>
       <w:pPr>
-        <w:spacing w:after="80" w:before="0"/>
+        <w:spacing w:after="120" w:before="0"/>
       </w:pPr>
     </w:p>
     <w:p>
@@ -9617,7 +10821,7 @@
           <w:sz w:val="22"/>
           <w:szCs w:val="22"/>
         </w:rPr>
-        <w:t xml:space="preserve">Live example: jobs.companyon.vc</w:t>
+        <w:t xml:space="preserve">Live example: jobs.companyon.vc — Built by Companyon Ventures, coded with Claude CoWork</w:t>
       </w:r>
     </w:p>
     <w:sectPr>
@@ -9753,15 +10957,47 @@
         <w:bottom w:val="single" w:color="CCCCCC" w:sz="4" w:space="1"/>
       </w:pBdr>
       <w:spacing w:after="100" w:before="0"/>
+      <w:jc w:val="left"/>
     </w:pPr>
     <w:r>
-      <w:rPr>
-        <w:rFonts w:ascii="Arial" w:cs="Arial" w:eastAsia="Arial" w:hAnsi="Arial"/>
-        <w:color w:val="555555"/>
-        <w:sz w:val="18"/>
-        <w:szCs w:val="18"/>
-      </w:rPr>
-      <w:t xml:space="preserve">Portfolio Jobs Board — Setup Guide</w:t>
+      <w:drawing>
+        <wp:inline distT="0" distB="0" distL="0" distR="0">
+          <wp:extent cx="1428750" cy="342900"/>
+          <wp:effectExtent t="0" r="0" b="0" l="0"/>
+          <wp:docPr id="1" name="companyon-logo" descr="Companyon Ventures logo" title="Companyon Ventures"/>
+          <wp:cNvGraphicFramePr>
+            <a:graphicFrameLocks xmlns:a="http://schemas.openxmlformats.org/drawingml/2006/main" noChangeAspect="1"/>
+          </wp:cNvGraphicFramePr>
+          <a:graphic xmlns:a="http://schemas.openxmlformats.org/drawingml/2006/main">
+            <a:graphicData uri="http://schemas.openxmlformats.org/drawingml/2006/picture">
+              <pic:pic xmlns:pic="http://schemas.openxmlformats.org/drawingml/2006/picture">
+                <pic:nvPicPr>
+                  <pic:cNvPr id="0" name="" descr=""/>
+                  <pic:cNvPicPr>
+                    <a:picLocks noChangeAspect="1" noChangeArrowheads="1"/>
+                  </pic:cNvPicPr>
+                </pic:nvPicPr>
+                <pic:blipFill>
+                  <a:blip r:embed="rId0" cstate="none"/>
+                  <a:srcRect/>
+                  <a:stretch>
+                    <a:fillRect/>
+                  </a:stretch>
+                </pic:blipFill>
+                <pic:spPr bwMode="auto">
+                  <a:xfrm>
+                    <a:off x="0" y="0"/>
+                    <a:ext cx="1428750" cy="342900"/>
+                  </a:xfrm>
+                  <a:prstGeom prst="rect">
+                    <a:avLst/>
+                  </a:prstGeom>
+                </pic:spPr>
+              </pic:pic>
+            </a:graphicData>
+          </a:graphic>
+        </wp:inline>
+      </w:drawing>
     </w:r>
   </w:p>
 </w:hdr>
@@ -9866,27 +11102,6 @@
     </w:lvl>
   </w:abstractNum>
   <w:abstractNum w:abstractNumId="3" w15:restartNumberingAfterBreak="0">
-    <w:multiLevelType w:val="hybridMultilevel"/>
-    <w:lvl w:ilvl="0" w15:tentative="1">
-      <w:start w:val="1"/>
-      <w:numFmt w:val="decimal"/>
-      <w:lvlText w:val="%1."/>
-      <w:lvlJc w:val="left"/>
-      <w:pPr>
-        <w:ind w:left="640" w:hanging="360"/>
-      </w:pPr>
-    </w:lvl>
-    <w:lvl w:ilvl="1" w15:tentative="1">
-      <w:start w:val="1"/>
-      <w:numFmt w:val="lowerLetter"/>
-      <w:lvlText w:val="%2)"/>
-      <w:lvlJc w:val="left"/>
-      <w:pPr>
-        <w:ind w:left="1280" w:hanging="360"/>
-      </w:pPr>
-    </w:lvl>
-  </w:abstractNum>
-  <w:abstractNum w:abstractNumId="4" w15:restartNumberingAfterBreak="0">
     <w:multiLevelType w:val="hybridMultilevel"/>
     <w:lvl w:ilvl="0" w15:tentative="1">
       <w:start w:val="1"/>

</xml_diff>

<commit_message>
docs: update USER_GUIDE Config tab examples to use Companyon Ventures values
Replaced placeholder 'Acme Ventures' with 'Companyon Ventures' in the
Google Sheet Config tab setup table (siteTitle and footerText rows).

Co-Authored-By: Claude Sonnet 4.6 <noreply@anthropic.com>
</commit_message>
<xml_diff>
--- a/USER_GUIDE.docx
+++ b/USER_GUIDE.docx
@@ -1011,7 +1011,7 @@
         </w:rPr>
         <w:t xml:space="preserve">Go to </w:t>
       </w:r>
-      <w:hyperlink w:history="1" r:id="rIdoyhrjnnlru8oie9cyax-v">
+      <w:hyperlink w:history="1" r:id="rIda_jplgsx4mdx3xp4vavy2">
         <w:r>
           <w:rPr>
             <w:rFonts w:ascii="Arial" w:cs="Arial" w:eastAsia="Arial" w:hAnsi="Arial"/>
@@ -1556,7 +1556,7 @@
         </w:rPr>
         <w:t xml:space="preserve">Download GitHub Desktop from </w:t>
       </w:r>
-      <w:hyperlink w:history="1" r:id="rId0khhhclzrjgy7xjlgll8o">
+      <w:hyperlink w:history="1" r:id="rIdm1mzpyiarzw35-97qfthf">
         <w:r>
           <w:rPr>
             <w:rFonts w:ascii="Arial" w:cs="Arial" w:eastAsia="Arial" w:hAnsi="Arial"/>
@@ -1990,7 +1990,7 @@
         </w:rPr>
         <w:t xml:space="preserve">Go to the repository page: </w:t>
       </w:r>
-      <w:hyperlink w:history="1" r:id="rId83gojz3rgbzdo2obodcjq">
+      <w:hyperlink w:history="1" r:id="rIdmqulboquydmveefkpsuqr">
         <w:r>
           <w:rPr>
             <w:rFonts w:ascii="Arial" w:cs="Arial" w:eastAsia="Arial" w:hAnsi="Arial"/>
@@ -2434,7 +2434,7 @@
         </w:rPr>
         <w:t xml:space="preserve">Go to </w:t>
       </w:r>
-      <w:hyperlink w:history="1" r:id="rIdukc1tujoxoy6r7v6y4ard">
+      <w:hyperlink w:history="1" r:id="rIdo9tm2a9ecdofjp2ehyalj">
         <w:r>
           <w:rPr>
             <w:rFonts w:ascii="Arial" w:cs="Arial" w:eastAsia="Arial" w:hAnsi="Arial"/>
@@ -3988,7 +3988,7 @@
                 <w:sz w:val="20"/>
                 <w:szCs w:val="20"/>
               </w:rPr>
-              <w:t xml:space="preserve">Portfolio Careers | Acme Ventures</w:t>
+              <w:t xml:space="preserve">Portfolio Careers | Companyon Ventures</w:t>
             </w:r>
           </w:p>
         </w:tc>
@@ -4198,7 +4198,7 @@
                 <w:sz w:val="20"/>
                 <w:szCs w:val="20"/>
               </w:rPr>
-              <w:t xml:space="preserve">© 2026 Acme Ventures</w:t>
+              <w:t xml:space="preserve">© 2026 Companyon Ventures</w:t>
             </w:r>
           </w:p>
         </w:tc>
@@ -4590,7 +4590,7 @@
         </w:rPr>
         <w:t xml:space="preserve">Go to </w:t>
       </w:r>
-      <w:hyperlink w:history="1" r:id="rId5mzkzn2gfq--himlrmqca">
+      <w:hyperlink w:history="1" r:id="rIdsmt-bywufezteuywbuugb">
         <w:r>
           <w:rPr>
             <w:rFonts w:ascii="Arial" w:cs="Arial" w:eastAsia="Arial" w:hAnsi="Arial"/>
@@ -4893,7 +4893,7 @@
         </w:rPr>
         <w:t xml:space="preserve">In Vercel, click Add New → Project, or go to </w:t>
       </w:r>
-      <w:hyperlink w:history="1" r:id="rIdk03otagzw_elzp7hpbhs1">
+      <w:hyperlink w:history="1" r:id="rId-tknahsvfygtxilghhxag">
         <w:r>
           <w:rPr>
             <w:rFonts w:ascii="Arial" w:cs="Arial" w:eastAsia="Arial" w:hAnsi="Arial"/>
@@ -10682,7 +10682,7 @@
         </w:rPr>
         <w:t xml:space="preserve">Source repository: </w:t>
       </w:r>
-      <w:hyperlink w:history="1" r:id="rIdapcnijvrw5ecuvk6vwxzp">
+      <w:hyperlink w:history="1" r:id="rIdo1fts2giadfpojlt0lsf8">
         <w:r>
           <w:rPr>
             <w:rFonts w:ascii="Arial" w:cs="Arial" w:eastAsia="Arial" w:hAnsi="Arial"/>
@@ -10709,7 +10709,7 @@
         </w:rPr>
         <w:t xml:space="preserve">GitHub Desktop: </w:t>
       </w:r>
-      <w:hyperlink w:history="1" r:id="rIdqord1ok9vauthk9fztrmu">
+      <w:hyperlink w:history="1" r:id="rIdor7aq3jo5h4fknzlwobxn">
         <w:r>
           <w:rPr>
             <w:rFonts w:ascii="Arial" w:cs="Arial" w:eastAsia="Arial" w:hAnsi="Arial"/>
@@ -10736,7 +10736,7 @@
         </w:rPr>
         <w:t xml:space="preserve">Vercel: </w:t>
       </w:r>
-      <w:hyperlink w:history="1" r:id="rIdgubvaawthg53nn_gkbyx8">
+      <w:hyperlink w:history="1" r:id="rId1g19oj-e8c1_aq5nggku7">
         <w:r>
           <w:rPr>
             <w:rFonts w:ascii="Arial" w:cs="Arial" w:eastAsia="Arial" w:hAnsi="Arial"/>
@@ -10763,7 +10763,7 @@
         </w:rPr>
         <w:t xml:space="preserve">Google Sheets: </w:t>
       </w:r>
-      <w:hyperlink w:history="1" r:id="rIdvwxwc1yeq2rmb8bwn5kwl">
+      <w:hyperlink w:history="1" r:id="rIdoyniikkhmtlz736anol2j">
         <w:r>
           <w:rPr>
             <w:rFonts w:ascii="Arial" w:cs="Arial" w:eastAsia="Arial" w:hAnsi="Arial"/>
@@ -10790,7 +10790,7 @@
         </w:rPr>
         <w:t xml:space="preserve">Favicon generator: </w:t>
       </w:r>
-      <w:hyperlink w:history="1" r:id="rIdclsxkcba8l4njhltrc_dm">
+      <w:hyperlink w:history="1" r:id="rIdokbowpa6shfed-x5bmjlv">
         <w:r>
           <w:rPr>
             <w:rFonts w:ascii="Arial" w:cs="Arial" w:eastAsia="Arial" w:hAnsi="Arial"/>

</xml_diff>

<commit_message>
Updated Documentation for Caching
Updated instructions on how to set up Vercel storage for caching so the page loads much faster and more efficiently.
</commit_message>
<xml_diff>
--- a/USER_GUIDE.docx
+++ b/USER_GUIDE.docx
@@ -5511,6 +5511,1113 @@
                 <w:sz w:val="32"/>
                 <w:szCs w:val="32"/>
               </w:rPr>
+              <w:t xml:space="preserve">06A</w:t>
+            </w:r>
+          </w:p>
+        </w:tc>
+        <w:tc>
+          <w:tcPr>
+            <w:tcW w:type="dxa" w:w="8460"/>
+            <w:tcBorders>
+              <w:top w:val="none" w:color="FFFFFF" w:sz="0"/>
+              <w:left w:val="none" w:color="FFFFFF" w:sz="0"/>
+              <w:bottom w:val="none" w:color="FFFFFF" w:sz="0"/>
+              <w:right w:val="none" w:color="FFFFFF" w:sz="0"/>
+            </w:tcBorders>
+            <w:shd w:fill="F0ECFF" w:val="clear"/>
+            <w:tcMar>
+              <w:top w:type="dxa" w:w="80"/>
+              <w:left w:type="dxa" w:w="200"/>
+              <w:bottom w:type="dxa" w:w="80"/>
+              <w:right w:type="dxa" w:w="120"/>
+            </w:tcMar>
+            <w:vAlign w:val="center"/>
+          </w:tcPr>
+          <w:p>
+            <w:pPr>
+              <w:spacing w:after="0" w:before="0"/>
+            </w:pPr>
+            <w:r>
+              <w:rPr>
+                <w:rFonts w:ascii="Arial" w:cs="Arial" w:eastAsia="Arial" w:hAnsi="Arial"/>
+                <w:b/>
+                <w:bCs/>
+                <w:color w:val="1A3A6B"/>
+                <w:sz w:val="28"/>
+                <w:szCs w:val="28"/>
+              </w:rPr>
+              <w:t xml:space="preserve">Speed Up Your Job Board (Recommended)</w:t>
+            </w:r>
+          </w:p>
+        </w:tc>
+      </w:tr>
+    </w:tbl>
+    <w:p>
+      <w:pPr>
+        <w:spacing w:after="160" w:before="0"/>
+      </w:pPr>
+    </w:p>
+    <w:p>
+      <w:pPr>
+        <w:spacing w:after="120" w:before="0"/>
+      </w:pPr>
+      <w:r>
+        <w:rPr>
+          <w:rFonts w:ascii="Arial" w:cs="Arial" w:eastAsia="Arial" w:hAnsi="Arial"/>
+          <w:color w:val="222222"/>
+          <w:sz w:val="22"/>
+          <w:szCs w:val="22"/>
+        </w:rPr>
+        <w:t xml:space="preserve">By default, every time someone visits your job board for the first time, the system has to go out and fetch job data from every portfolio company’s hiring platform in real time. Depending on how many companies you have, this can take 3–8 seconds. Visitors see a loading spinner during this time.</w:t>
+      </w:r>
+    </w:p>
+    <w:p>
+      <w:pPr>
+        <w:spacing w:after="120" w:before="0"/>
+      </w:pPr>
+      <w:r>
+        <w:rPr>
+          <w:rFonts w:ascii="Arial" w:cs="Arial" w:eastAsia="Arial" w:hAnsi="Arial"/>
+          <w:color w:val="222222"/>
+          <w:sz w:val="22"/>
+          <w:szCs w:val="22"/>
+        </w:rPr>
+        <w:t xml:space="preserve">This step sets up a cache — a saved copy of all the job data stored in a fast database called Upstash. Instead of fetching everything from scratch on each visit, the job board serves the cached copy instantly (~50 milliseconds). The cache refreshes automatically every 4 hours in the background, so job listings stay current without any action from you.</w:t>
+      </w:r>
+    </w:p>
+    <w:p>
+      <w:pPr>
+        <w:spacing w:after="120" w:before="0"/>
+      </w:pPr>
+      <w:r>
+        <w:rPr>
+          <w:rFonts w:ascii="Arial" w:cs="Arial" w:eastAsia="Arial" w:hAnsi="Arial"/>
+          <w:color w:val="222222"/>
+          <w:sz w:val="22"/>
+          <w:szCs w:val="22"/>
+        </w:rPr>
+        <w:t xml:space="preserve">Once set up, every visitor — new browser, incognito mode, different country — sees the page load instantly. This is a one-time setup that takes about 10 minutes.</w:t>
+      </w:r>
+    </w:p>
+    <w:p>
+      <w:pPr>
+        <w:spacing w:after="120" w:before="280"/>
+      </w:pPr>
+      <w:r>
+        <w:rPr>
+          <w:rFonts w:ascii="Arial" w:cs="Arial" w:eastAsia="Arial" w:hAnsi="Arial"/>
+          <w:b/>
+          <w:bCs/>
+          <w:color w:val="4300EC"/>
+          <w:sz w:val="26"/>
+          <w:szCs w:val="26"/>
+        </w:rPr>
+        <w:t xml:space="preserve">Create an Upstash cache database</w:t>
+      </w:r>
+    </w:p>
+    <w:p>
+      <w:pPr>
+        <w:pStyle w:val="ListParagraph"/>
+        <w:numPr>
+          <w:ilvl w:val="0"/>
+          <w:numId w:val="3"/>
+        </w:numPr>
+        <w:spacing w:after="80" w:before="0"/>
+      </w:pPr>
+      <w:r>
+        <w:rPr>
+          <w:rFonts w:ascii="Arial" w:cs="Arial" w:eastAsia="Arial" w:hAnsi="Arial"/>
+          <w:color w:val="222222"/>
+          <w:sz w:val="22"/>
+          <w:szCs w:val="22"/>
+        </w:rPr>
+        <w:t xml:space="preserve">In your Vercel project dashboard, click </w:t>
+      </w:r>
+      <w:r>
+        <w:rPr>
+          <w:rFonts w:ascii="Arial" w:cs="Arial" w:eastAsia="Arial" w:hAnsi="Arial"/>
+          <w:b/>
+          <w:bCs/>
+          <w:color w:val="222222"/>
+          <w:sz w:val="22"/>
+          <w:szCs w:val="22"/>
+        </w:rPr>
+        <w:t xml:space="preserve">Storage</w:t>
+      </w:r>
+      <w:r>
+        <w:rPr>
+          <w:rFonts w:ascii="Arial" w:cs="Arial" w:eastAsia="Arial" w:hAnsi="Arial"/>
+          <w:color w:val="222222"/>
+          <w:sz w:val="22"/>
+          <w:szCs w:val="22"/>
+        </w:rPr>
+        <w:t xml:space="preserve"> in the top navigation.</w:t>
+      </w:r>
+    </w:p>
+    <w:p>
+      <w:pPr>
+        <w:pStyle w:val="ListParagraph"/>
+        <w:numPr>
+          <w:ilvl w:val="0"/>
+          <w:numId w:val="3"/>
+        </w:numPr>
+        <w:spacing w:after="80" w:before="0"/>
+      </w:pPr>
+      <w:r>
+        <w:rPr>
+          <w:rFonts w:ascii="Arial" w:cs="Arial" w:eastAsia="Arial" w:hAnsi="Arial"/>
+          <w:color w:val="222222"/>
+          <w:sz w:val="22"/>
+          <w:szCs w:val="22"/>
+        </w:rPr>
+        <w:t xml:space="preserve">Click </w:t>
+      </w:r>
+      <w:r>
+        <w:rPr>
+          <w:rFonts w:ascii="Arial" w:cs="Arial" w:eastAsia="Arial" w:hAnsi="Arial"/>
+          <w:b/>
+          <w:bCs/>
+          <w:color w:val="222222"/>
+          <w:sz w:val="22"/>
+          <w:szCs w:val="22"/>
+        </w:rPr>
+        <w:t xml:space="preserve">Browse Marketplace</w:t>
+      </w:r>
+      <w:r>
+        <w:rPr>
+          <w:rFonts w:ascii="Arial" w:cs="Arial" w:eastAsia="Arial" w:hAnsi="Arial"/>
+          <w:color w:val="222222"/>
+          <w:sz w:val="22"/>
+          <w:szCs w:val="22"/>
+        </w:rPr>
+        <w:t xml:space="preserve"> and find </w:t>
+      </w:r>
+      <w:r>
+        <w:rPr>
+          <w:rFonts w:ascii="Arial" w:cs="Arial" w:eastAsia="Arial" w:hAnsi="Arial"/>
+          <w:b/>
+          <w:bCs/>
+          <w:color w:val="222222"/>
+          <w:sz w:val="22"/>
+          <w:szCs w:val="22"/>
+        </w:rPr>
+        <w:t xml:space="preserve">Upstash</w:t>
+      </w:r>
+      <w:r>
+        <w:rPr>
+          <w:rFonts w:ascii="Arial" w:cs="Arial" w:eastAsia="Arial" w:hAnsi="Arial"/>
+          <w:color w:val="222222"/>
+          <w:sz w:val="22"/>
+          <w:szCs w:val="22"/>
+        </w:rPr>
+        <w:t xml:space="preserve">. Click it to open the Upstash integration.</w:t>
+      </w:r>
+    </w:p>
+    <w:p>
+      <w:pPr>
+        <w:pStyle w:val="ListParagraph"/>
+        <w:numPr>
+          <w:ilvl w:val="0"/>
+          <w:numId w:val="3"/>
+        </w:numPr>
+        <w:spacing w:after="80" w:before="0"/>
+      </w:pPr>
+      <w:r>
+        <w:rPr>
+          <w:rFonts w:ascii="Arial" w:cs="Arial" w:eastAsia="Arial" w:hAnsi="Arial"/>
+          <w:color w:val="222222"/>
+          <w:sz w:val="22"/>
+          <w:szCs w:val="22"/>
+        </w:rPr>
+        <w:t xml:space="preserve">From the Upstash product dropdown, select </w:t>
+      </w:r>
+      <w:r>
+        <w:rPr>
+          <w:rFonts w:ascii="Arial" w:cs="Arial" w:eastAsia="Arial" w:hAnsi="Arial"/>
+          <w:b/>
+          <w:bCs/>
+          <w:color w:val="222222"/>
+          <w:sz w:val="22"/>
+          <w:szCs w:val="22"/>
+        </w:rPr>
+        <w:t xml:space="preserve">Redis</w:t>
+      </w:r>
+      <w:r>
+        <w:rPr>
+          <w:rFonts w:ascii="Arial" w:cs="Arial" w:eastAsia="Arial" w:hAnsi="Arial"/>
+          <w:color w:val="222222"/>
+          <w:sz w:val="22"/>
+          <w:szCs w:val="22"/>
+        </w:rPr>
+        <w:t xml:space="preserve">. (You will see other options like Vector, QStash, and Search — ignore those.)</w:t>
+      </w:r>
+    </w:p>
+    <w:p>
+      <w:pPr>
+        <w:pStyle w:val="ListParagraph"/>
+        <w:numPr>
+          <w:ilvl w:val="0"/>
+          <w:numId w:val="3"/>
+        </w:numPr>
+        <w:spacing w:after="80" w:before="0"/>
+      </w:pPr>
+      <w:r>
+        <w:rPr>
+          <w:rFonts w:ascii="Arial" w:cs="Arial" w:eastAsia="Arial" w:hAnsi="Arial"/>
+          <w:color w:val="222222"/>
+          <w:sz w:val="22"/>
+          <w:szCs w:val="22"/>
+        </w:rPr>
+        <w:t xml:space="preserve">Configure the new database with these settings:</w:t>
+      </w:r>
+    </w:p>
+    <w:p>
+      <w:pPr>
+        <w:pStyle w:val="ListParagraph"/>
+        <w:numPr>
+          <w:ilvl w:val="1"/>
+          <w:numId w:val="2"/>
+        </w:numPr>
+        <w:spacing w:after="60" w:before="0"/>
+      </w:pPr>
+      <w:r>
+        <w:rPr>
+          <w:rFonts w:ascii="Arial" w:cs="Arial" w:eastAsia="Arial" w:hAnsi="Arial"/>
+          <w:b/>
+          <w:bCs/>
+          <w:color w:val="222222"/>
+          <w:sz w:val="22"/>
+          <w:szCs w:val="22"/>
+        </w:rPr>
+        <w:t xml:space="preserve">Region: </w:t>
+      </w:r>
+      <w:r>
+        <w:rPr>
+          <w:rFonts w:ascii="Arial" w:cs="Arial" w:eastAsia="Arial" w:hAnsi="Arial"/>
+          <w:color w:val="222222"/>
+          <w:sz w:val="22"/>
+          <w:szCs w:val="22"/>
+        </w:rPr>
+        <w:t xml:space="preserve">iad1 (US East)</w:t>
+      </w:r>
+    </w:p>
+    <w:p>
+      <w:pPr>
+        <w:pStyle w:val="ListParagraph"/>
+        <w:numPr>
+          <w:ilvl w:val="1"/>
+          <w:numId w:val="2"/>
+        </w:numPr>
+        <w:spacing w:after="60" w:before="0"/>
+      </w:pPr>
+      <w:r>
+        <w:rPr>
+          <w:rFonts w:ascii="Arial" w:cs="Arial" w:eastAsia="Arial" w:hAnsi="Arial"/>
+          <w:b/>
+          <w:bCs/>
+          <w:color w:val="222222"/>
+          <w:sz w:val="22"/>
+          <w:szCs w:val="22"/>
+        </w:rPr>
+        <w:t xml:space="preserve">Eviction: </w:t>
+      </w:r>
+      <w:r>
+        <w:rPr>
+          <w:rFonts w:ascii="Arial" w:cs="Arial" w:eastAsia="Arial" w:hAnsi="Arial"/>
+          <w:color w:val="222222"/>
+          <w:sz w:val="22"/>
+          <w:szCs w:val="22"/>
+        </w:rPr>
+        <w:t xml:space="preserve">Off</w:t>
+      </w:r>
+    </w:p>
+    <w:p>
+      <w:pPr>
+        <w:pStyle w:val="ListParagraph"/>
+        <w:numPr>
+          <w:ilvl w:val="1"/>
+          <w:numId w:val="2"/>
+        </w:numPr>
+        <w:spacing w:after="80" w:before="0"/>
+      </w:pPr>
+      <w:r>
+        <w:rPr>
+          <w:rFonts w:ascii="Arial" w:cs="Arial" w:eastAsia="Arial" w:hAnsi="Arial"/>
+          <w:b/>
+          <w:bCs/>
+          <w:color w:val="222222"/>
+          <w:sz w:val="22"/>
+          <w:szCs w:val="22"/>
+        </w:rPr>
+        <w:t xml:space="preserve">Plan: </w:t>
+      </w:r>
+      <w:r>
+        <w:rPr>
+          <w:rFonts w:ascii="Arial" w:cs="Arial" w:eastAsia="Arial" w:hAnsi="Arial"/>
+          <w:color w:val="222222"/>
+          <w:sz w:val="22"/>
+          <w:szCs w:val="22"/>
+        </w:rPr>
+        <w:t xml:space="preserve">Free</w:t>
+      </w:r>
+    </w:p>
+    <w:p>
+      <w:pPr>
+        <w:pStyle w:val="ListParagraph"/>
+        <w:numPr>
+          <w:ilvl w:val="0"/>
+          <w:numId w:val="3"/>
+        </w:numPr>
+        <w:spacing w:after="80" w:before="0"/>
+      </w:pPr>
+      <w:r>
+        <w:rPr>
+          <w:rFonts w:ascii="Arial" w:cs="Arial" w:eastAsia="Arial" w:hAnsi="Arial"/>
+          <w:color w:val="222222"/>
+          <w:sz w:val="22"/>
+          <w:szCs w:val="22"/>
+        </w:rPr>
+        <w:t xml:space="preserve">Click </w:t>
+      </w:r>
+      <w:r>
+        <w:rPr>
+          <w:rFonts w:ascii="Arial" w:cs="Arial" w:eastAsia="Arial" w:hAnsi="Arial"/>
+          <w:b/>
+          <w:bCs/>
+          <w:color w:val="222222"/>
+          <w:sz w:val="22"/>
+          <w:szCs w:val="22"/>
+        </w:rPr>
+        <w:t xml:space="preserve">Create and Continue</w:t>
+      </w:r>
+      <w:r>
+        <w:rPr>
+          <w:rFonts w:ascii="Arial" w:cs="Arial" w:eastAsia="Arial" w:hAnsi="Arial"/>
+          <w:color w:val="222222"/>
+          <w:sz w:val="22"/>
+          <w:szCs w:val="22"/>
+        </w:rPr>
+        <w:t xml:space="preserve">, then click </w:t>
+      </w:r>
+      <w:r>
+        <w:rPr>
+          <w:rFonts w:ascii="Arial" w:cs="Arial" w:eastAsia="Arial" w:hAnsi="Arial"/>
+          <w:b/>
+          <w:bCs/>
+          <w:color w:val="222222"/>
+          <w:sz w:val="22"/>
+          <w:szCs w:val="22"/>
+        </w:rPr>
+        <w:t xml:space="preserve">Create Database</w:t>
+      </w:r>
+      <w:r>
+        <w:rPr>
+          <w:rFonts w:ascii="Arial" w:cs="Arial" w:eastAsia="Arial" w:hAnsi="Arial"/>
+          <w:color w:val="222222"/>
+          <w:sz w:val="22"/>
+          <w:szCs w:val="22"/>
+        </w:rPr>
+        <w:t xml:space="preserve"> on the confirmation screen.</w:t>
+      </w:r>
+    </w:p>
+    <w:p>
+      <w:pPr>
+        <w:spacing w:after="120" w:before="280"/>
+      </w:pPr>
+      <w:r>
+        <w:rPr>
+          <w:rFonts w:ascii="Arial" w:cs="Arial" w:eastAsia="Arial" w:hAnsi="Arial"/>
+          <w:b/>
+          <w:bCs/>
+          <w:color w:val="4300EC"/>
+          <w:sz w:val="26"/>
+          <w:szCs w:val="26"/>
+        </w:rPr>
+        <w:t xml:space="preserve">Connect the database to your project</w:t>
+      </w:r>
+    </w:p>
+    <w:p>
+      <w:pPr>
+        <w:pStyle w:val="ListParagraph"/>
+        <w:numPr>
+          <w:ilvl w:val="0"/>
+          <w:numId w:val="3"/>
+        </w:numPr>
+        <w:spacing w:after="80" w:before="0"/>
+      </w:pPr>
+      <w:r>
+        <w:rPr>
+          <w:rFonts w:ascii="Arial" w:cs="Arial" w:eastAsia="Arial" w:hAnsi="Arial"/>
+          <w:color w:val="222222"/>
+          <w:sz w:val="22"/>
+          <w:szCs w:val="22"/>
+        </w:rPr>
+        <w:t xml:space="preserve">On the </w:t>
+      </w:r>
+      <w:r>
+        <w:rPr>
+          <w:rFonts w:ascii="Arial" w:cs="Arial" w:eastAsia="Arial" w:hAnsi="Arial"/>
+          <w:b/>
+          <w:bCs/>
+          <w:color w:val="222222"/>
+          <w:sz w:val="22"/>
+          <w:szCs w:val="22"/>
+        </w:rPr>
+        <w:t xml:space="preserve">Connect a Project</w:t>
+      </w:r>
+      <w:r>
+        <w:rPr>
+          <w:rFonts w:ascii="Arial" w:cs="Arial" w:eastAsia="Arial" w:hAnsi="Arial"/>
+          <w:color w:val="222222"/>
+          <w:sz w:val="22"/>
+          <w:szCs w:val="22"/>
+        </w:rPr>
+        <w:t xml:space="preserve"> screen, select your </w:t>
+      </w:r>
+      <w:r>
+        <w:rPr>
+          <w:rFonts w:ascii="Arial" w:cs="Arial" w:eastAsia="Arial" w:hAnsi="Arial"/>
+          <w:b/>
+          <w:bCs/>
+          <w:color w:val="222222"/>
+          <w:sz w:val="22"/>
+          <w:szCs w:val="22"/>
+        </w:rPr>
+        <w:t xml:space="preserve">portfolio-jobs</w:t>
+      </w:r>
+      <w:r>
+        <w:rPr>
+          <w:rFonts w:ascii="Arial" w:cs="Arial" w:eastAsia="Arial" w:hAnsi="Arial"/>
+          <w:color w:val="222222"/>
+          <w:sz w:val="22"/>
+          <w:szCs w:val="22"/>
+        </w:rPr>
+        <w:t xml:space="preserve"> project.</w:t>
+      </w:r>
+    </w:p>
+    <w:p>
+      <w:pPr>
+        <w:pStyle w:val="ListParagraph"/>
+        <w:numPr>
+          <w:ilvl w:val="0"/>
+          <w:numId w:val="3"/>
+        </w:numPr>
+        <w:spacing w:after="80" w:before="0"/>
+      </w:pPr>
+      <w:r>
+        <w:rPr>
+          <w:rFonts w:ascii="Arial" w:cs="Arial" w:eastAsia="Arial" w:hAnsi="Arial"/>
+          <w:color w:val="222222"/>
+          <w:sz w:val="22"/>
+          <w:szCs w:val="22"/>
+        </w:rPr>
+        <w:t xml:space="preserve">Find the </w:t>
+      </w:r>
+      <w:r>
+        <w:rPr>
+          <w:rFonts w:ascii="Arial" w:cs="Arial" w:eastAsia="Arial" w:hAnsi="Arial"/>
+          <w:b/>
+          <w:bCs/>
+          <w:color w:val="222222"/>
+          <w:sz w:val="22"/>
+          <w:szCs w:val="22"/>
+        </w:rPr>
+        <w:t xml:space="preserve">Custom Environment Variable Prefix</w:t>
+      </w:r>
+      <w:r>
+        <w:rPr>
+          <w:rFonts w:ascii="Arial" w:cs="Arial" w:eastAsia="Arial" w:hAnsi="Arial"/>
+          <w:color w:val="222222"/>
+          <w:sz w:val="22"/>
+          <w:szCs w:val="22"/>
+        </w:rPr>
+        <w:t xml:space="preserve"> field and </w:t>
+      </w:r>
+      <w:r>
+        <w:rPr>
+          <w:rFonts w:ascii="Arial" w:cs="Arial" w:eastAsia="Arial" w:hAnsi="Arial"/>
+          <w:b/>
+          <w:bCs/>
+          <w:color w:val="222222"/>
+          <w:sz w:val="22"/>
+          <w:szCs w:val="22"/>
+        </w:rPr>
+        <w:t xml:space="preserve">delete any text that is already there</w:t>
+      </w:r>
+      <w:r>
+        <w:rPr>
+          <w:rFonts w:ascii="Arial" w:cs="Arial" w:eastAsia="Arial" w:hAnsi="Arial"/>
+          <w:color w:val="222222"/>
+          <w:sz w:val="22"/>
+          <w:szCs w:val="22"/>
+        </w:rPr>
+        <w:t xml:space="preserve"> (it may show “STORAGE” by default). Leave the field completely blank. This is important: if you leave any text in this field, the integration creates variables with the wrong names and the cache will not work.</w:t>
+      </w:r>
+    </w:p>
+    <w:p>
+      <w:pPr>
+        <w:pStyle w:val="ListParagraph"/>
+        <w:numPr>
+          <w:ilvl w:val="0"/>
+          <w:numId w:val="3"/>
+        </w:numPr>
+        <w:spacing w:after="80" w:before="0"/>
+      </w:pPr>
+      <w:r>
+        <w:rPr>
+          <w:rFonts w:ascii="Arial" w:cs="Arial" w:eastAsia="Arial" w:hAnsi="Arial"/>
+          <w:color w:val="222222"/>
+          <w:sz w:val="22"/>
+          <w:szCs w:val="22"/>
+        </w:rPr>
+        <w:t xml:space="preserve">Click </w:t>
+      </w:r>
+      <w:r>
+        <w:rPr>
+          <w:rFonts w:ascii="Arial" w:cs="Arial" w:eastAsia="Arial" w:hAnsi="Arial"/>
+          <w:b/>
+          <w:bCs/>
+          <w:color w:val="222222"/>
+          <w:sz w:val="22"/>
+          <w:szCs w:val="22"/>
+        </w:rPr>
+        <w:t xml:space="preserve">Connect</w:t>
+      </w:r>
+      <w:r>
+        <w:rPr>
+          <w:rFonts w:ascii="Arial" w:cs="Arial" w:eastAsia="Arial" w:hAnsi="Arial"/>
+          <w:color w:val="222222"/>
+          <w:sz w:val="22"/>
+          <w:szCs w:val="22"/>
+        </w:rPr>
+        <w:t xml:space="preserve">. Vercel will automatically add two environment variables to your project: </w:t>
+      </w:r>
+      <w:r>
+        <w:rPr>
+          <w:rFonts w:ascii="Courier New" w:cs="Courier New" w:eastAsia="Courier New" w:hAnsi="Courier New"/>
+          <w:color w:val="222222"/>
+          <w:sz w:val="20"/>
+          <w:szCs w:val="20"/>
+        </w:rPr>
+        <w:t xml:space="preserve">KV_REST_API_URL</w:t>
+      </w:r>
+      <w:r>
+        <w:rPr>
+          <w:rFonts w:ascii="Arial" w:cs="Arial" w:eastAsia="Arial" w:hAnsi="Arial"/>
+          <w:color w:val="222222"/>
+          <w:sz w:val="22"/>
+          <w:szCs w:val="22"/>
+        </w:rPr>
+        <w:t xml:space="preserve"> and </w:t>
+      </w:r>
+      <w:r>
+        <w:rPr>
+          <w:rFonts w:ascii="Courier New" w:cs="Courier New" w:eastAsia="Courier New" w:hAnsi="Courier New"/>
+          <w:color w:val="222222"/>
+          <w:sz w:val="20"/>
+          <w:szCs w:val="20"/>
+        </w:rPr>
+        <w:t xml:space="preserve">KV_REST_API_TOKEN</w:t>
+      </w:r>
+      <w:r>
+        <w:rPr>
+          <w:rFonts w:ascii="Arial" w:cs="Arial" w:eastAsia="Arial" w:hAnsi="Arial"/>
+          <w:color w:val="222222"/>
+          <w:sz w:val="22"/>
+          <w:szCs w:val="22"/>
+        </w:rPr>
+        <w:t xml:space="preserve">. You do not need to copy or set these manually — Vercel handles it.</w:t>
+      </w:r>
+    </w:p>
+    <w:p>
+      <w:pPr>
+        <w:spacing w:after="120" w:before="280"/>
+      </w:pPr>
+      <w:r>
+        <w:rPr>
+          <w:rFonts w:ascii="Arial" w:cs="Arial" w:eastAsia="Arial" w:hAnsi="Arial"/>
+          <w:b/>
+          <w:bCs/>
+          <w:color w:val="4300EC"/>
+          <w:sz w:val="26"/>
+          <w:szCs w:val="26"/>
+        </w:rPr>
+        <w:t xml:space="preserve">Add a CRON_SECRET</w:t>
+      </w:r>
+    </w:p>
+    <w:p>
+      <w:pPr>
+        <w:spacing w:after="120" w:before="0"/>
+      </w:pPr>
+      <w:r>
+        <w:rPr>
+          <w:rFonts w:ascii="Arial" w:cs="Arial" w:eastAsia="Arial" w:hAnsi="Arial"/>
+          <w:color w:val="222222"/>
+          <w:sz w:val="22"/>
+          <w:szCs w:val="22"/>
+        </w:rPr>
+        <w:t xml:space="preserve">The job board refreshes the cache every 4 hours automatically. The </w:t>
+      </w:r>
+      <w:r>
+        <w:rPr>
+          <w:rFonts w:ascii="Courier New" w:cs="Courier New" w:eastAsia="Courier New" w:hAnsi="Courier New"/>
+          <w:color w:val="222222"/>
+          <w:sz w:val="20"/>
+          <w:szCs w:val="20"/>
+        </w:rPr>
+        <w:t xml:space="preserve">CRON_SECRET</w:t>
+      </w:r>
+      <w:r>
+        <w:rPr>
+          <w:rFonts w:ascii="Arial" w:cs="Arial" w:eastAsia="Arial" w:hAnsi="Arial"/>
+          <w:color w:val="222222"/>
+          <w:sz w:val="22"/>
+          <w:szCs w:val="22"/>
+        </w:rPr>
+        <w:t xml:space="preserve"> is a private password that ensures only your own scheduled job can trigger that refresh — not anyone else on the internet.</w:t>
+      </w:r>
+    </w:p>
+    <w:p>
+      <w:pPr>
+        <w:pStyle w:val="ListParagraph"/>
+        <w:numPr>
+          <w:ilvl w:val="0"/>
+          <w:numId w:val="3"/>
+        </w:numPr>
+        <w:spacing w:after="80" w:before="0"/>
+      </w:pPr>
+      <w:r>
+        <w:rPr>
+          <w:rFonts w:ascii="Arial" w:cs="Arial" w:eastAsia="Arial" w:hAnsi="Arial"/>
+          <w:color w:val="222222"/>
+          <w:sz w:val="22"/>
+          <w:szCs w:val="22"/>
+        </w:rPr>
+        <w:t xml:space="preserve">In your Vercel project, go to </w:t>
+      </w:r>
+      <w:r>
+        <w:rPr>
+          <w:rFonts w:ascii="Arial" w:cs="Arial" w:eastAsia="Arial" w:hAnsi="Arial"/>
+          <w:b/>
+          <w:bCs/>
+          <w:color w:val="222222"/>
+          <w:sz w:val="22"/>
+          <w:szCs w:val="22"/>
+        </w:rPr>
+        <w:t xml:space="preserve">Settings → Environment Variables</w:t>
+      </w:r>
+      <w:r>
+        <w:rPr>
+          <w:rFonts w:ascii="Arial" w:cs="Arial" w:eastAsia="Arial" w:hAnsi="Arial"/>
+          <w:color w:val="222222"/>
+          <w:sz w:val="22"/>
+          <w:szCs w:val="22"/>
+        </w:rPr>
+        <w:t xml:space="preserve">.</w:t>
+      </w:r>
+    </w:p>
+    <w:p>
+      <w:pPr>
+        <w:pStyle w:val="ListParagraph"/>
+        <w:numPr>
+          <w:ilvl w:val="0"/>
+          <w:numId w:val="3"/>
+        </w:numPr>
+        <w:spacing w:after="80" w:before="0"/>
+      </w:pPr>
+      <w:r>
+        <w:rPr>
+          <w:rFonts w:ascii="Arial" w:cs="Arial" w:eastAsia="Arial" w:hAnsi="Arial"/>
+          <w:color w:val="222222"/>
+          <w:sz w:val="22"/>
+          <w:szCs w:val="22"/>
+        </w:rPr>
+        <w:t xml:space="preserve">Click </w:t>
+      </w:r>
+      <w:r>
+        <w:rPr>
+          <w:rFonts w:ascii="Arial" w:cs="Arial" w:eastAsia="Arial" w:hAnsi="Arial"/>
+          <w:b/>
+          <w:bCs/>
+          <w:color w:val="222222"/>
+          <w:sz w:val="22"/>
+          <w:szCs w:val="22"/>
+        </w:rPr>
+        <w:t xml:space="preserve">Add new</w:t>
+      </w:r>
+      <w:r>
+        <w:rPr>
+          <w:rFonts w:ascii="Arial" w:cs="Arial" w:eastAsia="Arial" w:hAnsi="Arial"/>
+          <w:color w:val="222222"/>
+          <w:sz w:val="22"/>
+          <w:szCs w:val="22"/>
+        </w:rPr>
+        <w:t xml:space="preserve">. In the Name field, type exactly: </w:t>
+      </w:r>
+      <w:r>
+        <w:rPr>
+          <w:rFonts w:ascii="Courier New" w:cs="Courier New" w:eastAsia="Courier New" w:hAnsi="Courier New"/>
+          <w:color w:val="222222"/>
+          <w:sz w:val="20"/>
+          <w:szCs w:val="20"/>
+        </w:rPr>
+        <w:t xml:space="preserve">CRON_SECRET</w:t>
+      </w:r>
+    </w:p>
+    <w:p>
+      <w:pPr>
+        <w:pStyle w:val="ListParagraph"/>
+        <w:numPr>
+          <w:ilvl w:val="0"/>
+          <w:numId w:val="3"/>
+        </w:numPr>
+        <w:spacing w:after="80" w:before="0"/>
+      </w:pPr>
+      <w:r>
+        <w:rPr>
+          <w:rFonts w:ascii="Arial" w:cs="Arial" w:eastAsia="Arial" w:hAnsi="Arial"/>
+          <w:color w:val="222222"/>
+          <w:sz w:val="22"/>
+          <w:szCs w:val="22"/>
+        </w:rPr>
+        <w:t xml:space="preserve">In the Value field, enter any random string of 16–20 characters — a mix of letters, numbers, and symbols works well (e.g. </w:t>
+      </w:r>
+      <w:r>
+        <w:rPr>
+          <w:rFonts w:ascii="Courier New" w:cs="Courier New" w:eastAsia="Courier New" w:hAnsi="Courier New"/>
+          <w:color w:val="222222"/>
+          <w:sz w:val="20"/>
+          <w:szCs w:val="20"/>
+        </w:rPr>
+        <w:t xml:space="preserve">Xk9#mP2$vR7nLqJ4</w:t>
+      </w:r>
+      <w:r>
+        <w:rPr>
+          <w:rFonts w:ascii="Arial" w:cs="Arial" w:eastAsia="Arial" w:hAnsi="Arial"/>
+          <w:color w:val="222222"/>
+          <w:sz w:val="22"/>
+          <w:szCs w:val="22"/>
+        </w:rPr>
+        <w:t xml:space="preserve">). You can generate one at randomkeygen.com. Save this value somewhere private — do not share it in email or chat.</w:t>
+      </w:r>
+    </w:p>
+    <w:p>
+      <w:pPr>
+        <w:pStyle w:val="ListParagraph"/>
+        <w:numPr>
+          <w:ilvl w:val="0"/>
+          <w:numId w:val="3"/>
+        </w:numPr>
+        <w:spacing w:after="80" w:before="0"/>
+      </w:pPr>
+      <w:r>
+        <w:rPr>
+          <w:rFonts w:ascii="Arial" w:cs="Arial" w:eastAsia="Arial" w:hAnsi="Arial"/>
+          <w:color w:val="222222"/>
+          <w:sz w:val="22"/>
+          <w:szCs w:val="22"/>
+        </w:rPr>
+        <w:t xml:space="preserve">Click </w:t>
+      </w:r>
+      <w:r>
+        <w:rPr>
+          <w:rFonts w:ascii="Arial" w:cs="Arial" w:eastAsia="Arial" w:hAnsi="Arial"/>
+          <w:b/>
+          <w:bCs/>
+          <w:color w:val="222222"/>
+          <w:sz w:val="22"/>
+          <w:szCs w:val="22"/>
+        </w:rPr>
+        <w:t xml:space="preserve">Save</w:t>
+      </w:r>
+      <w:r>
+        <w:rPr>
+          <w:rFonts w:ascii="Arial" w:cs="Arial" w:eastAsia="Arial" w:hAnsi="Arial"/>
+          <w:color w:val="222222"/>
+          <w:sz w:val="22"/>
+          <w:szCs w:val="22"/>
+        </w:rPr>
+        <w:t xml:space="preserve">.</w:t>
+      </w:r>
+    </w:p>
+    <w:p>
+      <w:pPr>
+        <w:spacing w:after="120" w:before="280"/>
+      </w:pPr>
+      <w:r>
+        <w:rPr>
+          <w:rFonts w:ascii="Arial" w:cs="Arial" w:eastAsia="Arial" w:hAnsi="Arial"/>
+          <w:b/>
+          <w:bCs/>
+          <w:color w:val="4300EC"/>
+          <w:sz w:val="26"/>
+          <w:szCs w:val="26"/>
+        </w:rPr>
+        <w:t xml:space="preserve">Redeploy to activate the cache</w:t>
+      </w:r>
+    </w:p>
+    <w:p>
+      <w:pPr>
+        <w:pStyle w:val="ListParagraph"/>
+        <w:numPr>
+          <w:ilvl w:val="0"/>
+          <w:numId w:val="3"/>
+        </w:numPr>
+        <w:spacing w:after="80" w:before="0"/>
+      </w:pPr>
+      <w:r>
+        <w:rPr>
+          <w:rFonts w:ascii="Arial" w:cs="Arial" w:eastAsia="Arial" w:hAnsi="Arial"/>
+          <w:color w:val="222222"/>
+          <w:sz w:val="22"/>
+          <w:szCs w:val="22"/>
+        </w:rPr>
+        <w:t xml:space="preserve">Go to </w:t>
+      </w:r>
+      <w:r>
+        <w:rPr>
+          <w:rFonts w:ascii="Arial" w:cs="Arial" w:eastAsia="Arial" w:hAnsi="Arial"/>
+          <w:b/>
+          <w:bCs/>
+          <w:color w:val="222222"/>
+          <w:sz w:val="22"/>
+          <w:szCs w:val="22"/>
+        </w:rPr>
+        <w:t xml:space="preserve">Deployments</w:t>
+      </w:r>
+      <w:r>
+        <w:rPr>
+          <w:rFonts w:ascii="Arial" w:cs="Arial" w:eastAsia="Arial" w:hAnsi="Arial"/>
+          <w:color w:val="222222"/>
+          <w:sz w:val="22"/>
+          <w:szCs w:val="22"/>
+        </w:rPr>
+        <w:t xml:space="preserve"> in your Vercel project. Find the most recent deployment, click the </w:t>
+      </w:r>
+      <w:r>
+        <w:rPr>
+          <w:rFonts w:ascii="Arial" w:cs="Arial" w:eastAsia="Arial" w:hAnsi="Arial"/>
+          <w:b/>
+          <w:bCs/>
+          <w:color w:val="222222"/>
+          <w:sz w:val="22"/>
+          <w:szCs w:val="22"/>
+        </w:rPr>
+        <w:t xml:space="preserve">⋯</w:t>
+      </w:r>
+      <w:r>
+        <w:rPr>
+          <w:rFonts w:ascii="Arial" w:cs="Arial" w:eastAsia="Arial" w:hAnsi="Arial"/>
+          <w:color w:val="222222"/>
+          <w:sz w:val="22"/>
+          <w:szCs w:val="22"/>
+        </w:rPr>
+        <w:t xml:space="preserve"> (three dots) menu, and click </w:t>
+      </w:r>
+      <w:r>
+        <w:rPr>
+          <w:rFonts w:ascii="Arial" w:cs="Arial" w:eastAsia="Arial" w:hAnsi="Arial"/>
+          <w:b/>
+          <w:bCs/>
+          <w:color w:val="222222"/>
+          <w:sz w:val="22"/>
+          <w:szCs w:val="22"/>
+        </w:rPr>
+        <w:t xml:space="preserve">Redeploy</w:t>
+      </w:r>
+      <w:r>
+        <w:rPr>
+          <w:rFonts w:ascii="Arial" w:cs="Arial" w:eastAsia="Arial" w:hAnsi="Arial"/>
+          <w:color w:val="222222"/>
+          <w:sz w:val="22"/>
+          <w:szCs w:val="22"/>
+        </w:rPr>
+        <w:t xml:space="preserve">.</w:t>
+      </w:r>
+    </w:p>
+    <w:p>
+      <w:pPr>
+        <w:pStyle w:val="ListParagraph"/>
+        <w:numPr>
+          <w:ilvl w:val="0"/>
+          <w:numId w:val="3"/>
+        </w:numPr>
+        <w:spacing w:after="80" w:before="0"/>
+      </w:pPr>
+      <w:r>
+        <w:rPr>
+          <w:rFonts w:ascii="Arial" w:cs="Arial" w:eastAsia="Arial" w:hAnsi="Arial"/>
+          <w:color w:val="222222"/>
+          <w:sz w:val="22"/>
+          <w:szCs w:val="22"/>
+        </w:rPr>
+        <w:t xml:space="preserve">Leave </w:t>
+      </w:r>
+      <w:r>
+        <w:rPr>
+          <w:rFonts w:ascii="Arial" w:cs="Arial" w:eastAsia="Arial" w:hAnsi="Arial"/>
+          <w:b/>
+          <w:bCs/>
+          <w:color w:val="222222"/>
+          <w:sz w:val="22"/>
+          <w:szCs w:val="22"/>
+        </w:rPr>
+        <w:t xml:space="preserve">“Use existing build cache”</w:t>
+      </w:r>
+      <w:r>
+        <w:rPr>
+          <w:rFonts w:ascii="Arial" w:cs="Arial" w:eastAsia="Arial" w:hAnsi="Arial"/>
+          <w:color w:val="222222"/>
+          <w:sz w:val="22"/>
+          <w:szCs w:val="22"/>
+        </w:rPr>
+        <w:t xml:space="preserve"> unchecked, then click </w:t>
+      </w:r>
+      <w:r>
+        <w:rPr>
+          <w:rFonts w:ascii="Arial" w:cs="Arial" w:eastAsia="Arial" w:hAnsi="Arial"/>
+          <w:b/>
+          <w:bCs/>
+          <w:color w:val="222222"/>
+          <w:sz w:val="22"/>
+          <w:szCs w:val="22"/>
+        </w:rPr>
+        <w:t xml:space="preserve">Redeploy</w:t>
+      </w:r>
+      <w:r>
+        <w:rPr>
+          <w:rFonts w:ascii="Arial" w:cs="Arial" w:eastAsia="Arial" w:hAnsi="Arial"/>
+          <w:color w:val="222222"/>
+          <w:sz w:val="22"/>
+          <w:szCs w:val="22"/>
+        </w:rPr>
+        <w:t xml:space="preserve">. This ensures the new environment variables are picked up.</w:t>
+      </w:r>
+    </w:p>
+    <w:p>
+      <w:pPr>
+        <w:spacing w:after="80" w:before="200"/>
+      </w:pPr>
+    </w:p>
+    <w:tbl>
+      <w:tblPr>
+        <w:tblW w:type="dxa" w:w="9360"/>
+        <w:tblBorders>
+          <w:top w:val="none" w:color="FFFFFF" w:sz="0"/>
+          <w:left w:val="none" w:color="FFFFFF" w:sz="0"/>
+          <w:bottom w:val="none" w:color="FFFFFF" w:sz="0"/>
+          <w:right w:val="none" w:color="FFFFFF" w:sz="0"/>
+          <w:insideH w:val="single" w:color="auto" w:sz="4"/>
+          <w:insideV w:val="single" w:color="auto" w:sz="4"/>
+        </w:tblBorders>
+      </w:tblPr>
+      <w:tblGrid>
+        <w:gridCol w:w="9360"/>
+      </w:tblGrid>
+      <w:tr>
+        <w:tc>
+          <w:tcPr>
+            <w:tcW w:type="dxa" w:w="9360"/>
+            <w:tcBorders>
+              <w:top w:val="none" w:color="FFFFFF" w:sz="0"/>
+              <w:left w:val="single" w:color="4300EC" w:sz="12"/>
+              <w:bottom w:val="none" w:color="FFFFFF" w:sz="0"/>
+              <w:right w:val="none" w:color="FFFFFF" w:sz="0"/>
+            </w:tcBorders>
+            <w:shd w:fill="E8F0FE" w:val="clear"/>
+            <w:tcMar>
+              <w:top w:type="dxa" w:w="80"/>
+              <w:left w:type="dxa" w:w="200"/>
+              <w:bottom w:type="dxa" w:w="80"/>
+              <w:right w:type="dxa" w:w="120"/>
+            </w:tcMar>
+          </w:tcPr>
+          <w:p>
+            <w:pPr>
+              <w:spacing w:after="0" w:before="0"/>
+            </w:pPr>
+            <w:r>
+              <w:rPr>
+                <w:rFonts w:ascii="Arial" w:cs="Arial" w:eastAsia="Arial" w:hAnsi="Arial"/>
+                <w:i/>
+                <w:iCs/>
+                <w:color w:val="1a1a1a"/>
+                <w:sz w:val="20"/>
+                <w:szCs w:val="20"/>
+              </w:rPr>
+              <w:t xml:space="preserve">After the redeploy finishes, GitHub automatically calls your job board in the background to warm up the cache. Within about 60 seconds of the deployment completing, the cache is populated and every visitor — new browser, incognito, any country — will see an instant page load.</w:t>
+            </w:r>
+          </w:p>
+        </w:tc>
+      </w:tr>
+    </w:tbl>
+    <w:p>
+      <w:pPr>
+        <w:spacing w:after="200" w:before="0"/>
+      </w:pPr>
+    </w:p>
+    <w:p>
+      <w:pPr>
+        <w:pBdr>
+          <w:bottom w:val="single" w:color="CCCCCC" w:sz="4" w:space="1"/>
+        </w:pBdr>
+        <w:spacing w:after="200" w:before="200"/>
+      </w:pPr>
+    </w:p>
+    <w:p>
+      <w:r>
+        <w:br w:type="page"/>
+      </w:r>
+    </w:p>
+    <w:tbl>
+      <w:tblPr>
+        <w:tblW w:type="dxa" w:w="9360"/>
+        <w:tblBorders>
+          <w:top w:val="none" w:color="FFFFFF" w:sz="0"/>
+          <w:left w:val="none" w:color="FFFFFF" w:sz="0"/>
+          <w:bottom w:val="none" w:color="FFFFFF" w:sz="0"/>
+          <w:right w:val="none" w:color="FFFFFF" w:sz="0"/>
+          <w:insideH w:val="single" w:color="auto" w:sz="4"/>
+          <w:insideV w:val="single" w:color="auto" w:sz="4"/>
+        </w:tblBorders>
+      </w:tblPr>
+      <w:tblGrid>
+        <w:gridCol w:w="900"/>
+        <w:gridCol w:w="8460"/>
+      </w:tblGrid>
+      <w:tr>
+        <w:tc>
+          <w:tcPr>
+            <w:tcW w:type="dxa" w:w="900"/>
+            <w:tcBorders>
+              <w:top w:val="none" w:color="FFFFFF" w:sz="0"/>
+              <w:left w:val="none" w:color="FFFFFF" w:sz="0"/>
+              <w:bottom w:val="none" w:color="FFFFFF" w:sz="0"/>
+              <w:right w:val="none" w:color="FFFFFF" w:sz="0"/>
+            </w:tcBorders>
+            <w:shd w:fill="4300EC" w:val="clear"/>
+            <w:tcMar>
+              <w:top w:type="dxa" w:w="80"/>
+              <w:left w:type="dxa" w:w="120"/>
+              <w:bottom w:type="dxa" w:w="80"/>
+              <w:right w:type="dxa" w:w="120"/>
+            </w:tcMar>
+            <w:vAlign w:val="center"/>
+          </w:tcPr>
+          <w:p>
+            <w:pPr>
+              <w:spacing w:after="0" w:before="0"/>
+              <w:jc w:val="center"/>
+            </w:pPr>
+            <w:r>
+              <w:rPr>
+                <w:rFonts w:ascii="Arial" w:cs="Arial" w:eastAsia="Arial" w:hAnsi="Arial"/>
+                <w:b/>
+                <w:bCs/>
+                <w:color w:val="FFFFFF"/>
+                <w:sz w:val="32"/>
+                <w:szCs w:val="32"/>
+              </w:rPr>
               <w:t xml:space="preserve">07</w:t>
             </w:r>
           </w:p>
@@ -10641,6 +11748,216 @@
                 <w:szCs w:val="20"/>
               </w:rPr>
               <w:t xml:space="preserve">Required. Your Google Sheet CSV URL (Tab 1, ends in ...gid=0).</w:t>
+            </w:r>
+          </w:p>
+        </w:tc>
+      </w:tr>
+      <w:tr>
+        <w:tc>
+          <w:tcPr>
+            <w:tcW w:type="dxa" w:w="2400"/>
+            <w:tcBorders>
+              <w:top w:val="single" w:color="CCCCCC" w:sz="1"/>
+              <w:left w:val="single" w:color="CCCCCC" w:sz="1"/>
+              <w:bottom w:val="single" w:color="CCCCCC" w:sz="1"/>
+              <w:right w:val="single" w:color="CCCCCC" w:sz="1"/>
+            </w:tcBorders>
+            <w:shd w:fill="FFFFFF" w:val="clear"/>
+            <w:tcMar>
+              <w:top w:type="dxa" w:w="80"/>
+              <w:left w:type="dxa" w:w="120"/>
+              <w:bottom w:type="dxa" w:w="80"/>
+              <w:right w:type="dxa" w:w="120"/>
+            </w:tcMar>
+          </w:tcPr>
+          <w:p>
+            <w:pPr>
+              <w:spacing w:after="0" w:before="0"/>
+            </w:pPr>
+            <w:r>
+              <w:rPr>
+                <w:rFonts w:ascii="Arial" w:cs="Arial" w:eastAsia="Arial" w:hAnsi="Arial"/>
+                <w:b w:val="false"/>
+                <w:bCs w:val="false"/>
+                <w:color w:val="222222"/>
+                <w:sz w:val="20"/>
+                <w:szCs w:val="20"/>
+              </w:rPr>
+              <w:t xml:space="preserve">KV_REST_API_URL</w:t>
+            </w:r>
+          </w:p>
+        </w:tc>
+        <w:tc>
+          <w:tcPr>
+            <w:tcW w:type="dxa" w:w="6960"/>
+            <w:tcBorders>
+              <w:top w:val="single" w:color="CCCCCC" w:sz="1"/>
+              <w:left w:val="single" w:color="CCCCCC" w:sz="1"/>
+              <w:bottom w:val="single" w:color="CCCCCC" w:sz="1"/>
+              <w:right w:val="single" w:color="CCCCCC" w:sz="1"/>
+            </w:tcBorders>
+            <w:shd w:fill="FFFFFF" w:val="clear"/>
+            <w:tcMar>
+              <w:top w:type="dxa" w:w="80"/>
+              <w:left w:type="dxa" w:w="120"/>
+              <w:bottom w:type="dxa" w:w="80"/>
+              <w:right w:type="dxa" w:w="120"/>
+            </w:tcMar>
+          </w:tcPr>
+          <w:p>
+            <w:pPr>
+              <w:spacing w:after="0" w:before="0"/>
+            </w:pPr>
+            <w:r>
+              <w:rPr>
+                <w:rFonts w:ascii="Arial" w:cs="Arial" w:eastAsia="Arial" w:hAnsi="Arial"/>
+                <w:b w:val="false"/>
+                <w:bCs w:val="false"/>
+                <w:color w:val="222222"/>
+                <w:sz w:val="20"/>
+                <w:szCs w:val="20"/>
+              </w:rPr>
+              <w:t xml:space="preserve">Added automatically by Upstash integration (Step 06A). Enables instant page loads via caching.</w:t>
+            </w:r>
+          </w:p>
+        </w:tc>
+      </w:tr>
+      <w:tr>
+        <w:tc>
+          <w:tcPr>
+            <w:tcW w:type="dxa" w:w="2400"/>
+            <w:tcBorders>
+              <w:top w:val="single" w:color="CCCCCC" w:sz="1"/>
+              <w:left w:val="single" w:color="CCCCCC" w:sz="1"/>
+              <w:bottom w:val="single" w:color="CCCCCC" w:sz="1"/>
+              <w:right w:val="single" w:color="CCCCCC" w:sz="1"/>
+            </w:tcBorders>
+            <w:shd w:fill="FFFFFF" w:val="clear"/>
+            <w:tcMar>
+              <w:top w:type="dxa" w:w="80"/>
+              <w:left w:type="dxa" w:w="120"/>
+              <w:bottom w:type="dxa" w:w="80"/>
+              <w:right w:type="dxa" w:w="120"/>
+            </w:tcMar>
+          </w:tcPr>
+          <w:p>
+            <w:pPr>
+              <w:spacing w:after="0" w:before="0"/>
+            </w:pPr>
+            <w:r>
+              <w:rPr>
+                <w:rFonts w:ascii="Arial" w:cs="Arial" w:eastAsia="Arial" w:hAnsi="Arial"/>
+                <w:b w:val="false"/>
+                <w:bCs w:val="false"/>
+                <w:color w:val="222222"/>
+                <w:sz w:val="20"/>
+                <w:szCs w:val="20"/>
+              </w:rPr>
+              <w:t xml:space="preserve">KV_REST_API_TOKEN</w:t>
+            </w:r>
+          </w:p>
+        </w:tc>
+        <w:tc>
+          <w:tcPr>
+            <w:tcW w:type="dxa" w:w="6960"/>
+            <w:tcBorders>
+              <w:top w:val="single" w:color="CCCCCC" w:sz="1"/>
+              <w:left w:val="single" w:color="CCCCCC" w:sz="1"/>
+              <w:bottom w:val="single" w:color="CCCCCC" w:sz="1"/>
+              <w:right w:val="single" w:color="CCCCCC" w:sz="1"/>
+            </w:tcBorders>
+            <w:shd w:fill="FFFFFF" w:val="clear"/>
+            <w:tcMar>
+              <w:top w:type="dxa" w:w="80"/>
+              <w:left w:type="dxa" w:w="120"/>
+              <w:bottom w:type="dxa" w:w="80"/>
+              <w:right w:type="dxa" w:w="120"/>
+            </w:tcMar>
+          </w:tcPr>
+          <w:p>
+            <w:pPr>
+              <w:spacing w:after="0" w:before="0"/>
+            </w:pPr>
+            <w:r>
+              <w:rPr>
+                <w:rFonts w:ascii="Arial" w:cs="Arial" w:eastAsia="Arial" w:hAnsi="Arial"/>
+                <w:b w:val="false"/>
+                <w:bCs w:val="false"/>
+                <w:color w:val="222222"/>
+                <w:sz w:val="20"/>
+                <w:szCs w:val="20"/>
+              </w:rPr>
+              <w:t xml:space="preserve">Added automatically by Upstash integration (Step 06A). Secret key for the cache database.</w:t>
+            </w:r>
+          </w:p>
+        </w:tc>
+      </w:tr>
+      <w:tr>
+        <w:tc>
+          <w:tcPr>
+            <w:tcW w:type="dxa" w:w="2400"/>
+            <w:tcBorders>
+              <w:top w:val="single" w:color="CCCCCC" w:sz="1"/>
+              <w:left w:val="single" w:color="CCCCCC" w:sz="1"/>
+              <w:bottom w:val="single" w:color="CCCCCC" w:sz="1"/>
+              <w:right w:val="single" w:color="CCCCCC" w:sz="1"/>
+            </w:tcBorders>
+            <w:shd w:fill="FFFFFF" w:val="clear"/>
+            <w:tcMar>
+              <w:top w:type="dxa" w:w="80"/>
+              <w:left w:type="dxa" w:w="120"/>
+              <w:bottom w:type="dxa" w:w="80"/>
+              <w:right w:type="dxa" w:w="120"/>
+            </w:tcMar>
+          </w:tcPr>
+          <w:p>
+            <w:pPr>
+              <w:spacing w:after="0" w:before="0"/>
+            </w:pPr>
+            <w:r>
+              <w:rPr>
+                <w:rFonts w:ascii="Arial" w:cs="Arial" w:eastAsia="Arial" w:hAnsi="Arial"/>
+                <w:b w:val="false"/>
+                <w:bCs w:val="false"/>
+                <w:color w:val="222222"/>
+                <w:sz w:val="20"/>
+                <w:szCs w:val="20"/>
+              </w:rPr>
+              <w:t xml:space="preserve">CRON_SECRET</w:t>
+            </w:r>
+          </w:p>
+        </w:tc>
+        <w:tc>
+          <w:tcPr>
+            <w:tcW w:type="dxa" w:w="6960"/>
+            <w:tcBorders>
+              <w:top w:val="single" w:color="CCCCCC" w:sz="1"/>
+              <w:left w:val="single" w:color="CCCCCC" w:sz="1"/>
+              <w:bottom w:val="single" w:color="CCCCCC" w:sz="1"/>
+              <w:right w:val="single" w:color="CCCCCC" w:sz="1"/>
+            </w:tcBorders>
+            <w:shd w:fill="FFFFFF" w:val="clear"/>
+            <w:tcMar>
+              <w:top w:type="dxa" w:w="80"/>
+              <w:left w:type="dxa" w:w="120"/>
+              <w:bottom w:type="dxa" w:w="80"/>
+              <w:right w:type="dxa" w:w="120"/>
+            </w:tcMar>
+          </w:tcPr>
+          <w:p>
+            <w:pPr>
+              <w:spacing w:after="0" w:before="0"/>
+            </w:pPr>
+            <w:r>
+              <w:rPr>
+                <w:rFonts w:ascii="Arial" w:cs="Arial" w:eastAsia="Arial" w:hAnsi="Arial"/>
+                <w:b w:val="false"/>
+                <w:bCs w:val="false"/>
+                <w:color w:val="222222"/>
+                <w:sz w:val="20"/>
+                <w:szCs w:val="20"/>
+              </w:rPr>
+              <w:t xml:space="preserve">Set manually in Step 06A. Protects the scheduled cache refresh from outside access.</w:t>
             </w:r>
           </w:p>
         </w:tc>

</xml_diff>

<commit_message>
Updated documentation with security, cache updates
</commit_message>
<xml_diff>
--- a/USER_GUIDE.docx
+++ b/USER_GUIDE.docx
@@ -1199,7 +1199,7 @@
           <w:sz w:val="22"/>
           <w:szCs w:val="22"/>
         </w:rPr>
-        <w:t xml:space="preserve">Optional: Under Settings → Two-factor authentication, enable 2FA. This is strongly recommended for any account that controls public-facing code.</w:t>
+        <w:t xml:space="preserve">Enable Two-Factor Authentication (2FA) — required by GitHub. Go to Settings → Password and authentication → Two-factor authentication. Follow the setup wizard and choose an authenticator app (such as Google Authenticator or Authy) when prompted. GitHub requires 2FA for all accounts; you will be prompted to complete this before you can continue using GitHub.</w:t>
       </w:r>
     </w:p>
     <w:p>
@@ -1763,7 +1763,7 @@
           <w:sz w:val="22"/>
           <w:szCs w:val="22"/>
         </w:rPr>
-        <w:t xml:space="preserve">You click Push to sync those changes to GitHub (which triggers a live deploy on Vercel)</w:t>
+        <w:t xml:space="preserve">You click Push to sync those changes to GitHub</w:t>
       </w:r>
     </w:p>
     <w:p>
@@ -4564,7 +4564,7 @@
           <w:sz w:val="22"/>
           <w:szCs w:val="22"/>
         </w:rPr>
-        <w:t xml:space="preserve">Vercel is the hosting platform that runs your job board. It watches your GitHub repository and automatically publishes the live website whenever you make changes.</w:t>
+        <w:t xml:space="preserve">Vercel is the hosting platform that runs your job board. It hosts your live website and deploys new versions whenever you run a deployment command.</w:t>
       </w:r>
     </w:p>
     <w:p>
@@ -4648,6 +4648,46 @@
           <w:szCs w:val="22"/>
         </w:rPr>
         <w:t xml:space="preserve">Authorize Vercel to access your GitHub account when prompted.</w:t>
+      </w:r>
+    </w:p>
+    <w:p>
+      <w:pPr>
+        <w:pStyle w:val="ListParagraph"/>
+        <w:numPr>
+          <w:ilvl w:val="0"/>
+          <w:numId w:val="3"/>
+        </w:numPr>
+        <w:spacing w:after="80" w:before="0"/>
+      </w:pPr>
+      <w:r>
+        <w:rPr>
+          <w:rFonts w:ascii="Arial" w:cs="Arial" w:eastAsia="Arial" w:hAnsi="Arial"/>
+          <w:color w:val="222222"/>
+          <w:sz w:val="22"/>
+          <w:szCs w:val="22"/>
+        </w:rPr>
+        <w:t xml:space="preserve">After authorizing Vercel, open a new browser tab and go to </w:t>
+      </w:r>
+      <w:hyperlink w:history="1" r:id="rId-github-installations">
+        <w:r>
+          <w:rPr>
+            <w:rFonts w:ascii="Arial" w:cs="Arial" w:eastAsia="Arial" w:hAnsi="Arial"/>
+            <w:color w:val="4300EC"/>
+            <w:sz w:val="22"/>
+            <w:szCs w:val="22"/>
+            <w:u w:val="single"/>
+          </w:rPr>
+          <w:t xml:space="preserve">github.com/settings/installations</w:t>
+        </w:r>
+      </w:hyperlink>
+      <w:r>
+        <w:rPr>
+          <w:rFonts w:ascii="Arial" w:cs="Arial" w:eastAsia="Arial" w:hAnsi="Arial"/>
+          <w:color w:val="222222"/>
+          <w:sz w:val="22"/>
+          <w:szCs w:val="22"/>
+        </w:rPr>
+        <w:t xml:space="preserve">. Look for the Vercel app in the list. If it shows “Permission updates requested. Review request” next to it, click that link and approve the permissions. This step is critical — without it, Vercel cannot receive notifications when you push code to GitHub, and auto-deployments will silently fail.</w:t>
       </w:r>
     </w:p>
     <w:p>
@@ -5346,7 +5386,7 @@
           <w:sz w:val="22"/>
           <w:szCs w:val="22"/>
         </w:rPr>
-        <w:t xml:space="preserve">Once deployed, every time you push changes from GitHub Desktop, Vercel automatically rebuilds and redeploys the live site:</w:t>
+        <w:t xml:space="preserve">The most reliable way to deploy code changes is to run a single command in Terminal. This bypasses any potential issues with the GitHub-Vercel connection and always deploys your latest code:</w:t>
       </w:r>
     </w:p>
     <w:p>
@@ -5384,7 +5424,47 @@
           <w:sz w:val="22"/>
           <w:szCs w:val="22"/>
         </w:rPr>
-        <w:t xml:space="preserve">GitHub Desktop shows the changes in the Changes tab</w:t>
+        <w:t xml:space="preserve">In GitHub Desktop, review the changes, write a short commit message, and click </w:t>
+      </w:r>
+      <w:r>
+        <w:rPr>
+          <w:rFonts w:ascii="Arial" w:cs="Arial" w:eastAsia="Arial" w:hAnsi="Arial"/>
+          <w:b/>
+          <w:bCs/>
+          <w:color w:val="222222"/>
+          <w:sz w:val="22"/>
+          <w:szCs w:val="22"/>
+        </w:rPr>
+        <w:t xml:space="preserve">Commit to main</w:t>
+      </w:r>
+      <w:r>
+        <w:rPr>
+          <w:rFonts w:ascii="Arial" w:cs="Arial" w:eastAsia="Arial" w:hAnsi="Arial"/>
+          <w:color w:val="222222"/>
+          <w:sz w:val="22"/>
+          <w:szCs w:val="22"/>
+        </w:rPr>
+        <w:t xml:space="preserve">, then click </w:t>
+      </w:r>
+      <w:r>
+        <w:rPr>
+          <w:rFonts w:ascii="Arial" w:cs="Arial" w:eastAsia="Arial" w:hAnsi="Arial"/>
+          <w:b/>
+          <w:bCs/>
+          <w:color w:val="222222"/>
+          <w:sz w:val="22"/>
+          <w:szCs w:val="22"/>
+        </w:rPr>
+        <w:t xml:space="preserve">Push origin</w:t>
+      </w:r>
+      <w:r>
+        <w:rPr>
+          <w:rFonts w:ascii="Arial" w:cs="Arial" w:eastAsia="Arial" w:hAnsi="Arial"/>
+          <w:color w:val="222222"/>
+          <w:sz w:val="22"/>
+          <w:szCs w:val="22"/>
+        </w:rPr>
+        <w:t xml:space="preserve"> to sync to GitHub</w:t>
       </w:r>
     </w:p>
     <w:p>
@@ -5403,7 +5483,7 @@
           <w:sz w:val="22"/>
           <w:szCs w:val="22"/>
         </w:rPr>
-        <w:t xml:space="preserve">You review, write a short description (commit message), and click Commit to main</w:t>
+        <w:t xml:space="preserve">Open Terminal on your Mac (press Cmd+Space and type “Terminal”) and run these two commands, one at a time. The first navigates to your project folder; the second deploys to Vercel:</w:t>
       </w:r>
     </w:p>
     <w:p>
@@ -5417,12 +5497,12 @@
       </w:pPr>
       <w:r>
         <w:rPr>
-          <w:rFonts w:ascii="Arial" w:cs="Arial" w:eastAsia="Arial" w:hAnsi="Arial"/>
-          <w:color w:val="222222"/>
-          <w:sz w:val="22"/>
-          <w:szCs w:val="22"/>
-        </w:rPr>
-        <w:t xml:space="preserve">You click Push origin to sync to GitHub</w:t>
+          <w:rFonts w:ascii="Courier New" w:cs="Courier New" w:eastAsia="Courier New" w:hAnsi="Courier New"/>
+          <w:color w:val="222222"/>
+          <w:sz w:val="20"/>
+          <w:szCs w:val="20"/>
+        </w:rPr>
+        <w:t xml:space="preserve">cd "/Users/YOURUSERNAME/My Drive/Claude G Drive/portfolio-jobs"</w:t>
       </w:r>
     </w:p>
     <w:p>
@@ -5436,12 +5516,110 @@
       </w:pPr>
       <w:r>
         <w:rPr>
-          <w:rFonts w:ascii="Arial" w:cs="Arial" w:eastAsia="Arial" w:hAnsi="Arial"/>
-          <w:color w:val="222222"/>
-          <w:sz w:val="22"/>
-          <w:szCs w:val="22"/>
-        </w:rPr>
-        <w:t xml:space="preserve">Vercel detects the push and redeploys automatically (takes ~30 seconds)</w:t>
+          <w:rFonts w:ascii="Courier New" w:cs="Courier New" w:eastAsia="Courier New" w:hAnsi="Courier New"/>
+          <w:color w:val="222222"/>
+          <w:sz w:val="20"/>
+          <w:szCs w:val="20"/>
+        </w:rPr>
+        <w:t xml:space="preserve">npx vercel --prod</w:t>
+      </w:r>
+    </w:p>
+    <w:p>
+      <w:pPr>
+        <w:pStyle w:val="ListParagraph"/>
+        <w:numPr>
+          <w:ilvl w:val="0"/>
+          <w:numId w:val="2"/>
+        </w:numPr>
+        <w:spacing w:after="80" w:before="0"/>
+      </w:pPr>
+      <w:r>
+        <w:rPr>
+          <w:rFonts w:ascii="Arial" w:cs="Arial" w:eastAsia="Arial" w:hAnsi="Arial"/>
+          <w:color w:val="222222"/>
+          <w:sz w:val="22"/>
+          <w:szCs w:val="22"/>
+        </w:rPr>
+        <w:t xml:space="preserve">The first time you run this, it will ask you to log in with </w:t>
+      </w:r>
+      <w:r>
+        <w:rPr>
+          <w:rFonts w:ascii="Courier New" w:cs="Courier New" w:eastAsia="Courier New" w:hAnsi="Courier New"/>
+          <w:color w:val="222222"/>
+          <w:sz w:val="20"/>
+          <w:szCs w:val="20"/>
+        </w:rPr>
+        <w:t xml:space="preserve">npx vercel login</w:t>
+      </w:r>
+      <w:r>
+        <w:rPr>
+          <w:rFonts w:ascii="Arial" w:cs="Arial" w:eastAsia="Arial" w:hAnsi="Arial"/>
+          <w:color w:val="222222"/>
+          <w:sz w:val="22"/>
+          <w:szCs w:val="22"/>
+        </w:rPr>
+        <w:t xml:space="preserve"> first. After that, </w:t>
+      </w:r>
+      <w:r>
+        <w:rPr>
+          <w:rFonts w:ascii="Courier New" w:cs="Courier New" w:eastAsia="Courier New" w:hAnsi="Courier New"/>
+          <w:color w:val="222222"/>
+          <w:sz w:val="20"/>
+          <w:szCs w:val="20"/>
+        </w:rPr>
+        <w:t xml:space="preserve">npx vercel --prod</w:t>
+      </w:r>
+      <w:r>
+        <w:rPr>
+          <w:rFonts w:ascii="Arial" w:cs="Arial" w:eastAsia="Arial" w:hAnsi="Arial"/>
+          <w:color w:val="222222"/>
+          <w:sz w:val="22"/>
+          <w:szCs w:val="22"/>
+        </w:rPr>
+        <w:t xml:space="preserve"> deploys in about 30 seconds and prints a URL confirming the deployment.</w:t>
+      </w:r>
+    </w:p>
+    <w:p>
+      <w:pPr>
+        <w:spacing w:after="120" w:before="120"/>
+      </w:pPr>
+      <w:r>
+        <w:rPr>
+          <w:rFonts w:ascii="Arial" w:cs="Arial" w:eastAsia="Arial" w:hAnsi="Arial"/>
+          <w:b/>
+          <w:bCs/>
+          <w:color w:val="C0392B"/>
+          <w:sz w:val="22"/>
+          <w:szCs w:val="22"/>
+        </w:rPr>
+        <w:t xml:space="preserve">⚠️  Important: Never use the “Redeploy” button in Vercel.</w:t>
+      </w:r>
+      <w:r>
+        <w:rPr>
+          <w:rFonts w:ascii="Arial" w:cs="Arial" w:eastAsia="Arial" w:hAnsi="Arial"/>
+          <w:color w:val="222222"/>
+          <w:sz w:val="22"/>
+          <w:szCs w:val="22"/>
+        </w:rPr>
+        <w:t xml:space="preserve"> The Redeploy button re-runs an old build and does not pick up your latest code changes. Always use </w:t>
+      </w:r>
+      <w:r>
+        <w:rPr>
+          <w:rFonts w:ascii="Courier New" w:cs="Courier New" w:eastAsia="Courier New" w:hAnsi="Courier New"/>
+          <w:color w:val="222222"/>
+          <w:sz w:val="20"/>
+          <w:szCs w:val="20"/>
+        </w:rPr>
+        <w:t xml:space="preserve">npx vercel --prod</w:t>
+      </w:r>
+      <w:r>
+        <w:rPr>
+          <w:rFonts w:ascii="Arial" w:cs="Arial" w:eastAsia="Arial" w:hAnsi="Arial"/>
+          <w:color w:val="222222"/>
+          <w:sz w:val="22"/>
+          <w:szCs w:val="22"/>
+        </w:rPr>
+        <w:t xml:space="preserve"> from Terminal instead.</w:t>
       </w:r>
     </w:p>
     <w:p>
@@ -5582,7 +5760,7 @@
           <w:sz w:val="22"/>
           <w:szCs w:val="22"/>
         </w:rPr>
-        <w:t xml:space="preserve">This step sets up a cache — a saved copy of all the job data stored in a fast database called Upstash. Instead of fetching everything from scratch on each visit, the job board serves the cached copy instantly (~50 milliseconds). The cache refreshes automatically every 4 hours in the background, so job listings stay current without any action from you.</w:t>
+        <w:t xml:space="preserve">This step sets up a cache — a saved copy of all the job data stored in a fast database called Upstash. Instead of fetching everything from scratch on each visit, the job board serves the cached copy instantly (~50 milliseconds). The cache refreshes automatically once a day (at 8am UTC) in the background, so job listings stay current without any action from you.</w:t>
       </w:r>
     </w:p>
     <w:p>
@@ -6156,7 +6334,7 @@
           <w:sz w:val="22"/>
           <w:szCs w:val="22"/>
         </w:rPr>
-        <w:t xml:space="preserve">The job board refreshes the cache every 4 hours automatically. The </w:t>
+        <w:t xml:space="preserve">The job board refreshes the cache automatically once a day (at 8am UTC). The </w:t>
       </w:r>
       <w:r>
         <w:rPr>
@@ -6353,7 +6531,21 @@
           <w:sz w:val="26"/>
           <w:szCs w:val="26"/>
         </w:rPr>
-        <w:t xml:space="preserve">Redeploy to activate the cache</w:t>
+        <w:t xml:space="preserve">Deploy to activate the cache</w:t>
+      </w:r>
+    </w:p>
+    <w:p>
+      <w:pPr>
+        <w:spacing w:after="120" w:before="0"/>
+      </w:pPr>
+      <w:r>
+        <w:rPr>
+          <w:rFonts w:ascii="Arial" w:cs="Arial" w:eastAsia="Arial" w:hAnsi="Arial"/>
+          <w:color w:val="222222"/>
+          <w:sz w:val="22"/>
+          <w:szCs w:val="22"/>
+        </w:rPr>
+        <w:t xml:space="preserve">You need to deploy fresh so Vercel picks up the new environment variables. Use Terminal (not the Redeploy button, which reuses the old build):</w:t>
       </w:r>
     </w:p>
     <w:p>
@@ -6372,67 +6564,7 @@
           <w:sz w:val="22"/>
           <w:szCs w:val="22"/>
         </w:rPr>
-        <w:t xml:space="preserve">Go to </w:t>
-      </w:r>
-      <w:r>
-        <w:rPr>
-          <w:rFonts w:ascii="Arial" w:cs="Arial" w:eastAsia="Arial" w:hAnsi="Arial"/>
-          <w:b/>
-          <w:bCs/>
-          <w:color w:val="222222"/>
-          <w:sz w:val="22"/>
-          <w:szCs w:val="22"/>
-        </w:rPr>
-        <w:t xml:space="preserve">Deployments</w:t>
-      </w:r>
-      <w:r>
-        <w:rPr>
-          <w:rFonts w:ascii="Arial" w:cs="Arial" w:eastAsia="Arial" w:hAnsi="Arial"/>
-          <w:color w:val="222222"/>
-          <w:sz w:val="22"/>
-          <w:szCs w:val="22"/>
-        </w:rPr>
-        <w:t xml:space="preserve"> in your Vercel project. Find the most recent deployment, click the </w:t>
-      </w:r>
-      <w:r>
-        <w:rPr>
-          <w:rFonts w:ascii="Arial" w:cs="Arial" w:eastAsia="Arial" w:hAnsi="Arial"/>
-          <w:b/>
-          <w:bCs/>
-          <w:color w:val="222222"/>
-          <w:sz w:val="22"/>
-          <w:szCs w:val="22"/>
-        </w:rPr>
-        <w:t xml:space="preserve">⋯</w:t>
-      </w:r>
-      <w:r>
-        <w:rPr>
-          <w:rFonts w:ascii="Arial" w:cs="Arial" w:eastAsia="Arial" w:hAnsi="Arial"/>
-          <w:color w:val="222222"/>
-          <w:sz w:val="22"/>
-          <w:szCs w:val="22"/>
-        </w:rPr>
-        <w:t xml:space="preserve"> (three dots) menu, and click </w:t>
-      </w:r>
-      <w:r>
-        <w:rPr>
-          <w:rFonts w:ascii="Arial" w:cs="Arial" w:eastAsia="Arial" w:hAnsi="Arial"/>
-          <w:b/>
-          <w:bCs/>
-          <w:color w:val="222222"/>
-          <w:sz w:val="22"/>
-          <w:szCs w:val="22"/>
-        </w:rPr>
-        <w:t xml:space="preserve">Redeploy</w:t>
-      </w:r>
-      <w:r>
-        <w:rPr>
-          <w:rFonts w:ascii="Arial" w:cs="Arial" w:eastAsia="Arial" w:hAnsi="Arial"/>
-          <w:color w:val="222222"/>
-          <w:sz w:val="22"/>
-          <w:szCs w:val="22"/>
-        </w:rPr>
-        <w:t xml:space="preserve">.</w:t>
+        <w:t xml:space="preserve">Open Terminal on your Mac (press Cmd+Space and type “Terminal”).</w:t>
       </w:r>
     </w:p>
     <w:p>
@@ -6451,47 +6583,119 @@
           <w:sz w:val="22"/>
           <w:szCs w:val="22"/>
         </w:rPr>
-        <w:t xml:space="preserve">Leave </w:t>
-      </w:r>
-      <w:r>
-        <w:rPr>
-          <w:rFonts w:ascii="Arial" w:cs="Arial" w:eastAsia="Arial" w:hAnsi="Arial"/>
-          <w:b/>
-          <w:bCs/>
-          <w:color w:val="222222"/>
-          <w:sz w:val="22"/>
-          <w:szCs w:val="22"/>
-        </w:rPr>
-        <w:t xml:space="preserve">“Use existing build cache”</w:t>
-      </w:r>
-      <w:r>
-        <w:rPr>
-          <w:rFonts w:ascii="Arial" w:cs="Arial" w:eastAsia="Arial" w:hAnsi="Arial"/>
-          <w:color w:val="222222"/>
-          <w:sz w:val="22"/>
-          <w:szCs w:val="22"/>
-        </w:rPr>
-        <w:t xml:space="preserve"> unchecked, then click </w:t>
-      </w:r>
-      <w:r>
-        <w:rPr>
-          <w:rFonts w:ascii="Arial" w:cs="Arial" w:eastAsia="Arial" w:hAnsi="Arial"/>
-          <w:b/>
-          <w:bCs/>
-          <w:color w:val="222222"/>
-          <w:sz w:val="22"/>
-          <w:szCs w:val="22"/>
-        </w:rPr>
-        <w:t xml:space="preserve">Redeploy</w:t>
-      </w:r>
-      <w:r>
-        <w:rPr>
-          <w:rFonts w:ascii="Arial" w:cs="Arial" w:eastAsia="Arial" w:hAnsi="Arial"/>
-          <w:color w:val="222222"/>
-          <w:sz w:val="22"/>
-          <w:szCs w:val="22"/>
-        </w:rPr>
-        <w:t xml:space="preserve">. This ensures the new environment variables are picked up.</w:t>
+        <w:t xml:space="preserve">Type the following command and press Return (replace YOURUSERNAME with your actual Mac username):</w:t>
+      </w:r>
+    </w:p>
+    <w:p>
+      <w:pPr>
+        <w:pStyle w:val="ListParagraph"/>
+        <w:numPr>
+          <w:ilvl w:val="0"/>
+          <w:numId w:val="3"/>
+        </w:numPr>
+        <w:spacing w:after="80" w:before="0"/>
+      </w:pPr>
+      <w:r>
+        <w:rPr>
+          <w:rFonts w:ascii="Courier New" w:cs="Courier New" w:eastAsia="Courier New" w:hAnsi="Courier New"/>
+          <w:color w:val="222222"/>
+          <w:sz w:val="20"/>
+          <w:szCs w:val="20"/>
+        </w:rPr>
+        <w:t xml:space="preserve">cd "/Users/YOURUSERNAME/My Drive/Claude G Drive/portfolio-jobs"</w:t>
+      </w:r>
+    </w:p>
+    <w:p>
+      <w:pPr>
+        <w:pStyle w:val="ListParagraph"/>
+        <w:numPr>
+          <w:ilvl w:val="0"/>
+          <w:numId w:val="3"/>
+        </w:numPr>
+        <w:spacing w:after="80" w:before="0"/>
+      </w:pPr>
+      <w:r>
+        <w:rPr>
+          <w:rFonts w:ascii="Arial" w:cs="Arial" w:eastAsia="Arial" w:hAnsi="Arial"/>
+          <w:color w:val="222222"/>
+          <w:sz w:val="22"/>
+          <w:szCs w:val="22"/>
+        </w:rPr>
+        <w:t xml:space="preserve">Then run:</w:t>
+      </w:r>
+    </w:p>
+    <w:p>
+      <w:pPr>
+        <w:pStyle w:val="ListParagraph"/>
+        <w:numPr>
+          <w:ilvl w:val="0"/>
+          <w:numId w:val="3"/>
+        </w:numPr>
+        <w:spacing w:after="80" w:before="0"/>
+      </w:pPr>
+      <w:r>
+        <w:rPr>
+          <w:rFonts w:ascii="Courier New" w:cs="Courier New" w:eastAsia="Courier New" w:hAnsi="Courier New"/>
+          <w:color w:val="222222"/>
+          <w:sz w:val="20"/>
+          <w:szCs w:val="20"/>
+        </w:rPr>
+        <w:t xml:space="preserve">npx vercel --prod</w:t>
+      </w:r>
+    </w:p>
+    <w:p>
+      <w:pPr>
+        <w:pStyle w:val="ListParagraph"/>
+        <w:numPr>
+          <w:ilvl w:val="0"/>
+          <w:numId w:val="3"/>
+        </w:numPr>
+        <w:spacing w:after="80" w:before="0"/>
+      </w:pPr>
+      <w:r>
+        <w:rPr>
+          <w:rFonts w:ascii="Arial" w:cs="Arial" w:eastAsia="Arial" w:hAnsi="Arial"/>
+          <w:color w:val="222222"/>
+          <w:sz w:val="22"/>
+          <w:szCs w:val="22"/>
+        </w:rPr>
+        <w:t xml:space="preserve">If this is your first time using the Vercel CLI, it will prompt you to log in. Run </w:t>
+      </w:r>
+      <w:r>
+        <w:rPr>
+          <w:rFonts w:ascii="Courier New" w:cs="Courier New" w:eastAsia="Courier New" w:hAnsi="Courier New"/>
+          <w:color w:val="222222"/>
+          <w:sz w:val="20"/>
+          <w:szCs w:val="20"/>
+        </w:rPr>
+        <w:t xml:space="preserve">npx vercel login</w:t>
+      </w:r>
+      <w:r>
+        <w:rPr>
+          <w:rFonts w:ascii="Arial" w:cs="Arial" w:eastAsia="Arial" w:hAnsi="Arial"/>
+          <w:color w:val="222222"/>
+          <w:sz w:val="22"/>
+          <w:szCs w:val="22"/>
+        </w:rPr>
+        <w:t xml:space="preserve"> first, complete the browser login, then run </w:t>
+      </w:r>
+      <w:r>
+        <w:rPr>
+          <w:rFonts w:ascii="Courier New" w:cs="Courier New" w:eastAsia="Courier New" w:hAnsi="Courier New"/>
+          <w:color w:val="222222"/>
+          <w:sz w:val="20"/>
+          <w:szCs w:val="20"/>
+        </w:rPr>
+        <w:t xml:space="preserve">npx vercel --prod</w:t>
+      </w:r>
+      <w:r>
+        <w:rPr>
+          <w:rFonts w:ascii="Arial" w:cs="Arial" w:eastAsia="Arial" w:hAnsi="Arial"/>
+          <w:color w:val="222222"/>
+          <w:sz w:val="22"/>
+          <w:szCs w:val="22"/>
+        </w:rPr>
+        <w:t xml:space="preserve"> again. The deployment takes about 30 seconds and prints a URL confirming it is live.</w:t>
       </w:r>
     </w:p>
     <w:p>
@@ -6545,7 +6749,7 @@
                 <w:sz w:val="20"/>
                 <w:szCs w:val="20"/>
               </w:rPr>
-              <w:t xml:space="preserve">After the redeploy finishes, GitHub automatically calls your job board in the background to warm up the cache. Within about 60 seconds of the deployment completing, the cache is populated and every visitor — new browser, incognito, any country — will see an instant page load.</w:t>
+              <w:t xml:space="preserve">After the deployment finishes, Vercel automatically calls your job board in the background to warm up the cache. Within about 60 seconds of the deployment completing, the cache is populated and every visitor — new browser, incognito, any country — will see an instant page load.</w:t>
             </w:r>
           </w:p>
         </w:tc>

</xml_diff>